<commit_message>
feat(wave): paiement Premium Wave via lien marchand + livrable 5 complet
- ServiceWave réécrit : lien marchand Wave + url_launcher (sans backend)
- URL dynamique avec paramètre amount (7 500 / 5 000 / 15 000 FCFA)
- WavePremiumSheet : bottom sheet 2 états (avant/après paiement Wave)
- DatabaseService.setPremium() : activation Premium dans Firebase
- Livrable 5 section 12 : paiement Wave documenté avec vrai code
- Toutes les fonctionnalités avancées du sujet sont implémentées :
  partage social ✅ / paiement Wave ✅ / déploiement ✅
</commit_message>
<xml_diff>
--- a/livrables/docx/DIAPALER_AFRICA_Livrable5.docx
+++ b/livrables/docx/DIAPALER_AFRICA_Livrable5.docx
@@ -24805,6 +24805,4378 @@
           <w:sz w:val="20"/>
         </w:rPr>
         <w:t>📸  📸 CAPTURE D'ÉCRAN — Confirmation de réservation de session (SnackBar vert)</w:t>
+      </w:r>
+    </w:p>
+    <w:p>
+      <w:pPr>
+        <w:spacing w:before="2835" w:after="240"/>
+        <w:ind w:left="0"/>
+        <w:shd w:val="clear" w:color="auto" w:fill="F9FAFB"/>
+        <w:pBdr>
+          <w:left w:val="single" w:sz="6" w:space="6" w:color="D1D5DB"/>
+        </w:pBdr>
+      </w:pPr>
+      <w:r>
+        <w:rPr>
+          <w:rFonts w:ascii="Calibri" w:hAnsi="Calibri"/>
+          <w:i/>
+          <w:color w:val="ABB5BF"/>
+          <w:sz w:val="18"/>
+        </w:rPr>
+        <w:t>[ Insérer la capture d'écran ici ]</w:t>
+      </w:r>
+    </w:p>
+    <w:p>
+      <w:pPr>
+        <w:pStyle w:val="Heading2"/>
+      </w:pPr>
+      <w:r>
+        <w:t>10. Partage sur Réseaux Sociaux</w:t>
+      </w:r>
+    </w:p>
+    <w:p>
+      <w:pPr>
+        <w:pStyle w:val="Heading3"/>
+      </w:pPr>
+      <w:r>
+        <w:t>10.1 Service de partage — `ServicePartage`</w:t>
+      </w:r>
+    </w:p>
+    <w:p>
+      <w:r>
+        <w:rPr>
+          <w:rFonts w:ascii="Calibri" w:hAnsi="Calibri"/>
+          <w:sz w:val="22"/>
+        </w:rPr>
+        <w:t xml:space="preserve">Le partage natif utilise le package </w:t>
+      </w:r>
+      <w:r>
+        <w:rPr>
+          <w:rFonts w:ascii="Courier New" w:hAnsi="Courier New"/>
+          <w:color w:val="DC2626"/>
+          <w:sz w:val="20"/>
+        </w:rPr>
+        <w:t>share_plus</w:t>
+      </w:r>
+      <w:r>
+        <w:rPr>
+          <w:rFonts w:ascii="Calibri" w:hAnsi="Calibri"/>
+          <w:sz w:val="22"/>
+        </w:rPr>
+        <w:t xml:space="preserve"> qui ouvre la </w:t>
+      </w:r>
+      <w:r>
+        <w:rPr>
+          <w:rFonts w:ascii="Calibri" w:hAnsi="Calibri"/>
+          <w:b/>
+          <w:sz w:val="22"/>
+        </w:rPr>
+        <w:t>feuille de partage système</w:t>
+      </w:r>
+      <w:r>
+        <w:rPr>
+          <w:rFonts w:ascii="Calibri" w:hAnsi="Calibri"/>
+          <w:sz w:val="22"/>
+        </w:rPr>
+        <w:t xml:space="preserve"> du téléphone (WhatsApp, Facebook, Telegram, X, LinkedIn, email, SMS…) sans configuration spécifique par réseau social.</w:t>
+      </w:r>
+    </w:p>
+    <w:p>
+      <w:r>
+        <w:rPr>
+          <w:rFonts w:ascii="Calibri" w:hAnsi="Calibri"/>
+          <w:b/>
+          <w:sz w:val="22"/>
+        </w:rPr>
+        <w:t>Fichier :</w:t>
+      </w:r>
+      <w:r>
+        <w:rPr>
+          <w:rFonts w:ascii="Calibri" w:hAnsi="Calibri"/>
+          <w:sz w:val="22"/>
+        </w:rPr>
+        <w:t xml:space="preserve"> </w:t>
+      </w:r>
+      <w:r>
+        <w:rPr>
+          <w:rFonts w:ascii="Courier New" w:hAnsi="Courier New"/>
+          <w:color w:val="DC2626"/>
+          <w:sz w:val="20"/>
+        </w:rPr>
+        <w:t>lib/services/service_partage.dart</w:t>
+      </w:r>
+    </w:p>
+    <w:p>
+      <w:pPr>
+        <w:spacing w:before="0" w:after="0"/>
+        <w:ind w:left="283"/>
+        <w:shd w:val="clear" w:color="auto" w:fill="F3F4F6"/>
+      </w:pPr>
+      <w:r>
+        <w:rPr>
+          <w:rFonts w:ascii="Courier New" w:hAnsi="Courier New"/>
+          <w:color w:val="1F2D3D"/>
+          <w:sz w:val="18"/>
+        </w:rPr>
+        <w:t>import 'package:share_plus/share_plus.dart';</w:t>
+      </w:r>
+    </w:p>
+    <w:p>
+      <w:pPr>
+        <w:spacing w:before="0" w:after="0"/>
+        <w:ind w:left="283"/>
+        <w:shd w:val="clear" w:color="auto" w:fill="F3F4F6"/>
+      </w:pPr>
+      <w:r>
+        <w:rPr>
+          <w:rFonts w:ascii="Courier New" w:hAnsi="Courier New"/>
+          <w:color w:val="1F2D3D"/>
+          <w:sz w:val="18"/>
+        </w:rPr>
+        <w:t xml:space="preserve"> </w:t>
+      </w:r>
+    </w:p>
+    <w:p>
+      <w:pPr>
+        <w:spacing w:before="0" w:after="0"/>
+        <w:ind w:left="283"/>
+        <w:shd w:val="clear" w:color="auto" w:fill="F3F4F6"/>
+      </w:pPr>
+      <w:r>
+        <w:rPr>
+          <w:rFonts w:ascii="Courier New" w:hAnsi="Courier New"/>
+          <w:color w:val="1F2D3D"/>
+          <w:sz w:val="18"/>
+        </w:rPr>
+        <w:t>class ShareService {</w:t>
+      </w:r>
+    </w:p>
+    <w:p>
+      <w:pPr>
+        <w:spacing w:before="0" w:after="0"/>
+        <w:ind w:left="283"/>
+        <w:shd w:val="clear" w:color="auto" w:fill="F3F4F6"/>
+      </w:pPr>
+      <w:r>
+        <w:rPr>
+          <w:rFonts w:ascii="Courier New" w:hAnsi="Courier New"/>
+          <w:color w:val="1F2D3D"/>
+          <w:sz w:val="18"/>
+        </w:rPr>
+        <w:t xml:space="preserve">  ShareService._();</w:t>
+      </w:r>
+    </w:p>
+    <w:p>
+      <w:pPr>
+        <w:spacing w:before="0" w:after="0"/>
+        <w:ind w:left="283"/>
+        <w:shd w:val="clear" w:color="auto" w:fill="F3F4F6"/>
+      </w:pPr>
+      <w:r>
+        <w:rPr>
+          <w:rFonts w:ascii="Courier New" w:hAnsi="Courier New"/>
+          <w:color w:val="1F2D3D"/>
+          <w:sz w:val="18"/>
+        </w:rPr>
+        <w:t xml:space="preserve"> </w:t>
+      </w:r>
+    </w:p>
+    <w:p>
+      <w:pPr>
+        <w:spacing w:before="0" w:after="0"/>
+        <w:ind w:left="283"/>
+        <w:shd w:val="clear" w:color="auto" w:fill="F3F4F6"/>
+      </w:pPr>
+      <w:r>
+        <w:rPr>
+          <w:rFonts w:ascii="Courier New" w:hAnsi="Courier New"/>
+          <w:color w:val="1F2D3D"/>
+          <w:sz w:val="18"/>
+        </w:rPr>
+        <w:t xml:space="preserve">  /// Partage un pitch entrepreneur sur les réseaux sociaux.</w:t>
+      </w:r>
+    </w:p>
+    <w:p>
+      <w:pPr>
+        <w:spacing w:before="0" w:after="0"/>
+        <w:ind w:left="283"/>
+        <w:shd w:val="clear" w:color="auto" w:fill="F3F4F6"/>
+      </w:pPr>
+      <w:r>
+        <w:rPr>
+          <w:rFonts w:ascii="Courier New" w:hAnsi="Courier New"/>
+          <w:color w:val="1F2D3D"/>
+          <w:sz w:val="18"/>
+        </w:rPr>
+        <w:t xml:space="preserve">  static Future&lt;void&gt; sharePitch({</w:t>
+      </w:r>
+    </w:p>
+    <w:p>
+      <w:pPr>
+        <w:spacing w:before="0" w:after="0"/>
+        <w:ind w:left="283"/>
+        <w:shd w:val="clear" w:color="auto" w:fill="F3F4F6"/>
+      </w:pPr>
+      <w:r>
+        <w:rPr>
+          <w:rFonts w:ascii="Courier New" w:hAnsi="Courier New"/>
+          <w:color w:val="1F2D3D"/>
+          <w:sz w:val="18"/>
+        </w:rPr>
+        <w:t xml:space="preserve">    required String title,</w:t>
+      </w:r>
+    </w:p>
+    <w:p>
+      <w:pPr>
+        <w:spacing w:before="0" w:after="0"/>
+        <w:ind w:left="283"/>
+        <w:shd w:val="clear" w:color="auto" w:fill="F3F4F6"/>
+      </w:pPr>
+      <w:r>
+        <w:rPr>
+          <w:rFonts w:ascii="Courier New" w:hAnsi="Courier New"/>
+          <w:color w:val="1F2D3D"/>
+          <w:sz w:val="18"/>
+        </w:rPr>
+        <w:t xml:space="preserve">    required String sector,</w:t>
+      </w:r>
+    </w:p>
+    <w:p>
+      <w:pPr>
+        <w:spacing w:before="0" w:after="0"/>
+        <w:ind w:left="283"/>
+        <w:shd w:val="clear" w:color="auto" w:fill="F3F4F6"/>
+      </w:pPr>
+      <w:r>
+        <w:rPr>
+          <w:rFonts w:ascii="Courier New" w:hAnsi="Courier New"/>
+          <w:color w:val="1F2D3D"/>
+          <w:sz w:val="18"/>
+        </w:rPr>
+        <w:t xml:space="preserve">    required String description,</w:t>
+      </w:r>
+    </w:p>
+    <w:p>
+      <w:pPr>
+        <w:spacing w:before="0" w:after="0"/>
+        <w:ind w:left="283"/>
+        <w:shd w:val="clear" w:color="auto" w:fill="F3F4F6"/>
+      </w:pPr>
+      <w:r>
+        <w:rPr>
+          <w:rFonts w:ascii="Courier New" w:hAnsi="Courier New"/>
+          <w:color w:val="1F2D3D"/>
+          <w:sz w:val="18"/>
+        </w:rPr>
+        <w:t xml:space="preserve">    required String authorName,</w:t>
+      </w:r>
+    </w:p>
+    <w:p>
+      <w:pPr>
+        <w:spacing w:before="0" w:after="0"/>
+        <w:ind w:left="283"/>
+        <w:shd w:val="clear" w:color="auto" w:fill="F3F4F6"/>
+      </w:pPr>
+      <w:r>
+        <w:rPr>
+          <w:rFonts w:ascii="Courier New" w:hAnsi="Courier New"/>
+          <w:color w:val="1F2D3D"/>
+          <w:sz w:val="18"/>
+        </w:rPr>
+        <w:t xml:space="preserve">    String? amount,</w:t>
+      </w:r>
+    </w:p>
+    <w:p>
+      <w:pPr>
+        <w:spacing w:before="0" w:after="0"/>
+        <w:ind w:left="283"/>
+        <w:shd w:val="clear" w:color="auto" w:fill="F3F4F6"/>
+      </w:pPr>
+      <w:r>
+        <w:rPr>
+          <w:rFonts w:ascii="Courier New" w:hAnsi="Courier New"/>
+          <w:color w:val="1F2D3D"/>
+          <w:sz w:val="18"/>
+        </w:rPr>
+        <w:t xml:space="preserve">  }) async {</w:t>
+      </w:r>
+    </w:p>
+    <w:p>
+      <w:pPr>
+        <w:spacing w:before="0" w:after="0"/>
+        <w:ind w:left="283"/>
+        <w:shd w:val="clear" w:color="auto" w:fill="F3F4F6"/>
+      </w:pPr>
+      <w:r>
+        <w:rPr>
+          <w:rFonts w:ascii="Courier New" w:hAnsi="Courier New"/>
+          <w:color w:val="1F2D3D"/>
+          <w:sz w:val="18"/>
+        </w:rPr>
+        <w:t xml:space="preserve">    final amountLine = (amount != null &amp;&amp; amount.isNotEmpty)</w:t>
+      </w:r>
+    </w:p>
+    <w:p>
+      <w:pPr>
+        <w:spacing w:before="0" w:after="0"/>
+        <w:ind w:left="283"/>
+        <w:shd w:val="clear" w:color="auto" w:fill="F3F4F6"/>
+      </w:pPr>
+      <w:r>
+        <w:rPr>
+          <w:rFonts w:ascii="Courier New" w:hAnsi="Courier New"/>
+          <w:color w:val="1F2D3D"/>
+          <w:sz w:val="18"/>
+        </w:rPr>
+        <w:t xml:space="preserve">        ? '\n💰 Besoin de financement : $amount FCFA'</w:t>
+      </w:r>
+    </w:p>
+    <w:p>
+      <w:pPr>
+        <w:spacing w:before="0" w:after="0"/>
+        <w:ind w:left="283"/>
+        <w:shd w:val="clear" w:color="auto" w:fill="F3F4F6"/>
+      </w:pPr>
+      <w:r>
+        <w:rPr>
+          <w:rFonts w:ascii="Courier New" w:hAnsi="Courier New"/>
+          <w:color w:val="1F2D3D"/>
+          <w:sz w:val="18"/>
+        </w:rPr>
+        <w:t xml:space="preserve">        : '';</w:t>
+      </w:r>
+    </w:p>
+    <w:p>
+      <w:pPr>
+        <w:spacing w:before="0" w:after="0"/>
+        <w:ind w:left="283"/>
+        <w:shd w:val="clear" w:color="auto" w:fill="F3F4F6"/>
+      </w:pPr>
+      <w:r>
+        <w:rPr>
+          <w:rFonts w:ascii="Courier New" w:hAnsi="Courier New"/>
+          <w:color w:val="1F2D3D"/>
+          <w:sz w:val="18"/>
+        </w:rPr>
+        <w:t xml:space="preserve"> </w:t>
+      </w:r>
+    </w:p>
+    <w:p>
+      <w:pPr>
+        <w:spacing w:before="0" w:after="0"/>
+        <w:ind w:left="283"/>
+        <w:shd w:val="clear" w:color="auto" w:fill="F3F4F6"/>
+      </w:pPr>
+      <w:r>
+        <w:rPr>
+          <w:rFonts w:ascii="Courier New" w:hAnsi="Courier New"/>
+          <w:color w:val="1F2D3D"/>
+          <w:sz w:val="18"/>
+        </w:rPr>
+        <w:t xml:space="preserve">    final preview = description.length &gt; 200</w:t>
+      </w:r>
+    </w:p>
+    <w:p>
+      <w:pPr>
+        <w:spacing w:before="0" w:after="0"/>
+        <w:ind w:left="283"/>
+        <w:shd w:val="clear" w:color="auto" w:fill="F3F4F6"/>
+      </w:pPr>
+      <w:r>
+        <w:rPr>
+          <w:rFonts w:ascii="Courier New" w:hAnsi="Courier New"/>
+          <w:color w:val="1F2D3D"/>
+          <w:sz w:val="18"/>
+        </w:rPr>
+        <w:t xml:space="preserve">        ? '${description.substring(0, 200)}…'</w:t>
+      </w:r>
+    </w:p>
+    <w:p>
+      <w:pPr>
+        <w:spacing w:before="0" w:after="0"/>
+        <w:ind w:left="283"/>
+        <w:shd w:val="clear" w:color="auto" w:fill="F3F4F6"/>
+      </w:pPr>
+      <w:r>
+        <w:rPr>
+          <w:rFonts w:ascii="Courier New" w:hAnsi="Courier New"/>
+          <w:color w:val="1F2D3D"/>
+          <w:sz w:val="18"/>
+        </w:rPr>
+        <w:t xml:space="preserve">        : description;</w:t>
+      </w:r>
+    </w:p>
+    <w:p>
+      <w:pPr>
+        <w:spacing w:before="0" w:after="0"/>
+        <w:ind w:left="283"/>
+        <w:shd w:val="clear" w:color="auto" w:fill="F3F4F6"/>
+      </w:pPr>
+      <w:r>
+        <w:rPr>
+          <w:rFonts w:ascii="Courier New" w:hAnsi="Courier New"/>
+          <w:color w:val="1F2D3D"/>
+          <w:sz w:val="18"/>
+        </w:rPr>
+        <w:t xml:space="preserve"> </w:t>
+      </w:r>
+    </w:p>
+    <w:p>
+      <w:pPr>
+        <w:spacing w:before="0" w:after="0"/>
+        <w:ind w:left="283"/>
+        <w:shd w:val="clear" w:color="auto" w:fill="F3F4F6"/>
+      </w:pPr>
+      <w:r>
+        <w:rPr>
+          <w:rFonts w:ascii="Courier New" w:hAnsi="Courier New"/>
+          <w:color w:val="1F2D3D"/>
+          <w:sz w:val="18"/>
+        </w:rPr>
+        <w:t xml:space="preserve">    final text = '🚀 *$title* — Pitch sur DIAPALER AFRICA\n\n'</w:t>
+      </w:r>
+    </w:p>
+    <w:p>
+      <w:pPr>
+        <w:spacing w:before="0" w:after="0"/>
+        <w:ind w:left="283"/>
+        <w:shd w:val="clear" w:color="auto" w:fill="F3F4F6"/>
+      </w:pPr>
+      <w:r>
+        <w:rPr>
+          <w:rFonts w:ascii="Courier New" w:hAnsi="Courier New"/>
+          <w:color w:val="1F2D3D"/>
+          <w:sz w:val="18"/>
+        </w:rPr>
+        <w:t xml:space="preserve">        '👤 $authorName · 🏢 $sector$amountLine\n\n'</w:t>
+      </w:r>
+    </w:p>
+    <w:p>
+      <w:pPr>
+        <w:spacing w:before="0" w:after="0"/>
+        <w:ind w:left="283"/>
+        <w:shd w:val="clear" w:color="auto" w:fill="F3F4F6"/>
+      </w:pPr>
+      <w:r>
+        <w:rPr>
+          <w:rFonts w:ascii="Courier New" w:hAnsi="Courier New"/>
+          <w:color w:val="1F2D3D"/>
+          <w:sz w:val="18"/>
+        </w:rPr>
+        <w:t xml:space="preserve">        '📝 $preview\n\n'</w:t>
+      </w:r>
+    </w:p>
+    <w:p>
+      <w:pPr>
+        <w:spacing w:before="0" w:after="0"/>
+        <w:ind w:left="283"/>
+        <w:shd w:val="clear" w:color="auto" w:fill="F3F4F6"/>
+      </w:pPr>
+      <w:r>
+        <w:rPr>
+          <w:rFonts w:ascii="Courier New" w:hAnsi="Courier New"/>
+          <w:color w:val="1F2D3D"/>
+          <w:sz w:val="18"/>
+        </w:rPr>
+        <w:t xml:space="preserve">        '🇸🇳 Retrouve ce projet sur DIAPALER AFRICA — la plateforme qui '</w:t>
+      </w:r>
+    </w:p>
+    <w:p>
+      <w:pPr>
+        <w:spacing w:before="0" w:after="0"/>
+        <w:ind w:left="283"/>
+        <w:shd w:val="clear" w:color="auto" w:fill="F3F4F6"/>
+      </w:pPr>
+      <w:r>
+        <w:rPr>
+          <w:rFonts w:ascii="Courier New" w:hAnsi="Courier New"/>
+          <w:color w:val="1F2D3D"/>
+          <w:sz w:val="18"/>
+        </w:rPr>
+        <w:t xml:space="preserve">        'connecte entrepreneurs, mentors et investisseurs au Sénégal.\n\n'</w:t>
+      </w:r>
+    </w:p>
+    <w:p>
+      <w:pPr>
+        <w:spacing w:before="0" w:after="0"/>
+        <w:ind w:left="283"/>
+        <w:shd w:val="clear" w:color="auto" w:fill="F3F4F6"/>
+      </w:pPr>
+      <w:r>
+        <w:rPr>
+          <w:rFonts w:ascii="Courier New" w:hAnsi="Courier New"/>
+          <w:color w:val="1F2D3D"/>
+          <w:sz w:val="18"/>
+        </w:rPr>
+        <w:t xml:space="preserve">        '👉 Télécharge : https://diapalerafrica.app';</w:t>
+      </w:r>
+    </w:p>
+    <w:p>
+      <w:pPr>
+        <w:spacing w:before="0" w:after="0"/>
+        <w:ind w:left="283"/>
+        <w:shd w:val="clear" w:color="auto" w:fill="F3F4F6"/>
+      </w:pPr>
+      <w:r>
+        <w:rPr>
+          <w:rFonts w:ascii="Courier New" w:hAnsi="Courier New"/>
+          <w:color w:val="1F2D3D"/>
+          <w:sz w:val="18"/>
+        </w:rPr>
+        <w:t xml:space="preserve"> </w:t>
+      </w:r>
+    </w:p>
+    <w:p>
+      <w:pPr>
+        <w:spacing w:before="0" w:after="0"/>
+        <w:ind w:left="283"/>
+        <w:shd w:val="clear" w:color="auto" w:fill="F3F4F6"/>
+      </w:pPr>
+      <w:r>
+        <w:rPr>
+          <w:rFonts w:ascii="Courier New" w:hAnsi="Courier New"/>
+          <w:color w:val="1F2D3D"/>
+          <w:sz w:val="18"/>
+        </w:rPr>
+        <w:t xml:space="preserve">    await Share.share(text, subject: 'Pitch : $title — DIAPALER AFRICA');</w:t>
+      </w:r>
+    </w:p>
+    <w:p>
+      <w:pPr>
+        <w:spacing w:before="0" w:after="0"/>
+        <w:ind w:left="283"/>
+        <w:shd w:val="clear" w:color="auto" w:fill="F3F4F6"/>
+      </w:pPr>
+      <w:r>
+        <w:rPr>
+          <w:rFonts w:ascii="Courier New" w:hAnsi="Courier New"/>
+          <w:color w:val="1F2D3D"/>
+          <w:sz w:val="18"/>
+        </w:rPr>
+        <w:t xml:space="preserve">  }</w:t>
+      </w:r>
+    </w:p>
+    <w:p>
+      <w:pPr>
+        <w:spacing w:before="0" w:after="0"/>
+        <w:ind w:left="283"/>
+        <w:shd w:val="clear" w:color="auto" w:fill="F3F4F6"/>
+      </w:pPr>
+      <w:r>
+        <w:rPr>
+          <w:rFonts w:ascii="Courier New" w:hAnsi="Courier New"/>
+          <w:color w:val="1F2D3D"/>
+          <w:sz w:val="18"/>
+        </w:rPr>
+        <w:t xml:space="preserve"> </w:t>
+      </w:r>
+    </w:p>
+    <w:p>
+      <w:pPr>
+        <w:spacing w:before="0" w:after="0"/>
+        <w:ind w:left="283"/>
+        <w:shd w:val="clear" w:color="auto" w:fill="F3F4F6"/>
+      </w:pPr>
+      <w:r>
+        <w:rPr>
+          <w:rFonts w:ascii="Courier New" w:hAnsi="Courier New"/>
+          <w:color w:val="1F2D3D"/>
+          <w:sz w:val="18"/>
+        </w:rPr>
+        <w:t xml:space="preserve">  /// Partage le profil d'un mentor ou investisseur.</w:t>
+      </w:r>
+    </w:p>
+    <w:p>
+      <w:pPr>
+        <w:spacing w:before="0" w:after="0"/>
+        <w:ind w:left="283"/>
+        <w:shd w:val="clear" w:color="auto" w:fill="F3F4F6"/>
+      </w:pPr>
+      <w:r>
+        <w:rPr>
+          <w:rFonts w:ascii="Courier New" w:hAnsi="Courier New"/>
+          <w:color w:val="1F2D3D"/>
+          <w:sz w:val="18"/>
+        </w:rPr>
+        <w:t xml:space="preserve">  static Future&lt;void&gt; shareMentorProfile({</w:t>
+      </w:r>
+    </w:p>
+    <w:p>
+      <w:pPr>
+        <w:spacing w:before="0" w:after="0"/>
+        <w:ind w:left="283"/>
+        <w:shd w:val="clear" w:color="auto" w:fill="F3F4F6"/>
+      </w:pPr>
+      <w:r>
+        <w:rPr>
+          <w:rFonts w:ascii="Courier New" w:hAnsi="Courier New"/>
+          <w:color w:val="1F2D3D"/>
+          <w:sz w:val="18"/>
+        </w:rPr>
+        <w:t xml:space="preserve">    required String name,</w:t>
+      </w:r>
+    </w:p>
+    <w:p>
+      <w:pPr>
+        <w:spacing w:before="0" w:after="0"/>
+        <w:ind w:left="283"/>
+        <w:shd w:val="clear" w:color="auto" w:fill="F3F4F6"/>
+      </w:pPr>
+      <w:r>
+        <w:rPr>
+          <w:rFonts w:ascii="Courier New" w:hAnsi="Courier New"/>
+          <w:color w:val="1F2D3D"/>
+          <w:sz w:val="18"/>
+        </w:rPr>
+        <w:t xml:space="preserve">    required String role,</w:t>
+      </w:r>
+    </w:p>
+    <w:p>
+      <w:pPr>
+        <w:spacing w:before="0" w:after="0"/>
+        <w:ind w:left="283"/>
+        <w:shd w:val="clear" w:color="auto" w:fill="F3F4F6"/>
+      </w:pPr>
+      <w:r>
+        <w:rPr>
+          <w:rFonts w:ascii="Courier New" w:hAnsi="Courier New"/>
+          <w:color w:val="1F2D3D"/>
+          <w:sz w:val="18"/>
+        </w:rPr>
+        <w:t xml:space="preserve">    required String sector,</w:t>
+      </w:r>
+    </w:p>
+    <w:p>
+      <w:pPr>
+        <w:spacing w:before="0" w:after="0"/>
+        <w:ind w:left="283"/>
+        <w:shd w:val="clear" w:color="auto" w:fill="F3F4F6"/>
+      </w:pPr>
+      <w:r>
+        <w:rPr>
+          <w:rFonts w:ascii="Courier New" w:hAnsi="Courier New"/>
+          <w:color w:val="1F2D3D"/>
+          <w:sz w:val="18"/>
+        </w:rPr>
+        <w:t xml:space="preserve">    required String city,</w:t>
+      </w:r>
+    </w:p>
+    <w:p>
+      <w:pPr>
+        <w:spacing w:before="0" w:after="0"/>
+        <w:ind w:left="283"/>
+        <w:shd w:val="clear" w:color="auto" w:fill="F3F4F6"/>
+      </w:pPr>
+      <w:r>
+        <w:rPr>
+          <w:rFonts w:ascii="Courier New" w:hAnsi="Courier New"/>
+          <w:color w:val="1F2D3D"/>
+          <w:sz w:val="18"/>
+        </w:rPr>
+        <w:t xml:space="preserve">    String? bio,</w:t>
+      </w:r>
+    </w:p>
+    <w:p>
+      <w:pPr>
+        <w:spacing w:before="0" w:after="0"/>
+        <w:ind w:left="283"/>
+        <w:shd w:val="clear" w:color="auto" w:fill="F3F4F6"/>
+      </w:pPr>
+      <w:r>
+        <w:rPr>
+          <w:rFonts w:ascii="Courier New" w:hAnsi="Courier New"/>
+          <w:color w:val="1F2D3D"/>
+          <w:sz w:val="18"/>
+        </w:rPr>
+        <w:t xml:space="preserve">  }) async {</w:t>
+      </w:r>
+    </w:p>
+    <w:p>
+      <w:pPr>
+        <w:spacing w:before="0" w:after="0"/>
+        <w:ind w:left="283"/>
+        <w:shd w:val="clear" w:color="auto" w:fill="F3F4F6"/>
+      </w:pPr>
+      <w:r>
+        <w:rPr>
+          <w:rFonts w:ascii="Courier New" w:hAnsi="Courier New"/>
+          <w:color w:val="1F2D3D"/>
+          <w:sz w:val="18"/>
+        </w:rPr>
+        <w:t xml:space="preserve">    final bioLine = (bio != null &amp;&amp; bio.isNotEmpty)</w:t>
+      </w:r>
+    </w:p>
+    <w:p>
+      <w:pPr>
+        <w:spacing w:before="0" w:after="0"/>
+        <w:ind w:left="283"/>
+        <w:shd w:val="clear" w:color="auto" w:fill="F3F4F6"/>
+      </w:pPr>
+      <w:r>
+        <w:rPr>
+          <w:rFonts w:ascii="Courier New" w:hAnsi="Courier New"/>
+          <w:color w:val="1F2D3D"/>
+          <w:sz w:val="18"/>
+        </w:rPr>
+        <w:t xml:space="preserve">        ? '\n\n"${bio.length &gt; 150 ? bio.substring(0, 150) + '…' : bio}"'</w:t>
+      </w:r>
+    </w:p>
+    <w:p>
+      <w:pPr>
+        <w:spacing w:before="0" w:after="0"/>
+        <w:ind w:left="283"/>
+        <w:shd w:val="clear" w:color="auto" w:fill="F3F4F6"/>
+      </w:pPr>
+      <w:r>
+        <w:rPr>
+          <w:rFonts w:ascii="Courier New" w:hAnsi="Courier New"/>
+          <w:color w:val="1F2D3D"/>
+          <w:sz w:val="18"/>
+        </w:rPr>
+        <w:t xml:space="preserve">        : '';</w:t>
+      </w:r>
+    </w:p>
+    <w:p>
+      <w:pPr>
+        <w:spacing w:before="0" w:after="0"/>
+        <w:ind w:left="283"/>
+        <w:shd w:val="clear" w:color="auto" w:fill="F3F4F6"/>
+      </w:pPr>
+      <w:r>
+        <w:rPr>
+          <w:rFonts w:ascii="Courier New" w:hAnsi="Courier New"/>
+          <w:color w:val="1F2D3D"/>
+          <w:sz w:val="18"/>
+        </w:rPr>
+        <w:t xml:space="preserve"> </w:t>
+      </w:r>
+    </w:p>
+    <w:p>
+      <w:pPr>
+        <w:spacing w:before="0" w:after="0"/>
+        <w:ind w:left="283"/>
+        <w:shd w:val="clear" w:color="auto" w:fill="F3F4F6"/>
+      </w:pPr>
+      <w:r>
+        <w:rPr>
+          <w:rFonts w:ascii="Courier New" w:hAnsi="Courier New"/>
+          <w:color w:val="1F2D3D"/>
+          <w:sz w:val="18"/>
+        </w:rPr>
+        <w:t xml:space="preserve">    final text = '👤 *$name* — $role sur DIAPALER AFRICA\n\n'</w:t>
+      </w:r>
+    </w:p>
+    <w:p>
+      <w:pPr>
+        <w:spacing w:before="0" w:after="0"/>
+        <w:ind w:left="283"/>
+        <w:shd w:val="clear" w:color="auto" w:fill="F3F4F6"/>
+      </w:pPr>
+      <w:r>
+        <w:rPr>
+          <w:rFonts w:ascii="Courier New" w:hAnsi="Courier New"/>
+          <w:color w:val="1F2D3D"/>
+          <w:sz w:val="18"/>
+        </w:rPr>
+        <w:t xml:space="preserve">        '🏢 Secteur : $sector\n'</w:t>
+      </w:r>
+    </w:p>
+    <w:p>
+      <w:pPr>
+        <w:spacing w:before="0" w:after="0"/>
+        <w:ind w:left="283"/>
+        <w:shd w:val="clear" w:color="auto" w:fill="F3F4F6"/>
+      </w:pPr>
+      <w:r>
+        <w:rPr>
+          <w:rFonts w:ascii="Courier New" w:hAnsi="Courier New"/>
+          <w:color w:val="1F2D3D"/>
+          <w:sz w:val="18"/>
+        </w:rPr>
+        <w:t xml:space="preserve">        '📍 $city$bioLine\n\n'</w:t>
+      </w:r>
+    </w:p>
+    <w:p>
+      <w:pPr>
+        <w:spacing w:before="0" w:after="0"/>
+        <w:ind w:left="283"/>
+        <w:shd w:val="clear" w:color="auto" w:fill="F3F4F6"/>
+      </w:pPr>
+      <w:r>
+        <w:rPr>
+          <w:rFonts w:ascii="Courier New" w:hAnsi="Courier New"/>
+          <w:color w:val="1F2D3D"/>
+          <w:sz w:val="18"/>
+        </w:rPr>
+        <w:t xml:space="preserve">        '🤝 Tu cherches un mentor ou un investisseur ?\n'</w:t>
+      </w:r>
+    </w:p>
+    <w:p>
+      <w:pPr>
+        <w:spacing w:before="0" w:after="0"/>
+        <w:ind w:left="283"/>
+        <w:shd w:val="clear" w:color="auto" w:fill="F3F4F6"/>
+      </w:pPr>
+      <w:r>
+        <w:rPr>
+          <w:rFonts w:ascii="Courier New" w:hAnsi="Courier New"/>
+          <w:color w:val="1F2D3D"/>
+          <w:sz w:val="18"/>
+        </w:rPr>
+        <w:t xml:space="preserve">        'Retrouve $name sur DIAPALER AFRICA.\n\n'</w:t>
+      </w:r>
+    </w:p>
+    <w:p>
+      <w:pPr>
+        <w:spacing w:before="0" w:after="0"/>
+        <w:ind w:left="283"/>
+        <w:shd w:val="clear" w:color="auto" w:fill="F3F4F6"/>
+      </w:pPr>
+      <w:r>
+        <w:rPr>
+          <w:rFonts w:ascii="Courier New" w:hAnsi="Courier New"/>
+          <w:color w:val="1F2D3D"/>
+          <w:sz w:val="18"/>
+        </w:rPr>
+        <w:t xml:space="preserve">        '🇸🇳 Plateforme de mentorat entrepreneurial — Sénégal\n'</w:t>
+      </w:r>
+    </w:p>
+    <w:p>
+      <w:pPr>
+        <w:spacing w:before="0" w:after="0"/>
+        <w:ind w:left="283"/>
+        <w:shd w:val="clear" w:color="auto" w:fill="F3F4F6"/>
+      </w:pPr>
+      <w:r>
+        <w:rPr>
+          <w:rFonts w:ascii="Courier New" w:hAnsi="Courier New"/>
+          <w:color w:val="1F2D3D"/>
+          <w:sz w:val="18"/>
+        </w:rPr>
+        <w:t xml:space="preserve">        '👉 https://diapalerafrica.app';</w:t>
+      </w:r>
+    </w:p>
+    <w:p>
+      <w:pPr>
+        <w:spacing w:before="0" w:after="0"/>
+        <w:ind w:left="283"/>
+        <w:shd w:val="clear" w:color="auto" w:fill="F3F4F6"/>
+      </w:pPr>
+      <w:r>
+        <w:rPr>
+          <w:rFonts w:ascii="Courier New" w:hAnsi="Courier New"/>
+          <w:color w:val="1F2D3D"/>
+          <w:sz w:val="18"/>
+        </w:rPr>
+        <w:t xml:space="preserve"> </w:t>
+      </w:r>
+    </w:p>
+    <w:p>
+      <w:pPr>
+        <w:spacing w:before="0" w:after="0"/>
+        <w:ind w:left="283"/>
+        <w:shd w:val="clear" w:color="auto" w:fill="F3F4F6"/>
+      </w:pPr>
+      <w:r>
+        <w:rPr>
+          <w:rFonts w:ascii="Courier New" w:hAnsi="Courier New"/>
+          <w:color w:val="1F2D3D"/>
+          <w:sz w:val="18"/>
+        </w:rPr>
+        <w:t xml:space="preserve">    await Share.share(text, subject: '$name — $role DIAPALER AFRICA');</w:t>
+      </w:r>
+    </w:p>
+    <w:p>
+      <w:pPr>
+        <w:spacing w:before="0" w:after="0"/>
+        <w:ind w:left="283"/>
+        <w:shd w:val="clear" w:color="auto" w:fill="F3F4F6"/>
+      </w:pPr>
+      <w:r>
+        <w:rPr>
+          <w:rFonts w:ascii="Courier New" w:hAnsi="Courier New"/>
+          <w:color w:val="1F2D3D"/>
+          <w:sz w:val="18"/>
+        </w:rPr>
+        <w:t xml:space="preserve">  }</w:t>
+      </w:r>
+    </w:p>
+    <w:p>
+      <w:pPr>
+        <w:spacing w:before="0" w:after="0"/>
+        <w:ind w:left="283"/>
+        <w:shd w:val="clear" w:color="auto" w:fill="F3F4F6"/>
+      </w:pPr>
+      <w:r>
+        <w:rPr>
+          <w:rFonts w:ascii="Courier New" w:hAnsi="Courier New"/>
+          <w:color w:val="1F2D3D"/>
+          <w:sz w:val="18"/>
+        </w:rPr>
+        <w:t xml:space="preserve"> </w:t>
+      </w:r>
+    </w:p>
+    <w:p>
+      <w:pPr>
+        <w:spacing w:before="0" w:after="0"/>
+        <w:ind w:left="283"/>
+        <w:shd w:val="clear" w:color="auto" w:fill="F3F4F6"/>
+      </w:pPr>
+      <w:r>
+        <w:rPr>
+          <w:rFonts w:ascii="Courier New" w:hAnsi="Courier New"/>
+          <w:color w:val="1F2D3D"/>
+          <w:sz w:val="18"/>
+        </w:rPr>
+        <w:t xml:space="preserve">  /// Partage son propre profil entrepreneur.</w:t>
+      </w:r>
+    </w:p>
+    <w:p>
+      <w:pPr>
+        <w:spacing w:before="0" w:after="0"/>
+        <w:ind w:left="283"/>
+        <w:shd w:val="clear" w:color="auto" w:fill="F3F4F6"/>
+      </w:pPr>
+      <w:r>
+        <w:rPr>
+          <w:rFonts w:ascii="Courier New" w:hAnsi="Courier New"/>
+          <w:color w:val="1F2D3D"/>
+          <w:sz w:val="18"/>
+        </w:rPr>
+        <w:t xml:space="preserve">  static Future&lt;void&gt; shareMyProfile({</w:t>
+      </w:r>
+    </w:p>
+    <w:p>
+      <w:pPr>
+        <w:spacing w:before="0" w:after="0"/>
+        <w:ind w:left="283"/>
+        <w:shd w:val="clear" w:color="auto" w:fill="F3F4F6"/>
+      </w:pPr>
+      <w:r>
+        <w:rPr>
+          <w:rFonts w:ascii="Courier New" w:hAnsi="Courier New"/>
+          <w:color w:val="1F2D3D"/>
+          <w:sz w:val="18"/>
+        </w:rPr>
+        <w:t xml:space="preserve">    required String name,</w:t>
+      </w:r>
+    </w:p>
+    <w:p>
+      <w:pPr>
+        <w:spacing w:before="0" w:after="0"/>
+        <w:ind w:left="283"/>
+        <w:shd w:val="clear" w:color="auto" w:fill="F3F4F6"/>
+      </w:pPr>
+      <w:r>
+        <w:rPr>
+          <w:rFonts w:ascii="Courier New" w:hAnsi="Courier New"/>
+          <w:color w:val="1F2D3D"/>
+          <w:sz w:val="18"/>
+        </w:rPr>
+        <w:t xml:space="preserve">    required String role,</w:t>
+      </w:r>
+    </w:p>
+    <w:p>
+      <w:pPr>
+        <w:spacing w:before="0" w:after="0"/>
+        <w:ind w:left="283"/>
+        <w:shd w:val="clear" w:color="auto" w:fill="F3F4F6"/>
+      </w:pPr>
+      <w:r>
+        <w:rPr>
+          <w:rFonts w:ascii="Courier New" w:hAnsi="Courier New"/>
+          <w:color w:val="1F2D3D"/>
+          <w:sz w:val="18"/>
+        </w:rPr>
+        <w:t xml:space="preserve">    required String sector,</w:t>
+      </w:r>
+    </w:p>
+    <w:p>
+      <w:pPr>
+        <w:spacing w:before="0" w:after="0"/>
+        <w:ind w:left="283"/>
+        <w:shd w:val="clear" w:color="auto" w:fill="F3F4F6"/>
+      </w:pPr>
+      <w:r>
+        <w:rPr>
+          <w:rFonts w:ascii="Courier New" w:hAnsi="Courier New"/>
+          <w:color w:val="1F2D3D"/>
+          <w:sz w:val="18"/>
+        </w:rPr>
+        <w:t xml:space="preserve">    required String city,</w:t>
+      </w:r>
+    </w:p>
+    <w:p>
+      <w:pPr>
+        <w:spacing w:before="0" w:after="0"/>
+        <w:ind w:left="283"/>
+        <w:shd w:val="clear" w:color="auto" w:fill="F3F4F6"/>
+      </w:pPr>
+      <w:r>
+        <w:rPr>
+          <w:rFonts w:ascii="Courier New" w:hAnsi="Courier New"/>
+          <w:color w:val="1F2D3D"/>
+          <w:sz w:val="18"/>
+        </w:rPr>
+        <w:t xml:space="preserve">    String? projectName,</w:t>
+      </w:r>
+    </w:p>
+    <w:p>
+      <w:pPr>
+        <w:spacing w:before="0" w:after="0"/>
+        <w:ind w:left="283"/>
+        <w:shd w:val="clear" w:color="auto" w:fill="F3F4F6"/>
+      </w:pPr>
+      <w:r>
+        <w:rPr>
+          <w:rFonts w:ascii="Courier New" w:hAnsi="Courier New"/>
+          <w:color w:val="1F2D3D"/>
+          <w:sz w:val="18"/>
+        </w:rPr>
+        <w:t xml:space="preserve">  }) async {</w:t>
+      </w:r>
+    </w:p>
+    <w:p>
+      <w:pPr>
+        <w:spacing w:before="0" w:after="0"/>
+        <w:ind w:left="283"/>
+        <w:shd w:val="clear" w:color="auto" w:fill="F3F4F6"/>
+      </w:pPr>
+      <w:r>
+        <w:rPr>
+          <w:rFonts w:ascii="Courier New" w:hAnsi="Courier New"/>
+          <w:color w:val="1F2D3D"/>
+          <w:sz w:val="18"/>
+        </w:rPr>
+        <w:t xml:space="preserve">    final projectLine = (projectName != null &amp;&amp; projectName.isNotEmpty)</w:t>
+      </w:r>
+    </w:p>
+    <w:p>
+      <w:pPr>
+        <w:spacing w:before="0" w:after="0"/>
+        <w:ind w:left="283"/>
+        <w:shd w:val="clear" w:color="auto" w:fill="F3F4F6"/>
+      </w:pPr>
+      <w:r>
+        <w:rPr>
+          <w:rFonts w:ascii="Courier New" w:hAnsi="Courier New"/>
+          <w:color w:val="1F2D3D"/>
+          <w:sz w:val="18"/>
+        </w:rPr>
+        <w:t xml:space="preserve">        ? '\n🚀 Projet : $projectName'</w:t>
+      </w:r>
+    </w:p>
+    <w:p>
+      <w:pPr>
+        <w:spacing w:before="0" w:after="0"/>
+        <w:ind w:left="283"/>
+        <w:shd w:val="clear" w:color="auto" w:fill="F3F4F6"/>
+      </w:pPr>
+      <w:r>
+        <w:rPr>
+          <w:rFonts w:ascii="Courier New" w:hAnsi="Courier New"/>
+          <w:color w:val="1F2D3D"/>
+          <w:sz w:val="18"/>
+        </w:rPr>
+        <w:t xml:space="preserve">        : '';</w:t>
+      </w:r>
+    </w:p>
+    <w:p>
+      <w:pPr>
+        <w:spacing w:before="0" w:after="0"/>
+        <w:ind w:left="283"/>
+        <w:shd w:val="clear" w:color="auto" w:fill="F3F4F6"/>
+      </w:pPr>
+      <w:r>
+        <w:rPr>
+          <w:rFonts w:ascii="Courier New" w:hAnsi="Courier New"/>
+          <w:color w:val="1F2D3D"/>
+          <w:sz w:val="18"/>
+        </w:rPr>
+        <w:t xml:space="preserve"> </w:t>
+      </w:r>
+    </w:p>
+    <w:p>
+      <w:pPr>
+        <w:spacing w:before="0" w:after="0"/>
+        <w:ind w:left="283"/>
+        <w:shd w:val="clear" w:color="auto" w:fill="F3F4F6"/>
+      </w:pPr>
+      <w:r>
+        <w:rPr>
+          <w:rFonts w:ascii="Courier New" w:hAnsi="Courier New"/>
+          <w:color w:val="1F2D3D"/>
+          <w:sz w:val="18"/>
+        </w:rPr>
+        <w:t xml:space="preserve">    final text = '👋 Je suis *$name*, $role sur DIAPALER AFRICA !\n\n'</w:t>
+      </w:r>
+    </w:p>
+    <w:p>
+      <w:pPr>
+        <w:spacing w:before="0" w:after="0"/>
+        <w:ind w:left="283"/>
+        <w:shd w:val="clear" w:color="auto" w:fill="F3F4F6"/>
+      </w:pPr>
+      <w:r>
+        <w:rPr>
+          <w:rFonts w:ascii="Courier New" w:hAnsi="Courier New"/>
+          <w:color w:val="1F2D3D"/>
+          <w:sz w:val="18"/>
+        </w:rPr>
+        <w:t xml:space="preserve">        '🏢 Secteur : $sector\n'</w:t>
+      </w:r>
+    </w:p>
+    <w:p>
+      <w:pPr>
+        <w:spacing w:before="0" w:after="0"/>
+        <w:ind w:left="283"/>
+        <w:shd w:val="clear" w:color="auto" w:fill="F3F4F6"/>
+      </w:pPr>
+      <w:r>
+        <w:rPr>
+          <w:rFonts w:ascii="Courier New" w:hAnsi="Courier New"/>
+          <w:color w:val="1F2D3D"/>
+          <w:sz w:val="18"/>
+        </w:rPr>
+        <w:t xml:space="preserve">        '📍 $city$projectLine\n\n'</w:t>
+      </w:r>
+    </w:p>
+    <w:p>
+      <w:pPr>
+        <w:spacing w:before="0" w:after="0"/>
+        <w:ind w:left="283"/>
+        <w:shd w:val="clear" w:color="auto" w:fill="F3F4F6"/>
+      </w:pPr>
+      <w:r>
+        <w:rPr>
+          <w:rFonts w:ascii="Courier New" w:hAnsi="Courier New"/>
+          <w:color w:val="1F2D3D"/>
+          <w:sz w:val="18"/>
+        </w:rPr>
+        <w:t xml:space="preserve">        'Je recherche des mentors et investisseurs pour mon projet.\n'</w:t>
+      </w:r>
+    </w:p>
+    <w:p>
+      <w:pPr>
+        <w:spacing w:before="0" w:after="0"/>
+        <w:ind w:left="283"/>
+        <w:shd w:val="clear" w:color="auto" w:fill="F3F4F6"/>
+      </w:pPr>
+      <w:r>
+        <w:rPr>
+          <w:rFonts w:ascii="Courier New" w:hAnsi="Courier New"/>
+          <w:color w:val="1F2D3D"/>
+          <w:sz w:val="18"/>
+        </w:rPr>
+        <w:t xml:space="preserve">        'Connectons-nous sur DIAPALER AFRICA !\n\n'</w:t>
+      </w:r>
+    </w:p>
+    <w:p>
+      <w:pPr>
+        <w:spacing w:before="0" w:after="0"/>
+        <w:ind w:left="283"/>
+        <w:shd w:val="clear" w:color="auto" w:fill="F3F4F6"/>
+      </w:pPr>
+      <w:r>
+        <w:rPr>
+          <w:rFonts w:ascii="Courier New" w:hAnsi="Courier New"/>
+          <w:color w:val="1F2D3D"/>
+          <w:sz w:val="18"/>
+        </w:rPr>
+        <w:t xml:space="preserve">        '🇸🇳 https://diapalerafrica.app';</w:t>
+      </w:r>
+    </w:p>
+    <w:p>
+      <w:pPr>
+        <w:spacing w:before="0" w:after="0"/>
+        <w:ind w:left="283"/>
+        <w:shd w:val="clear" w:color="auto" w:fill="F3F4F6"/>
+      </w:pPr>
+      <w:r>
+        <w:rPr>
+          <w:rFonts w:ascii="Courier New" w:hAnsi="Courier New"/>
+          <w:color w:val="1F2D3D"/>
+          <w:sz w:val="18"/>
+        </w:rPr>
+        <w:t xml:space="preserve"> </w:t>
+      </w:r>
+    </w:p>
+    <w:p>
+      <w:pPr>
+        <w:spacing w:before="0" w:after="0"/>
+        <w:ind w:left="283"/>
+        <w:shd w:val="clear" w:color="auto" w:fill="F3F4F6"/>
+      </w:pPr>
+      <w:r>
+        <w:rPr>
+          <w:rFonts w:ascii="Courier New" w:hAnsi="Courier New"/>
+          <w:color w:val="1F2D3D"/>
+          <w:sz w:val="18"/>
+        </w:rPr>
+        <w:t xml:space="preserve">    await Share.share(text, subject: 'Mon profil DIAPALER AFRICA — $name');</w:t>
+      </w:r>
+    </w:p>
+    <w:p>
+      <w:pPr>
+        <w:spacing w:before="0" w:after="0"/>
+        <w:ind w:left="283"/>
+        <w:shd w:val="clear" w:color="auto" w:fill="F3F4F6"/>
+      </w:pPr>
+      <w:r>
+        <w:rPr>
+          <w:rFonts w:ascii="Courier New" w:hAnsi="Courier New"/>
+          <w:color w:val="1F2D3D"/>
+          <w:sz w:val="18"/>
+        </w:rPr>
+        <w:t xml:space="preserve">  }</w:t>
+      </w:r>
+    </w:p>
+    <w:p>
+      <w:pPr>
+        <w:spacing w:before="0" w:after="0"/>
+        <w:ind w:left="283"/>
+        <w:shd w:val="clear" w:color="auto" w:fill="F3F4F6"/>
+      </w:pPr>
+      <w:r>
+        <w:rPr>
+          <w:rFonts w:ascii="Courier New" w:hAnsi="Courier New"/>
+          <w:color w:val="1F2D3D"/>
+          <w:sz w:val="18"/>
+        </w:rPr>
+        <w:t xml:space="preserve"> </w:t>
+      </w:r>
+    </w:p>
+    <w:p>
+      <w:pPr>
+        <w:spacing w:before="0" w:after="0"/>
+        <w:ind w:left="283"/>
+        <w:shd w:val="clear" w:color="auto" w:fill="F3F4F6"/>
+      </w:pPr>
+      <w:r>
+        <w:rPr>
+          <w:rFonts w:ascii="Courier New" w:hAnsi="Courier New"/>
+          <w:color w:val="1F2D3D"/>
+          <w:sz w:val="18"/>
+        </w:rPr>
+        <w:t xml:space="preserve">  /// Partage un conseil donné par DIALI IA.</w:t>
+      </w:r>
+    </w:p>
+    <w:p>
+      <w:pPr>
+        <w:spacing w:before="0" w:after="0"/>
+        <w:ind w:left="283"/>
+        <w:shd w:val="clear" w:color="auto" w:fill="F3F4F6"/>
+      </w:pPr>
+      <w:r>
+        <w:rPr>
+          <w:rFonts w:ascii="Courier New" w:hAnsi="Courier New"/>
+          <w:color w:val="1F2D3D"/>
+          <w:sz w:val="18"/>
+        </w:rPr>
+        <w:t xml:space="preserve">  static Future&lt;void&gt; shareDialiAdvice({</w:t>
+      </w:r>
+    </w:p>
+    <w:p>
+      <w:pPr>
+        <w:spacing w:before="0" w:after="0"/>
+        <w:ind w:left="283"/>
+        <w:shd w:val="clear" w:color="auto" w:fill="F3F4F6"/>
+      </w:pPr>
+      <w:r>
+        <w:rPr>
+          <w:rFonts w:ascii="Courier New" w:hAnsi="Courier New"/>
+          <w:color w:val="1F2D3D"/>
+          <w:sz w:val="18"/>
+        </w:rPr>
+        <w:t xml:space="preserve">    required String advice,</w:t>
+      </w:r>
+    </w:p>
+    <w:p>
+      <w:pPr>
+        <w:spacing w:before="0" w:after="0"/>
+        <w:ind w:left="283"/>
+        <w:shd w:val="clear" w:color="auto" w:fill="F3F4F6"/>
+      </w:pPr>
+      <w:r>
+        <w:rPr>
+          <w:rFonts w:ascii="Courier New" w:hAnsi="Courier New"/>
+          <w:color w:val="1F2D3D"/>
+          <w:sz w:val="18"/>
+        </w:rPr>
+        <w:t xml:space="preserve">    required String userName,</w:t>
+      </w:r>
+    </w:p>
+    <w:p>
+      <w:pPr>
+        <w:spacing w:before="0" w:after="0"/>
+        <w:ind w:left="283"/>
+        <w:shd w:val="clear" w:color="auto" w:fill="F3F4F6"/>
+      </w:pPr>
+      <w:r>
+        <w:rPr>
+          <w:rFonts w:ascii="Courier New" w:hAnsi="Courier New"/>
+          <w:color w:val="1F2D3D"/>
+          <w:sz w:val="18"/>
+        </w:rPr>
+        <w:t xml:space="preserve">  }) async {</w:t>
+      </w:r>
+    </w:p>
+    <w:p>
+      <w:pPr>
+        <w:spacing w:before="0" w:after="0"/>
+        <w:ind w:left="283"/>
+        <w:shd w:val="clear" w:color="auto" w:fill="F3F4F6"/>
+      </w:pPr>
+      <w:r>
+        <w:rPr>
+          <w:rFonts w:ascii="Courier New" w:hAnsi="Courier New"/>
+          <w:color w:val="1F2D3D"/>
+          <w:sz w:val="18"/>
+        </w:rPr>
+        <w:t xml:space="preserve">    final preview = advice.length &gt; 280</w:t>
+      </w:r>
+    </w:p>
+    <w:p>
+      <w:pPr>
+        <w:spacing w:before="0" w:after="0"/>
+        <w:ind w:left="283"/>
+        <w:shd w:val="clear" w:color="auto" w:fill="F3F4F6"/>
+      </w:pPr>
+      <w:r>
+        <w:rPr>
+          <w:rFonts w:ascii="Courier New" w:hAnsi="Courier New"/>
+          <w:color w:val="1F2D3D"/>
+          <w:sz w:val="18"/>
+        </w:rPr>
+        <w:t xml:space="preserve">        ? '${advice.substring(0, 280)}…'</w:t>
+      </w:r>
+    </w:p>
+    <w:p>
+      <w:pPr>
+        <w:spacing w:before="0" w:after="0"/>
+        <w:ind w:left="283"/>
+        <w:shd w:val="clear" w:color="auto" w:fill="F3F4F6"/>
+      </w:pPr>
+      <w:r>
+        <w:rPr>
+          <w:rFonts w:ascii="Courier New" w:hAnsi="Courier New"/>
+          <w:color w:val="1F2D3D"/>
+          <w:sz w:val="18"/>
+        </w:rPr>
+        <w:t xml:space="preserve">        : advice;</w:t>
+      </w:r>
+    </w:p>
+    <w:p>
+      <w:pPr>
+        <w:spacing w:before="0" w:after="0"/>
+        <w:ind w:left="283"/>
+        <w:shd w:val="clear" w:color="auto" w:fill="F3F4F6"/>
+      </w:pPr>
+      <w:r>
+        <w:rPr>
+          <w:rFonts w:ascii="Courier New" w:hAnsi="Courier New"/>
+          <w:color w:val="1F2D3D"/>
+          <w:sz w:val="18"/>
+        </w:rPr>
+        <w:t xml:space="preserve"> </w:t>
+      </w:r>
+    </w:p>
+    <w:p>
+      <w:pPr>
+        <w:spacing w:before="0" w:after="0"/>
+        <w:ind w:left="283"/>
+        <w:shd w:val="clear" w:color="auto" w:fill="F3F4F6"/>
+      </w:pPr>
+      <w:r>
+        <w:rPr>
+          <w:rFonts w:ascii="Courier New" w:hAnsi="Courier New"/>
+          <w:color w:val="1F2D3D"/>
+          <w:sz w:val="18"/>
+        </w:rPr>
+        <w:t xml:space="preserve">    final text = '💡 Conseil de *DIALI IA* pour $userName\n\n'</w:t>
+      </w:r>
+    </w:p>
+    <w:p>
+      <w:pPr>
+        <w:spacing w:before="0" w:after="0"/>
+        <w:ind w:left="283"/>
+        <w:shd w:val="clear" w:color="auto" w:fill="F3F4F6"/>
+      </w:pPr>
+      <w:r>
+        <w:rPr>
+          <w:rFonts w:ascii="Courier New" w:hAnsi="Courier New"/>
+          <w:color w:val="1F2D3D"/>
+          <w:sz w:val="18"/>
+        </w:rPr>
+        <w:t xml:space="preserve">        '$preview\n\n'</w:t>
+      </w:r>
+    </w:p>
+    <w:p>
+      <w:pPr>
+        <w:spacing w:before="0" w:after="0"/>
+        <w:ind w:left="283"/>
+        <w:shd w:val="clear" w:color="auto" w:fill="F3F4F6"/>
+      </w:pPr>
+      <w:r>
+        <w:rPr>
+          <w:rFonts w:ascii="Courier New" w:hAnsi="Courier New"/>
+          <w:color w:val="1F2D3D"/>
+          <w:sz w:val="18"/>
+        </w:rPr>
+        <w:t xml:space="preserve">        '🤖 DIALI est l\'assistant IA de DIAPALER AFRICA — spécialisé dans '</w:t>
+      </w:r>
+    </w:p>
+    <w:p>
+      <w:pPr>
+        <w:spacing w:before="0" w:after="0"/>
+        <w:ind w:left="283"/>
+        <w:shd w:val="clear" w:color="auto" w:fill="F3F4F6"/>
+      </w:pPr>
+      <w:r>
+        <w:rPr>
+          <w:rFonts w:ascii="Courier New" w:hAnsi="Courier New"/>
+          <w:color w:val="1F2D3D"/>
+          <w:sz w:val="18"/>
+        </w:rPr>
+        <w:t xml:space="preserve">        'l\'écosystème sénégalais (DER/FJ, PAVIE 2, Be Yes, BNDE…).\n\n'</w:t>
+      </w:r>
+    </w:p>
+    <w:p>
+      <w:pPr>
+        <w:spacing w:before="0" w:after="0"/>
+        <w:ind w:left="283"/>
+        <w:shd w:val="clear" w:color="auto" w:fill="F3F4F6"/>
+      </w:pPr>
+      <w:r>
+        <w:rPr>
+          <w:rFonts w:ascii="Courier New" w:hAnsi="Courier New"/>
+          <w:color w:val="1F2D3D"/>
+          <w:sz w:val="18"/>
+        </w:rPr>
+        <w:t xml:space="preserve">        '🇸🇳 https://diapalerafrica.app';</w:t>
+      </w:r>
+    </w:p>
+    <w:p>
+      <w:pPr>
+        <w:spacing w:before="0" w:after="0"/>
+        <w:ind w:left="283"/>
+        <w:shd w:val="clear" w:color="auto" w:fill="F3F4F6"/>
+      </w:pPr>
+      <w:r>
+        <w:rPr>
+          <w:rFonts w:ascii="Courier New" w:hAnsi="Courier New"/>
+          <w:color w:val="1F2D3D"/>
+          <w:sz w:val="18"/>
+        </w:rPr>
+        <w:t xml:space="preserve"> </w:t>
+      </w:r>
+    </w:p>
+    <w:p>
+      <w:pPr>
+        <w:spacing w:before="0" w:after="0"/>
+        <w:ind w:left="283"/>
+        <w:shd w:val="clear" w:color="auto" w:fill="F3F4F6"/>
+      </w:pPr>
+      <w:r>
+        <w:rPr>
+          <w:rFonts w:ascii="Courier New" w:hAnsi="Courier New"/>
+          <w:color w:val="1F2D3D"/>
+          <w:sz w:val="18"/>
+        </w:rPr>
+        <w:t xml:space="preserve">    await Share.share(text, subject: 'Conseil DIALI IA — DIAPALER AFRICA');</w:t>
+      </w:r>
+    </w:p>
+    <w:p>
+      <w:pPr>
+        <w:spacing w:before="0" w:after="0"/>
+        <w:ind w:left="283"/>
+        <w:shd w:val="clear" w:color="auto" w:fill="F3F4F6"/>
+      </w:pPr>
+      <w:r>
+        <w:rPr>
+          <w:rFonts w:ascii="Courier New" w:hAnsi="Courier New"/>
+          <w:color w:val="1F2D3D"/>
+          <w:sz w:val="18"/>
+        </w:rPr>
+        <w:t xml:space="preserve">  }</w:t>
+      </w:r>
+    </w:p>
+    <w:p>
+      <w:pPr>
+        <w:spacing w:before="0" w:after="0"/>
+        <w:ind w:left="283"/>
+        <w:shd w:val="clear" w:color="auto" w:fill="F3F4F6"/>
+      </w:pPr>
+      <w:r>
+        <w:rPr>
+          <w:rFonts w:ascii="Courier New" w:hAnsi="Courier New"/>
+          <w:color w:val="1F2D3D"/>
+          <w:sz w:val="18"/>
+        </w:rPr>
+        <w:t>}</w:t>
+      </w:r>
+    </w:p>
+    <w:p>
+      <w:pPr>
+        <w:spacing w:after="80"/>
+      </w:pPr>
+    </w:p>
+    <w:p>
+      <w:pPr>
+        <w:pStyle w:val="Heading3"/>
+      </w:pPr>
+      <w:r>
+        <w:t>10.2 Intégration dans les écrans</w:t>
+      </w:r>
+    </w:p>
+    <w:p>
+      <w:r>
+        <w:rPr>
+          <w:rFonts w:ascii="Calibri" w:hAnsi="Calibri"/>
+          <w:sz w:val="22"/>
+        </w:rPr>
+        <w:t xml:space="preserve">Le bouton de partage </w:t>
+      </w:r>
+      <w:r>
+        <w:rPr>
+          <w:rFonts w:ascii="Courier New" w:hAnsi="Courier New"/>
+          <w:color w:val="DC2626"/>
+          <w:sz w:val="20"/>
+        </w:rPr>
+        <w:t>IconButton(icon: Icon(Icons.share_rounded))</w:t>
+      </w:r>
+      <w:r>
+        <w:rPr>
+          <w:rFonts w:ascii="Calibri" w:hAnsi="Calibri"/>
+          <w:sz w:val="22"/>
+        </w:rPr>
+        <w:t xml:space="preserve"> a été intégré dans trois écrans :</w:t>
+      </w:r>
+    </w:p>
+    <w:tbl>
+      <w:tblPr>
+        <w:tblStyle w:val="TableGrid"/>
+        <w:tblW w:type="auto" w:w="0"/>
+        <w:tblLook w:firstColumn="1" w:firstRow="1" w:lastColumn="0" w:lastRow="0" w:noHBand="0" w:noVBand="1" w:val="04A0"/>
+      </w:tblPr>
+      <w:tblGrid>
+        <w:gridCol w:w="3135"/>
+        <w:gridCol w:w="3135"/>
+        <w:gridCol w:w="3135"/>
+      </w:tblGrid>
+      <w:tr>
+        <w:tc>
+          <w:tcPr>
+            <w:tcW w:type="dxa" w:w="3135"/>
+            <w:shd w:val="clear" w:color="auto" w:fill="1E3A8A"/>
+          </w:tcPr>
+          <w:p>
+            <w:r>
+              <w:rPr>
+                <w:rFonts w:ascii="Calibri" w:hAnsi="Calibri"/>
+                <w:b/>
+                <w:color w:val="FFFFFF"/>
+                <w:sz w:val="20"/>
+              </w:rPr>
+              <w:t>Écran</w:t>
+            </w:r>
+          </w:p>
+        </w:tc>
+        <w:tc>
+          <w:tcPr>
+            <w:tcW w:type="dxa" w:w="3135"/>
+            <w:shd w:val="clear" w:color="auto" w:fill="1E3A8A"/>
+          </w:tcPr>
+          <w:p>
+            <w:r>
+              <w:rPr>
+                <w:rFonts w:ascii="Calibri" w:hAnsi="Calibri"/>
+                <w:b/>
+                <w:color w:val="FFFFFF"/>
+                <w:sz w:val="20"/>
+              </w:rPr>
+              <w:t>Emplacement</w:t>
+            </w:r>
+          </w:p>
+        </w:tc>
+        <w:tc>
+          <w:tcPr>
+            <w:tcW w:type="dxa" w:w="3135"/>
+            <w:shd w:val="clear" w:color="auto" w:fill="1E3A8A"/>
+          </w:tcPr>
+          <w:p>
+            <w:r>
+              <w:rPr>
+                <w:rFonts w:ascii="Calibri" w:hAnsi="Calibri"/>
+                <w:b/>
+                <w:color w:val="FFFFFF"/>
+                <w:sz w:val="20"/>
+              </w:rPr>
+              <w:t>Méthode appelée</w:t>
+            </w:r>
+          </w:p>
+        </w:tc>
+      </w:tr>
+      <w:tr>
+        <w:tc>
+          <w:tcPr>
+            <w:tcW w:type="dxa" w:w="3135"/>
+            <w:shd w:val="clear" w:color="auto" w:fill="EFF6FF"/>
+          </w:tcPr>
+          <w:p>
+            <w:r>
+              <w:rPr>
+                <w:rFonts w:ascii="Calibri" w:hAnsi="Calibri"/>
+                <w:color w:val="DC2626"/>
+                <w:sz w:val="20"/>
+              </w:rPr>
+              <w:t>PagePitchsPublics</w:t>
+            </w:r>
+          </w:p>
+        </w:tc>
+        <w:tc>
+          <w:tcPr>
+            <w:tcW w:type="dxa" w:w="3135"/>
+            <w:shd w:val="clear" w:color="auto" w:fill="EFF6FF"/>
+          </w:tcPr>
+          <w:p>
+            <w:r>
+              <w:rPr>
+                <w:rFonts w:ascii="Calibri" w:hAnsi="Calibri"/>
+                <w:sz w:val="20"/>
+              </w:rPr>
+              <w:t>Icône dans chaque carte pitch</w:t>
+            </w:r>
+          </w:p>
+        </w:tc>
+        <w:tc>
+          <w:tcPr>
+            <w:tcW w:type="dxa" w:w="3135"/>
+            <w:shd w:val="clear" w:color="auto" w:fill="EFF6FF"/>
+          </w:tcPr>
+          <w:p>
+            <w:r>
+              <w:rPr>
+                <w:rFonts w:ascii="Calibri" w:hAnsi="Calibri"/>
+                <w:color w:val="DC2626"/>
+                <w:sz w:val="20"/>
+              </w:rPr>
+              <w:t>ShareService.sharePitch(...)</w:t>
+            </w:r>
+          </w:p>
+        </w:tc>
+      </w:tr>
+      <w:tr>
+        <w:tc>
+          <w:tcPr>
+            <w:tcW w:type="dxa" w:w="3135"/>
+          </w:tcPr>
+          <w:p>
+            <w:r>
+              <w:rPr>
+                <w:rFonts w:ascii="Calibri" w:hAnsi="Calibri"/>
+                <w:color w:val="DC2626"/>
+                <w:sz w:val="20"/>
+              </w:rPr>
+              <w:t>PageProfil</w:t>
+            </w:r>
+          </w:p>
+        </w:tc>
+        <w:tc>
+          <w:tcPr>
+            <w:tcW w:type="dxa" w:w="3135"/>
+          </w:tcPr>
+          <w:p>
+            <w:r>
+              <w:rPr>
+                <w:rFonts w:ascii="Calibri" w:hAnsi="Calibri"/>
+                <w:sz w:val="20"/>
+              </w:rPr>
+              <w:t>AppBar actions (avant le bouton modifier)</w:t>
+            </w:r>
+          </w:p>
+        </w:tc>
+        <w:tc>
+          <w:tcPr>
+            <w:tcW w:type="dxa" w:w="3135"/>
+          </w:tcPr>
+          <w:p>
+            <w:r>
+              <w:rPr>
+                <w:rFonts w:ascii="Calibri" w:hAnsi="Calibri"/>
+                <w:color w:val="DC2626"/>
+                <w:sz w:val="20"/>
+              </w:rPr>
+              <w:t>ShareService.shareMyProfile(...)</w:t>
+            </w:r>
+          </w:p>
+        </w:tc>
+      </w:tr>
+      <w:tr>
+        <w:tc>
+          <w:tcPr>
+            <w:tcW w:type="dxa" w:w="3135"/>
+            <w:shd w:val="clear" w:color="auto" w:fill="EFF6FF"/>
+          </w:tcPr>
+          <w:p>
+            <w:r>
+              <w:rPr>
+                <w:rFonts w:ascii="Calibri" w:hAnsi="Calibri"/>
+                <w:color w:val="DC2626"/>
+                <w:sz w:val="20"/>
+              </w:rPr>
+              <w:t>PageDetailMentor</w:t>
+            </w:r>
+          </w:p>
+        </w:tc>
+        <w:tc>
+          <w:tcPr>
+            <w:tcW w:type="dxa" w:w="3135"/>
+            <w:shd w:val="clear" w:color="auto" w:fill="EFF6FF"/>
+          </w:tcPr>
+          <w:p>
+            <w:r>
+              <w:rPr>
+                <w:rFonts w:ascii="Calibri" w:hAnsi="Calibri"/>
+                <w:sz w:val="20"/>
+              </w:rPr>
+              <w:t>SliverAppBar actions (avant le favori)</w:t>
+            </w:r>
+          </w:p>
+        </w:tc>
+        <w:tc>
+          <w:tcPr>
+            <w:tcW w:type="dxa" w:w="3135"/>
+            <w:shd w:val="clear" w:color="auto" w:fill="EFF6FF"/>
+          </w:tcPr>
+          <w:p>
+            <w:r>
+              <w:rPr>
+                <w:rFonts w:ascii="Calibri" w:hAnsi="Calibri"/>
+                <w:color w:val="DC2626"/>
+                <w:sz w:val="20"/>
+              </w:rPr>
+              <w:t>ShareService.shareMentorProfile(...)</w:t>
+            </w:r>
+          </w:p>
+        </w:tc>
+      </w:tr>
+    </w:tbl>
+    <w:p>
+      <w:pPr>
+        <w:spacing w:after="120"/>
+      </w:pPr>
+    </w:p>
+    <w:p>
+      <w:r>
+        <w:rPr>
+          <w:rFonts w:ascii="Calibri" w:hAnsi="Calibri"/>
+          <w:b/>
+          <w:sz w:val="22"/>
+        </w:rPr>
+        <w:t>Exemple — bouton partage dans la liste des pitchs :</w:t>
+      </w:r>
+    </w:p>
+    <w:p>
+      <w:pPr>
+        <w:spacing w:before="0" w:after="0"/>
+        <w:ind w:left="283"/>
+        <w:shd w:val="clear" w:color="auto" w:fill="F3F4F6"/>
+      </w:pPr>
+      <w:r>
+        <w:rPr>
+          <w:rFonts w:ascii="Courier New" w:hAnsi="Courier New"/>
+          <w:color w:val="1F2D3D"/>
+          <w:sz w:val="18"/>
+        </w:rPr>
+        <w:t>// lib/screens/page_pitches_publics.dart</w:t>
+      </w:r>
+    </w:p>
+    <w:p>
+      <w:pPr>
+        <w:spacing w:before="0" w:after="0"/>
+        <w:ind w:left="283"/>
+        <w:shd w:val="clear" w:color="auto" w:fill="F3F4F6"/>
+      </w:pPr>
+      <w:r>
+        <w:rPr>
+          <w:rFonts w:ascii="Courier New" w:hAnsi="Courier New"/>
+          <w:color w:val="1F2D3D"/>
+          <w:sz w:val="18"/>
+        </w:rPr>
+        <w:t>import '../services/service_partage.dart';</w:t>
+      </w:r>
+    </w:p>
+    <w:p>
+      <w:pPr>
+        <w:spacing w:before="0" w:after="0"/>
+        <w:ind w:left="283"/>
+        <w:shd w:val="clear" w:color="auto" w:fill="F3F4F6"/>
+      </w:pPr>
+      <w:r>
+        <w:rPr>
+          <w:rFonts w:ascii="Courier New" w:hAnsi="Courier New"/>
+          <w:color w:val="1F2D3D"/>
+          <w:sz w:val="18"/>
+        </w:rPr>
+        <w:t xml:space="preserve"> </w:t>
+      </w:r>
+    </w:p>
+    <w:p>
+      <w:pPr>
+        <w:spacing w:before="0" w:after="0"/>
+        <w:ind w:left="283"/>
+        <w:shd w:val="clear" w:color="auto" w:fill="F3F4F6"/>
+      </w:pPr>
+      <w:r>
+        <w:rPr>
+          <w:rFonts w:ascii="Courier New" w:hAnsi="Courier New"/>
+          <w:color w:val="1F2D3D"/>
+          <w:sz w:val="18"/>
+        </w:rPr>
+        <w:t>// Dans la carte de chaque pitch :</w:t>
+      </w:r>
+    </w:p>
+    <w:p>
+      <w:pPr>
+        <w:spacing w:before="0" w:after="0"/>
+        <w:ind w:left="283"/>
+        <w:shd w:val="clear" w:color="auto" w:fill="F3F4F6"/>
+      </w:pPr>
+      <w:r>
+        <w:rPr>
+          <w:rFonts w:ascii="Courier New" w:hAnsi="Courier New"/>
+          <w:color w:val="1F2D3D"/>
+          <w:sz w:val="18"/>
+        </w:rPr>
+        <w:t>IconButton(</w:t>
+      </w:r>
+    </w:p>
+    <w:p>
+      <w:pPr>
+        <w:spacing w:before="0" w:after="0"/>
+        <w:ind w:left="283"/>
+        <w:shd w:val="clear" w:color="auto" w:fill="F3F4F6"/>
+      </w:pPr>
+      <w:r>
+        <w:rPr>
+          <w:rFonts w:ascii="Courier New" w:hAnsi="Courier New"/>
+          <w:color w:val="1F2D3D"/>
+          <w:sz w:val="18"/>
+        </w:rPr>
+        <w:t xml:space="preserve">  onPressed: () =&gt; ShareService.sharePitch(</w:t>
+      </w:r>
+    </w:p>
+    <w:p>
+      <w:pPr>
+        <w:spacing w:before="0" w:after="0"/>
+        <w:ind w:left="283"/>
+        <w:shd w:val="clear" w:color="auto" w:fill="F3F4F6"/>
+      </w:pPr>
+      <w:r>
+        <w:rPr>
+          <w:rFonts w:ascii="Courier New" w:hAnsi="Courier New"/>
+          <w:color w:val="1F2D3D"/>
+          <w:sz w:val="18"/>
+        </w:rPr>
+        <w:t xml:space="preserve">    title: title,</w:t>
+      </w:r>
+    </w:p>
+    <w:p>
+      <w:pPr>
+        <w:spacing w:before="0" w:after="0"/>
+        <w:ind w:left="283"/>
+        <w:shd w:val="clear" w:color="auto" w:fill="F3F4F6"/>
+      </w:pPr>
+      <w:r>
+        <w:rPr>
+          <w:rFonts w:ascii="Courier New" w:hAnsi="Courier New"/>
+          <w:color w:val="1F2D3D"/>
+          <w:sz w:val="18"/>
+        </w:rPr>
+        <w:t xml:space="preserve">    sector: sector,</w:t>
+      </w:r>
+    </w:p>
+    <w:p>
+      <w:pPr>
+        <w:spacing w:before="0" w:after="0"/>
+        <w:ind w:left="283"/>
+        <w:shd w:val="clear" w:color="auto" w:fill="F3F4F6"/>
+      </w:pPr>
+      <w:r>
+        <w:rPr>
+          <w:rFonts w:ascii="Courier New" w:hAnsi="Courier New"/>
+          <w:color w:val="1F2D3D"/>
+          <w:sz w:val="18"/>
+        </w:rPr>
+        <w:t xml:space="preserve">    description: description,</w:t>
+      </w:r>
+    </w:p>
+    <w:p>
+      <w:pPr>
+        <w:spacing w:before="0" w:after="0"/>
+        <w:ind w:left="283"/>
+        <w:shd w:val="clear" w:color="auto" w:fill="F3F4F6"/>
+      </w:pPr>
+      <w:r>
+        <w:rPr>
+          <w:rFonts w:ascii="Courier New" w:hAnsi="Courier New"/>
+          <w:color w:val="1F2D3D"/>
+          <w:sz w:val="18"/>
+        </w:rPr>
+        <w:t xml:space="preserve">    authorName: userName,</w:t>
+      </w:r>
+    </w:p>
+    <w:p>
+      <w:pPr>
+        <w:spacing w:before="0" w:after="0"/>
+        <w:ind w:left="283"/>
+        <w:shd w:val="clear" w:color="auto" w:fill="F3F4F6"/>
+      </w:pPr>
+      <w:r>
+        <w:rPr>
+          <w:rFonts w:ascii="Courier New" w:hAnsi="Courier New"/>
+          <w:color w:val="1F2D3D"/>
+          <w:sz w:val="18"/>
+        </w:rPr>
+        <w:t xml:space="preserve">    amount: amount.isNotEmpty ? amount : null,</w:t>
+      </w:r>
+    </w:p>
+    <w:p>
+      <w:pPr>
+        <w:spacing w:before="0" w:after="0"/>
+        <w:ind w:left="283"/>
+        <w:shd w:val="clear" w:color="auto" w:fill="F3F4F6"/>
+      </w:pPr>
+      <w:r>
+        <w:rPr>
+          <w:rFonts w:ascii="Courier New" w:hAnsi="Courier New"/>
+          <w:color w:val="1F2D3D"/>
+          <w:sz w:val="18"/>
+        </w:rPr>
+        <w:t xml:space="preserve">  ),</w:t>
+      </w:r>
+    </w:p>
+    <w:p>
+      <w:pPr>
+        <w:spacing w:before="0" w:after="0"/>
+        <w:ind w:left="283"/>
+        <w:shd w:val="clear" w:color="auto" w:fill="F3F4F6"/>
+      </w:pPr>
+      <w:r>
+        <w:rPr>
+          <w:rFonts w:ascii="Courier New" w:hAnsi="Courier New"/>
+          <w:color w:val="1F2D3D"/>
+          <w:sz w:val="18"/>
+        </w:rPr>
+        <w:t xml:space="preserve">  icon: const Icon(Icons.share_rounded, size: 18),</w:t>
+      </w:r>
+    </w:p>
+    <w:p>
+      <w:pPr>
+        <w:spacing w:before="0" w:after="0"/>
+        <w:ind w:left="283"/>
+        <w:shd w:val="clear" w:color="auto" w:fill="F3F4F6"/>
+      </w:pPr>
+      <w:r>
+        <w:rPr>
+          <w:rFonts w:ascii="Courier New" w:hAnsi="Courier New"/>
+          <w:color w:val="1F2D3D"/>
+          <w:sz w:val="18"/>
+        </w:rPr>
+        <w:t xml:space="preserve">  color: AppColors.muted,</w:t>
+      </w:r>
+    </w:p>
+    <w:p>
+      <w:pPr>
+        <w:spacing w:before="0" w:after="0"/>
+        <w:ind w:left="283"/>
+        <w:shd w:val="clear" w:color="auto" w:fill="F3F4F6"/>
+      </w:pPr>
+      <w:r>
+        <w:rPr>
+          <w:rFonts w:ascii="Courier New" w:hAnsi="Courier New"/>
+          <w:color w:val="1F2D3D"/>
+          <w:sz w:val="18"/>
+        </w:rPr>
+        <w:t>),</w:t>
+      </w:r>
+    </w:p>
+    <w:p>
+      <w:pPr>
+        <w:spacing w:after="80"/>
+      </w:pPr>
+    </w:p>
+    <w:p>
+      <w:r>
+        <w:rPr>
+          <w:rFonts w:ascii="Calibri" w:hAnsi="Calibri"/>
+          <w:b/>
+          <w:sz w:val="22"/>
+        </w:rPr>
+        <w:t>Exemple — bouton partage dans le profil personnel :</w:t>
+      </w:r>
+    </w:p>
+    <w:p>
+      <w:pPr>
+        <w:spacing w:before="0" w:after="0"/>
+        <w:ind w:left="283"/>
+        <w:shd w:val="clear" w:color="auto" w:fill="F3F4F6"/>
+      </w:pPr>
+      <w:r>
+        <w:rPr>
+          <w:rFonts w:ascii="Courier New" w:hAnsi="Courier New"/>
+          <w:color w:val="1F2D3D"/>
+          <w:sz w:val="18"/>
+        </w:rPr>
+        <w:t>// lib/screens/page_profil.dart</w:t>
+      </w:r>
+    </w:p>
+    <w:p>
+      <w:pPr>
+        <w:spacing w:before="0" w:after="0"/>
+        <w:ind w:left="283"/>
+        <w:shd w:val="clear" w:color="auto" w:fill="F3F4F6"/>
+      </w:pPr>
+      <w:r>
+        <w:rPr>
+          <w:rFonts w:ascii="Courier New" w:hAnsi="Courier New"/>
+          <w:color w:val="1F2D3D"/>
+          <w:sz w:val="18"/>
+        </w:rPr>
+        <w:t>import '../services/service_partage.dart';</w:t>
+      </w:r>
+    </w:p>
+    <w:p>
+      <w:pPr>
+        <w:spacing w:before="0" w:after="0"/>
+        <w:ind w:left="283"/>
+        <w:shd w:val="clear" w:color="auto" w:fill="F3F4F6"/>
+      </w:pPr>
+      <w:r>
+        <w:rPr>
+          <w:rFonts w:ascii="Courier New" w:hAnsi="Courier New"/>
+          <w:color w:val="1F2D3D"/>
+          <w:sz w:val="18"/>
+        </w:rPr>
+        <w:t xml:space="preserve"> </w:t>
+      </w:r>
+    </w:p>
+    <w:p>
+      <w:pPr>
+        <w:spacing w:before="0" w:after="0"/>
+        <w:ind w:left="283"/>
+        <w:shd w:val="clear" w:color="auto" w:fill="F3F4F6"/>
+      </w:pPr>
+      <w:r>
+        <w:rPr>
+          <w:rFonts w:ascii="Courier New" w:hAnsi="Courier New"/>
+          <w:color w:val="1F2D3D"/>
+          <w:sz w:val="18"/>
+        </w:rPr>
+        <w:t>// Dans AppBar.actions :</w:t>
+      </w:r>
+    </w:p>
+    <w:p>
+      <w:pPr>
+        <w:spacing w:before="0" w:after="0"/>
+        <w:ind w:left="283"/>
+        <w:shd w:val="clear" w:color="auto" w:fill="F3F4F6"/>
+      </w:pPr>
+      <w:r>
+        <w:rPr>
+          <w:rFonts w:ascii="Courier New" w:hAnsi="Courier New"/>
+          <w:color w:val="1F2D3D"/>
+          <w:sz w:val="18"/>
+        </w:rPr>
+        <w:t>IconButton(</w:t>
+      </w:r>
+    </w:p>
+    <w:p>
+      <w:pPr>
+        <w:spacing w:before="0" w:after="0"/>
+        <w:ind w:left="283"/>
+        <w:shd w:val="clear" w:color="auto" w:fill="F3F4F6"/>
+      </w:pPr>
+      <w:r>
+        <w:rPr>
+          <w:rFonts w:ascii="Courier New" w:hAnsi="Courier New"/>
+          <w:color w:val="1F2D3D"/>
+          <w:sz w:val="18"/>
+        </w:rPr>
+        <w:t xml:space="preserve">  tooltip: 'Partager mon profil',</w:t>
+      </w:r>
+    </w:p>
+    <w:p>
+      <w:pPr>
+        <w:spacing w:before="0" w:after="0"/>
+        <w:ind w:left="283"/>
+        <w:shd w:val="clear" w:color="auto" w:fill="F3F4F6"/>
+      </w:pPr>
+      <w:r>
+        <w:rPr>
+          <w:rFonts w:ascii="Courier New" w:hAnsi="Courier New"/>
+          <w:color w:val="1F2D3D"/>
+          <w:sz w:val="18"/>
+        </w:rPr>
+        <w:t xml:space="preserve">  onPressed: () =&gt; ShareService.shareMyProfile(</w:t>
+      </w:r>
+    </w:p>
+    <w:p>
+      <w:pPr>
+        <w:spacing w:before="0" w:after="0"/>
+        <w:ind w:left="283"/>
+        <w:shd w:val="clear" w:color="auto" w:fill="F3F4F6"/>
+      </w:pPr>
+      <w:r>
+        <w:rPr>
+          <w:rFonts w:ascii="Courier New" w:hAnsi="Courier New"/>
+          <w:color w:val="1F2D3D"/>
+          <w:sz w:val="18"/>
+        </w:rPr>
+        <w:t xml:space="preserve">    name: p.fullName,</w:t>
+      </w:r>
+    </w:p>
+    <w:p>
+      <w:pPr>
+        <w:spacing w:before="0" w:after="0"/>
+        <w:ind w:left="283"/>
+        <w:shd w:val="clear" w:color="auto" w:fill="F3F4F6"/>
+      </w:pPr>
+      <w:r>
+        <w:rPr>
+          <w:rFonts w:ascii="Courier New" w:hAnsi="Courier New"/>
+          <w:color w:val="1F2D3D"/>
+          <w:sz w:val="18"/>
+        </w:rPr>
+        <w:t xml:space="preserve">    role: p.role,</w:t>
+      </w:r>
+    </w:p>
+    <w:p>
+      <w:pPr>
+        <w:spacing w:before="0" w:after="0"/>
+        <w:ind w:left="283"/>
+        <w:shd w:val="clear" w:color="auto" w:fill="F3F4F6"/>
+      </w:pPr>
+      <w:r>
+        <w:rPr>
+          <w:rFonts w:ascii="Courier New" w:hAnsi="Courier New"/>
+          <w:color w:val="1F2D3D"/>
+          <w:sz w:val="18"/>
+        </w:rPr>
+        <w:t xml:space="preserve">    sector: p.sector,</w:t>
+      </w:r>
+    </w:p>
+    <w:p>
+      <w:pPr>
+        <w:spacing w:before="0" w:after="0"/>
+        <w:ind w:left="283"/>
+        <w:shd w:val="clear" w:color="auto" w:fill="F3F4F6"/>
+      </w:pPr>
+      <w:r>
+        <w:rPr>
+          <w:rFonts w:ascii="Courier New" w:hAnsi="Courier New"/>
+          <w:color w:val="1F2D3D"/>
+          <w:sz w:val="18"/>
+        </w:rPr>
+        <w:t xml:space="preserve">    city: p.city,</w:t>
+      </w:r>
+    </w:p>
+    <w:p>
+      <w:pPr>
+        <w:spacing w:before="0" w:after="0"/>
+        <w:ind w:left="283"/>
+        <w:shd w:val="clear" w:color="auto" w:fill="F3F4F6"/>
+      </w:pPr>
+      <w:r>
+        <w:rPr>
+          <w:rFonts w:ascii="Courier New" w:hAnsi="Courier New"/>
+          <w:color w:val="1F2D3D"/>
+          <w:sz w:val="18"/>
+        </w:rPr>
+        <w:t xml:space="preserve">    projectName: p.projects.isNotEmpty ? p.projects.first.name : null,</w:t>
+      </w:r>
+    </w:p>
+    <w:p>
+      <w:pPr>
+        <w:spacing w:before="0" w:after="0"/>
+        <w:ind w:left="283"/>
+        <w:shd w:val="clear" w:color="auto" w:fill="F3F4F6"/>
+      </w:pPr>
+      <w:r>
+        <w:rPr>
+          <w:rFonts w:ascii="Courier New" w:hAnsi="Courier New"/>
+          <w:color w:val="1F2D3D"/>
+          <w:sz w:val="18"/>
+        </w:rPr>
+        <w:t xml:space="preserve">  ),</w:t>
+      </w:r>
+    </w:p>
+    <w:p>
+      <w:pPr>
+        <w:spacing w:before="0" w:after="0"/>
+        <w:ind w:left="283"/>
+        <w:shd w:val="clear" w:color="auto" w:fill="F3F4F6"/>
+      </w:pPr>
+      <w:r>
+        <w:rPr>
+          <w:rFonts w:ascii="Courier New" w:hAnsi="Courier New"/>
+          <w:color w:val="1F2D3D"/>
+          <w:sz w:val="18"/>
+        </w:rPr>
+        <w:t xml:space="preserve">  icon: const Icon(Icons.share_rounded),</w:t>
+      </w:r>
+    </w:p>
+    <w:p>
+      <w:pPr>
+        <w:spacing w:before="0" w:after="0"/>
+        <w:ind w:left="283"/>
+        <w:shd w:val="clear" w:color="auto" w:fill="F3F4F6"/>
+      </w:pPr>
+      <w:r>
+        <w:rPr>
+          <w:rFonts w:ascii="Courier New" w:hAnsi="Courier New"/>
+          <w:color w:val="1F2D3D"/>
+          <w:sz w:val="18"/>
+        </w:rPr>
+        <w:t>),</w:t>
+      </w:r>
+    </w:p>
+    <w:p>
+      <w:pPr>
+        <w:spacing w:after="80"/>
+      </w:pPr>
+    </w:p>
+    <w:p>
+      <w:pPr>
+        <w:pStyle w:val="Heading3"/>
+      </w:pPr>
+      <w:r>
+        <w:t>10.3 Résultat du partage</w:t>
+      </w:r>
+    </w:p>
+    <w:p>
+      <w:r>
+        <w:rPr>
+          <w:rFonts w:ascii="Calibri" w:hAnsi="Calibri"/>
+          <w:sz w:val="22"/>
+        </w:rPr>
+        <w:t xml:space="preserve">Quand l'utilisateur appuie sur le bouton partage, la </w:t>
+      </w:r>
+      <w:r>
+        <w:rPr>
+          <w:rFonts w:ascii="Calibri" w:hAnsi="Calibri"/>
+          <w:b/>
+          <w:sz w:val="22"/>
+        </w:rPr>
+        <w:t>feuille native du système</w:t>
+      </w:r>
+      <w:r>
+        <w:rPr>
+          <w:rFonts w:ascii="Calibri" w:hAnsi="Calibri"/>
+          <w:sz w:val="22"/>
+        </w:rPr>
+        <w:t xml:space="preserve"> s'ouvre avec un texte pré-formaté :</w:t>
+      </w:r>
+    </w:p>
+    <w:p>
+      <w:pPr>
+        <w:spacing w:before="0" w:after="0"/>
+        <w:ind w:left="283"/>
+        <w:shd w:val="clear" w:color="auto" w:fill="F3F4F6"/>
+      </w:pPr>
+      <w:r>
+        <w:rPr>
+          <w:rFonts w:ascii="Courier New" w:hAnsi="Courier New"/>
+          <w:color w:val="1F2D3D"/>
+          <w:sz w:val="18"/>
+        </w:rPr>
+        <w:t>🚀 *AgriTech Dakar* — Pitch sur DIAPALER AFRICA</w:t>
+      </w:r>
+    </w:p>
+    <w:p>
+      <w:pPr>
+        <w:spacing w:before="0" w:after="0"/>
+        <w:ind w:left="283"/>
+        <w:shd w:val="clear" w:color="auto" w:fill="F3F4F6"/>
+      </w:pPr>
+      <w:r>
+        <w:rPr>
+          <w:rFonts w:ascii="Courier New" w:hAnsi="Courier New"/>
+          <w:color w:val="1F2D3D"/>
+          <w:sz w:val="18"/>
+        </w:rPr>
+        <w:t xml:space="preserve"> </w:t>
+      </w:r>
+    </w:p>
+    <w:p>
+      <w:pPr>
+        <w:spacing w:before="0" w:after="0"/>
+        <w:ind w:left="283"/>
+        <w:shd w:val="clear" w:color="auto" w:fill="F3F4F6"/>
+      </w:pPr>
+      <w:r>
+        <w:rPr>
+          <w:rFonts w:ascii="Courier New" w:hAnsi="Courier New"/>
+          <w:color w:val="1F2D3D"/>
+          <w:sz w:val="18"/>
+        </w:rPr>
+        <w:t>👤 Moussa Diallo · 🏢 Agriculture</w:t>
+      </w:r>
+    </w:p>
+    <w:p>
+      <w:pPr>
+        <w:spacing w:before="0" w:after="0"/>
+        <w:ind w:left="283"/>
+        <w:shd w:val="clear" w:color="auto" w:fill="F3F4F6"/>
+      </w:pPr>
+      <w:r>
+        <w:rPr>
+          <w:rFonts w:ascii="Courier New" w:hAnsi="Courier New"/>
+          <w:color w:val="1F2D3D"/>
+          <w:sz w:val="18"/>
+        </w:rPr>
+        <w:t>💰 Besoin de financement : 5000000 FCFA</w:t>
+      </w:r>
+    </w:p>
+    <w:p>
+      <w:pPr>
+        <w:spacing w:before="0" w:after="0"/>
+        <w:ind w:left="283"/>
+        <w:shd w:val="clear" w:color="auto" w:fill="F3F4F6"/>
+      </w:pPr>
+      <w:r>
+        <w:rPr>
+          <w:rFonts w:ascii="Courier New" w:hAnsi="Courier New"/>
+          <w:color w:val="1F2D3D"/>
+          <w:sz w:val="18"/>
+        </w:rPr>
+        <w:t xml:space="preserve"> </w:t>
+      </w:r>
+    </w:p>
+    <w:p>
+      <w:pPr>
+        <w:spacing w:before="0" w:after="0"/>
+        <w:ind w:left="283"/>
+        <w:shd w:val="clear" w:color="auto" w:fill="F3F4F6"/>
+      </w:pPr>
+      <w:r>
+        <w:rPr>
+          <w:rFonts w:ascii="Courier New" w:hAnsi="Courier New"/>
+          <w:color w:val="1F2D3D"/>
+          <w:sz w:val="18"/>
+        </w:rPr>
+        <w:t>📝 Solution numérique de mise en relation entre agriculteurs</w:t>
+      </w:r>
+    </w:p>
+    <w:p>
+      <w:pPr>
+        <w:spacing w:before="0" w:after="0"/>
+        <w:ind w:left="283"/>
+        <w:shd w:val="clear" w:color="auto" w:fill="F3F4F6"/>
+      </w:pPr>
+      <w:r>
+        <w:rPr>
+          <w:rFonts w:ascii="Courier New" w:hAnsi="Courier New"/>
+          <w:color w:val="1F2D3D"/>
+          <w:sz w:val="18"/>
+        </w:rPr>
+        <w:t>sénégalais et acheteurs locaux / export...</w:t>
+      </w:r>
+    </w:p>
+    <w:p>
+      <w:pPr>
+        <w:spacing w:before="0" w:after="0"/>
+        <w:ind w:left="283"/>
+        <w:shd w:val="clear" w:color="auto" w:fill="F3F4F6"/>
+      </w:pPr>
+      <w:r>
+        <w:rPr>
+          <w:rFonts w:ascii="Courier New" w:hAnsi="Courier New"/>
+          <w:color w:val="1F2D3D"/>
+          <w:sz w:val="18"/>
+        </w:rPr>
+        <w:t xml:space="preserve"> </w:t>
+      </w:r>
+    </w:p>
+    <w:p>
+      <w:pPr>
+        <w:spacing w:before="0" w:after="0"/>
+        <w:ind w:left="283"/>
+        <w:shd w:val="clear" w:color="auto" w:fill="F3F4F6"/>
+      </w:pPr>
+      <w:r>
+        <w:rPr>
+          <w:rFonts w:ascii="Courier New" w:hAnsi="Courier New"/>
+          <w:color w:val="1F2D3D"/>
+          <w:sz w:val="18"/>
+        </w:rPr>
+        <w:t>🇸🇳 Retrouve ce projet sur DIAPALER AFRICA — la plateforme qui</w:t>
+      </w:r>
+    </w:p>
+    <w:p>
+      <w:pPr>
+        <w:spacing w:before="0" w:after="0"/>
+        <w:ind w:left="283"/>
+        <w:shd w:val="clear" w:color="auto" w:fill="F3F4F6"/>
+      </w:pPr>
+      <w:r>
+        <w:rPr>
+          <w:rFonts w:ascii="Courier New" w:hAnsi="Courier New"/>
+          <w:color w:val="1F2D3D"/>
+          <w:sz w:val="18"/>
+        </w:rPr>
+        <w:t>connecte entrepreneurs, mentors et investisseurs au Sénégal.</w:t>
+      </w:r>
+    </w:p>
+    <w:p>
+      <w:pPr>
+        <w:spacing w:before="0" w:after="0"/>
+        <w:ind w:left="283"/>
+        <w:shd w:val="clear" w:color="auto" w:fill="F3F4F6"/>
+      </w:pPr>
+      <w:r>
+        <w:rPr>
+          <w:rFonts w:ascii="Courier New" w:hAnsi="Courier New"/>
+          <w:color w:val="1F2D3D"/>
+          <w:sz w:val="18"/>
+        </w:rPr>
+        <w:t xml:space="preserve"> </w:t>
+      </w:r>
+    </w:p>
+    <w:p>
+      <w:pPr>
+        <w:spacing w:before="0" w:after="0"/>
+        <w:ind w:left="283"/>
+        <w:shd w:val="clear" w:color="auto" w:fill="F3F4F6"/>
+      </w:pPr>
+      <w:r>
+        <w:rPr>
+          <w:rFonts w:ascii="Courier New" w:hAnsi="Courier New"/>
+          <w:color w:val="1F2D3D"/>
+          <w:sz w:val="18"/>
+        </w:rPr>
+        <w:t>👉 Télécharge : https://diapalerafrica.app</w:t>
+      </w:r>
+    </w:p>
+    <w:p>
+      <w:pPr>
+        <w:spacing w:after="80"/>
+      </w:pPr>
+    </w:p>
+    <w:p>
+      <w:pPr>
+        <w:spacing w:before="200" w:after="0"/>
+        <w:ind w:left="0"/>
+        <w:shd w:val="clear" w:color="auto" w:fill="FEF3C7"/>
+        <w:pBdr>
+          <w:left w:val="single" w:sz="8" w:space="6" w:color="F59E0B"/>
+        </w:pBdr>
+      </w:pPr>
+      <w:r>
+        <w:rPr>
+          <w:rFonts w:ascii="Calibri" w:hAnsi="Calibri"/>
+          <w:b/>
+          <w:color w:val="924009"/>
+          <w:sz w:val="20"/>
+        </w:rPr>
+        <w:t>📸  📸 CAPTURE D'ÉCRAN — Feuille de partage native (WhatsApp, Facebook, Telegram…)</w:t>
+      </w:r>
+    </w:p>
+    <w:p>
+      <w:pPr>
+        <w:spacing w:before="2835" w:after="240"/>
+        <w:ind w:left="0"/>
+        <w:shd w:val="clear" w:color="auto" w:fill="F9FAFB"/>
+        <w:pBdr>
+          <w:left w:val="single" w:sz="6" w:space="6" w:color="D1D5DB"/>
+        </w:pBdr>
+      </w:pPr>
+      <w:r>
+        <w:rPr>
+          <w:rFonts w:ascii="Calibri" w:hAnsi="Calibri"/>
+          <w:i/>
+          <w:color w:val="ABB5BF"/>
+          <w:sz w:val="18"/>
+        </w:rPr>
+        <w:t>[ Insérer la capture d'écran ici ]</w:t>
+      </w:r>
+    </w:p>
+    <w:p>
+      <w:pPr>
+        <w:spacing w:before="200" w:after="0"/>
+        <w:ind w:left="0"/>
+        <w:shd w:val="clear" w:color="auto" w:fill="FEF3C7"/>
+        <w:pBdr>
+          <w:left w:val="single" w:sz="8" w:space="6" w:color="F59E0B"/>
+        </w:pBdr>
+      </w:pPr>
+      <w:r>
+        <w:rPr>
+          <w:rFonts w:ascii="Calibri" w:hAnsi="Calibri"/>
+          <w:b/>
+          <w:color w:val="924009"/>
+          <w:sz w:val="20"/>
+        </w:rPr>
+        <w:t>📸  📸 CAPTURE D'ÉCRAN — Bouton partage (icône) dans la liste des pitchs</w:t>
+      </w:r>
+    </w:p>
+    <w:p>
+      <w:pPr>
+        <w:spacing w:before="2835" w:after="240"/>
+        <w:ind w:left="0"/>
+        <w:shd w:val="clear" w:color="auto" w:fill="F9FAFB"/>
+        <w:pBdr>
+          <w:left w:val="single" w:sz="6" w:space="6" w:color="D1D5DB"/>
+        </w:pBdr>
+      </w:pPr>
+      <w:r>
+        <w:rPr>
+          <w:rFonts w:ascii="Calibri" w:hAnsi="Calibri"/>
+          <w:i/>
+          <w:color w:val="ABB5BF"/>
+          <w:sz w:val="18"/>
+        </w:rPr>
+        <w:t>[ Insérer la capture d'écran ici ]</w:t>
+      </w:r>
+    </w:p>
+    <w:p>
+      <w:pPr>
+        <w:pStyle w:val="Heading2"/>
+      </w:pPr>
+      <w:r>
+        <w:t>12. Paiement Mobile — Wave Premium</w:t>
+      </w:r>
+    </w:p>
+    <w:p>
+      <w:pPr>
+        <w:pStyle w:val="Heading3"/>
+      </w:pPr>
+      <w:r>
+        <w:t>12.1 Architecture simplifiée (lien marchand)</w:t>
+      </w:r>
+    </w:p>
+    <w:p>
+      <w:r>
+        <w:rPr>
+          <w:rFonts w:ascii="Calibri" w:hAnsi="Calibri"/>
+          <w:sz w:val="22"/>
+        </w:rPr>
+        <w:t xml:space="preserve">DIAPALER AFRICA intègre le paiement via </w:t>
+      </w:r>
+      <w:r>
+        <w:rPr>
+          <w:rFonts w:ascii="Calibri" w:hAnsi="Calibri"/>
+          <w:b/>
+          <w:sz w:val="22"/>
+        </w:rPr>
+        <w:t>Wave</w:t>
+      </w:r>
+      <w:r>
+        <w:rPr>
+          <w:rFonts w:ascii="Calibri" w:hAnsi="Calibri"/>
+          <w:sz w:val="22"/>
+        </w:rPr>
+        <w:t xml:space="preserve">, le portefeuille mobile le plus utilisé au Sénégal. L'approche choisie utilise le </w:t>
+      </w:r>
+      <w:r>
+        <w:rPr>
+          <w:rFonts w:ascii="Calibri" w:hAnsi="Calibri"/>
+          <w:b/>
+          <w:sz w:val="22"/>
+        </w:rPr>
+        <w:t>lien marchand Wave</w:t>
+      </w:r>
+      <w:r>
+        <w:rPr>
+          <w:rFonts w:ascii="Calibri" w:hAnsi="Calibri"/>
+          <w:sz w:val="22"/>
+        </w:rPr>
+        <w:t xml:space="preserve"> avec paramètre de montant dynamique — aucun backend supplémentaire nécessaire.</w:t>
+      </w:r>
+    </w:p>
+    <w:p>
+      <w:pPr>
+        <w:spacing w:before="0" w:after="0"/>
+        <w:ind w:left="283"/>
+        <w:shd w:val="clear" w:color="auto" w:fill="F3F4F6"/>
+      </w:pPr>
+      <w:r>
+        <w:rPr>
+          <w:rFonts w:ascii="Courier New" w:hAnsi="Courier New"/>
+          <w:color w:val="1F2D3D"/>
+          <w:sz w:val="18"/>
+        </w:rPr>
+        <w:t>Utilisateur → appuie "Payer avec Wave"</w:t>
+      </w:r>
+    </w:p>
+    <w:p>
+      <w:pPr>
+        <w:spacing w:before="0" w:after="0"/>
+        <w:ind w:left="283"/>
+        <w:shd w:val="clear" w:color="auto" w:fill="F3F4F6"/>
+      </w:pPr>
+      <w:r>
+        <w:rPr>
+          <w:rFonts w:ascii="Courier New" w:hAnsi="Courier New"/>
+          <w:color w:val="1F2D3D"/>
+          <w:sz w:val="18"/>
+        </w:rPr>
+        <w:t xml:space="preserve">    ↓</w:t>
+      </w:r>
+    </w:p>
+    <w:p>
+      <w:pPr>
+        <w:spacing w:before="0" w:after="0"/>
+        <w:ind w:left="283"/>
+        <w:shd w:val="clear" w:color="auto" w:fill="F3F4F6"/>
+      </w:pPr>
+      <w:r>
+        <w:rPr>
+          <w:rFonts w:ascii="Courier New" w:hAnsi="Courier New"/>
+          <w:color w:val="1F2D3D"/>
+          <w:sz w:val="18"/>
+        </w:rPr>
+        <w:t>url_launcher → ouvre https://pay.wave.com/m/M_sn_tH1ZQo00ZVko/c/sn/?amount=7500</w:t>
+      </w:r>
+    </w:p>
+    <w:p>
+      <w:pPr>
+        <w:spacing w:before="0" w:after="0"/>
+        <w:ind w:left="283"/>
+        <w:shd w:val="clear" w:color="auto" w:fill="F3F4F6"/>
+      </w:pPr>
+      <w:r>
+        <w:rPr>
+          <w:rFonts w:ascii="Courier New" w:hAnsi="Courier New"/>
+          <w:color w:val="1F2D3D"/>
+          <w:sz w:val="18"/>
+        </w:rPr>
+        <w:t xml:space="preserve">    ↓</w:t>
+      </w:r>
+    </w:p>
+    <w:p>
+      <w:pPr>
+        <w:spacing w:before="0" w:after="0"/>
+        <w:ind w:left="283"/>
+        <w:shd w:val="clear" w:color="auto" w:fill="F3F4F6"/>
+      </w:pPr>
+      <w:r>
+        <w:rPr>
+          <w:rFonts w:ascii="Courier New" w:hAnsi="Courier New"/>
+          <w:color w:val="1F2D3D"/>
+          <w:sz w:val="18"/>
+        </w:rPr>
+        <w:t>App Wave (ou navigateur) → utilisateur confirme le paiement</w:t>
+      </w:r>
+    </w:p>
+    <w:p>
+      <w:pPr>
+        <w:spacing w:before="0" w:after="0"/>
+        <w:ind w:left="283"/>
+        <w:shd w:val="clear" w:color="auto" w:fill="F3F4F6"/>
+      </w:pPr>
+      <w:r>
+        <w:rPr>
+          <w:rFonts w:ascii="Courier New" w:hAnsi="Courier New"/>
+          <w:color w:val="1F2D3D"/>
+          <w:sz w:val="18"/>
+        </w:rPr>
+        <w:t xml:space="preserve">    ↓</w:t>
+      </w:r>
+    </w:p>
+    <w:p>
+      <w:pPr>
+        <w:spacing w:before="0" w:after="0"/>
+        <w:ind w:left="283"/>
+        <w:shd w:val="clear" w:color="auto" w:fill="F3F4F6"/>
+      </w:pPr>
+      <w:r>
+        <w:rPr>
+          <w:rFonts w:ascii="Courier New" w:hAnsi="Courier New"/>
+          <w:color w:val="1F2D3D"/>
+          <w:sz w:val="18"/>
+        </w:rPr>
+        <w:t>Revient dans DIAPALER AFRICA → clique "J'ai payé"</w:t>
+      </w:r>
+    </w:p>
+    <w:p>
+      <w:pPr>
+        <w:spacing w:before="0" w:after="0"/>
+        <w:ind w:left="283"/>
+        <w:shd w:val="clear" w:color="auto" w:fill="F3F4F6"/>
+      </w:pPr>
+      <w:r>
+        <w:rPr>
+          <w:rFonts w:ascii="Courier New" w:hAnsi="Courier New"/>
+          <w:color w:val="1F2D3D"/>
+          <w:sz w:val="18"/>
+        </w:rPr>
+        <w:t xml:space="preserve">    ↓</w:t>
+      </w:r>
+    </w:p>
+    <w:p>
+      <w:pPr>
+        <w:spacing w:before="0" w:after="0"/>
+        <w:ind w:left="283"/>
+        <w:shd w:val="clear" w:color="auto" w:fill="F3F4F6"/>
+      </w:pPr>
+      <w:r>
+        <w:rPr>
+          <w:rFonts w:ascii="Courier New" w:hAnsi="Courier New"/>
+          <w:color w:val="1F2D3D"/>
+          <w:sz w:val="18"/>
+        </w:rPr>
+        <w:t>Firebase → users/{uid}/isPremium = true</w:t>
+      </w:r>
+    </w:p>
+    <w:p>
+      <w:pPr>
+        <w:spacing w:after="80"/>
+      </w:pPr>
+    </w:p>
+    <w:p>
+      <w:r>
+        <w:rPr>
+          <w:rFonts w:ascii="Calibri" w:hAnsi="Calibri"/>
+          <w:b/>
+          <w:sz w:val="22"/>
+        </w:rPr>
+        <w:t>Avantages :</w:t>
+      </w:r>
+    </w:p>
+    <w:p>
+      <w:pPr>
+        <w:pStyle w:val="ListBullet"/>
+      </w:pPr>
+      <w:r>
+        <w:rPr>
+          <w:rFonts w:ascii="Calibri" w:hAnsi="Calibri"/>
+          <w:sz w:val="22"/>
+        </w:rPr>
+        <w:t>Pas de clé API côté client (sécurité maximale)</w:t>
+      </w:r>
+    </w:p>
+    <w:p>
+      <w:pPr>
+        <w:pStyle w:val="ListBullet"/>
+      </w:pPr>
+      <w:r>
+        <w:rPr>
+          <w:rFonts w:ascii="Calibri" w:hAnsi="Calibri"/>
+          <w:sz w:val="22"/>
+        </w:rPr>
+        <w:t>Pas de backend/webhook requis pour la démo</w:t>
+      </w:r>
+    </w:p>
+    <w:p>
+      <w:pPr>
+        <w:pStyle w:val="ListBullet"/>
+      </w:pPr>
+      <w:r>
+        <w:rPr>
+          <w:rFonts w:ascii="Calibri" w:hAnsi="Calibri"/>
+          <w:sz w:val="22"/>
+        </w:rPr>
+        <w:t>Fonctionne avec l'app Wave installée ou le navigateur</w:t>
+      </w:r>
+    </w:p>
+    <w:p>
+      <w:pPr>
+        <w:pStyle w:val="ListBullet"/>
+      </w:pPr>
+      <w:r>
+        <w:rPr>
+          <w:rFonts w:ascii="Calibri" w:hAnsi="Calibri"/>
+          <w:sz w:val="22"/>
+        </w:rPr>
+        <w:t>Montant pré-rempli automatiquement selon le plan choisi</w:t>
+      </w:r>
+    </w:p>
+    <w:p>
+      <w:pPr>
+        <w:pStyle w:val="Heading3"/>
+      </w:pPr>
+      <w:r>
+        <w:t>12.2 Plans d'abonnement</w:t>
+      </w:r>
+    </w:p>
+    <w:tbl>
+      <w:tblPr>
+        <w:tblStyle w:val="TableGrid"/>
+        <w:tblW w:type="auto" w:w="0"/>
+        <w:tblLook w:firstColumn="1" w:firstRow="1" w:lastColumn="0" w:lastRow="0" w:noHBand="0" w:noVBand="1" w:val="04A0"/>
+      </w:tblPr>
+      <w:tblGrid>
+        <w:gridCol w:w="3135"/>
+        <w:gridCol w:w="3135"/>
+        <w:gridCol w:w="3135"/>
+      </w:tblGrid>
+      <w:tr>
+        <w:tc>
+          <w:tcPr>
+            <w:tcW w:type="dxa" w:w="3135"/>
+            <w:shd w:val="clear" w:color="auto" w:fill="1E3A8A"/>
+          </w:tcPr>
+          <w:p>
+            <w:r>
+              <w:rPr>
+                <w:rFonts w:ascii="Calibri" w:hAnsi="Calibri"/>
+                <w:b/>
+                <w:color w:val="FFFFFF"/>
+                <w:sz w:val="20"/>
+              </w:rPr>
+              <w:t>Plan</w:t>
+            </w:r>
+          </w:p>
+        </w:tc>
+        <w:tc>
+          <w:tcPr>
+            <w:tcW w:type="dxa" w:w="3135"/>
+            <w:shd w:val="clear" w:color="auto" w:fill="1E3A8A"/>
+          </w:tcPr>
+          <w:p>
+            <w:r>
+              <w:rPr>
+                <w:rFonts w:ascii="Calibri" w:hAnsi="Calibri"/>
+                <w:b/>
+                <w:color w:val="FFFFFF"/>
+                <w:sz w:val="20"/>
+              </w:rPr>
+              <w:t>Tarif / mois</w:t>
+            </w:r>
+          </w:p>
+        </w:tc>
+        <w:tc>
+          <w:tcPr>
+            <w:tcW w:type="dxa" w:w="3135"/>
+            <w:shd w:val="clear" w:color="auto" w:fill="1E3A8A"/>
+          </w:tcPr>
+          <w:p>
+            <w:r>
+              <w:rPr>
+                <w:rFonts w:ascii="Calibri" w:hAnsi="Calibri"/>
+                <w:b/>
+                <w:color w:val="FFFFFF"/>
+                <w:sz w:val="20"/>
+              </w:rPr>
+              <w:t>Avantages</w:t>
+            </w:r>
+          </w:p>
+        </w:tc>
+      </w:tr>
+      <w:tr>
+        <w:tc>
+          <w:tcPr>
+            <w:tcW w:type="dxa" w:w="3135"/>
+            <w:shd w:val="clear" w:color="auto" w:fill="EFF6FF"/>
+          </w:tcPr>
+          <w:p>
+            <w:r>
+              <w:rPr>
+                <w:rFonts w:ascii="Calibri" w:hAnsi="Calibri"/>
+                <w:b/>
+                <w:sz w:val="20"/>
+              </w:rPr>
+              <w:t>Entrepreneur Premium</w:t>
+            </w:r>
+          </w:p>
+        </w:tc>
+        <w:tc>
+          <w:tcPr>
+            <w:tcW w:type="dxa" w:w="3135"/>
+            <w:shd w:val="clear" w:color="auto" w:fill="EFF6FF"/>
+          </w:tcPr>
+          <w:p>
+            <w:r>
+              <w:rPr>
+                <w:rFonts w:ascii="Calibri" w:hAnsi="Calibri"/>
+                <w:sz w:val="20"/>
+              </w:rPr>
+              <w:t>7 500 FCFA</w:t>
+            </w:r>
+          </w:p>
+        </w:tc>
+        <w:tc>
+          <w:tcPr>
+            <w:tcW w:type="dxa" w:w="3135"/>
+            <w:shd w:val="clear" w:color="auto" w:fill="EFF6FF"/>
+          </w:tcPr>
+          <w:p>
+            <w:r>
+              <w:rPr>
+                <w:rFonts w:ascii="Calibri" w:hAnsi="Calibri"/>
+                <w:sz w:val="20"/>
+              </w:rPr>
+              <w:t>Pitch épinglé, badge ⭐, demandes illimitées, stats de vues</w:t>
+            </w:r>
+          </w:p>
+        </w:tc>
+      </w:tr>
+      <w:tr>
+        <w:tc>
+          <w:tcPr>
+            <w:tcW w:type="dxa" w:w="3135"/>
+          </w:tcPr>
+          <w:p>
+            <w:r>
+              <w:rPr>
+                <w:rFonts w:ascii="Calibri" w:hAnsi="Calibri"/>
+                <w:b/>
+                <w:sz w:val="20"/>
+              </w:rPr>
+              <w:t>Mentor Certifié</w:t>
+            </w:r>
+          </w:p>
+        </w:tc>
+        <w:tc>
+          <w:tcPr>
+            <w:tcW w:type="dxa" w:w="3135"/>
+          </w:tcPr>
+          <w:p>
+            <w:r>
+              <w:rPr>
+                <w:rFonts w:ascii="Calibri" w:hAnsi="Calibri"/>
+                <w:sz w:val="20"/>
+              </w:rPr>
+              <w:t>5 000 FCFA</w:t>
+            </w:r>
+          </w:p>
+        </w:tc>
+        <w:tc>
+          <w:tcPr>
+            <w:tcW w:type="dxa" w:w="3135"/>
+          </w:tcPr>
+          <w:p>
+            <w:r>
+              <w:rPr>
+                <w:rFonts w:ascii="Calibri" w:hAnsi="Calibri"/>
+                <w:sz w:val="20"/>
+              </w:rPr>
+              <w:t>Filtres avancés pitchs, badge ✅, suivi mentorés</w:t>
+            </w:r>
+          </w:p>
+        </w:tc>
+      </w:tr>
+      <w:tr>
+        <w:tc>
+          <w:tcPr>
+            <w:tcW w:type="dxa" w:w="3135"/>
+            <w:shd w:val="clear" w:color="auto" w:fill="EFF6FF"/>
+          </w:tcPr>
+          <w:p>
+            <w:r>
+              <w:rPr>
+                <w:rFonts w:ascii="Calibri" w:hAnsi="Calibri"/>
+                <w:b/>
+                <w:sz w:val="20"/>
+              </w:rPr>
+              <w:t>Investisseur Vérifié</w:t>
+            </w:r>
+          </w:p>
+        </w:tc>
+        <w:tc>
+          <w:tcPr>
+            <w:tcW w:type="dxa" w:w="3135"/>
+            <w:shd w:val="clear" w:color="auto" w:fill="EFF6FF"/>
+          </w:tcPr>
+          <w:p>
+            <w:r>
+              <w:rPr>
+                <w:rFonts w:ascii="Calibri" w:hAnsi="Calibri"/>
+                <w:sz w:val="20"/>
+              </w:rPr>
+              <w:t>15 000 FCFA</w:t>
+            </w:r>
+          </w:p>
+        </w:tc>
+        <w:tc>
+          <w:tcPr>
+            <w:tcW w:type="dxa" w:w="3135"/>
+            <w:shd w:val="clear" w:color="auto" w:fill="EFF6FF"/>
+          </w:tcPr>
+          <w:p>
+            <w:r>
+              <w:rPr>
+                <w:rFonts w:ascii="Calibri" w:hAnsi="Calibri"/>
+                <w:sz w:val="20"/>
+              </w:rPr>
+              <w:t>Pitchs complets, alertes secteur, badge 💎</w:t>
+            </w:r>
+          </w:p>
+        </w:tc>
+      </w:tr>
+    </w:tbl>
+    <w:p>
+      <w:pPr>
+        <w:spacing w:after="120"/>
+      </w:pPr>
+    </w:p>
+    <w:p>
+      <w:pPr>
+        <w:pStyle w:val="Heading3"/>
+      </w:pPr>
+      <w:r>
+        <w:t>12.3 Implémentation — `ServiceWave`</w:t>
+      </w:r>
+    </w:p>
+    <w:p>
+      <w:r>
+        <w:rPr>
+          <w:rFonts w:ascii="Calibri" w:hAnsi="Calibri"/>
+          <w:b/>
+          <w:sz w:val="22"/>
+        </w:rPr>
+        <w:t>Fichier :</w:t>
+      </w:r>
+      <w:r>
+        <w:rPr>
+          <w:rFonts w:ascii="Calibri" w:hAnsi="Calibri"/>
+          <w:sz w:val="22"/>
+        </w:rPr>
+        <w:t xml:space="preserve"> </w:t>
+      </w:r>
+      <w:r>
+        <w:rPr>
+          <w:rFonts w:ascii="Courier New" w:hAnsi="Courier New"/>
+          <w:color w:val="DC2626"/>
+          <w:sz w:val="20"/>
+        </w:rPr>
+        <w:t>lib/services/service_wave.dart</w:t>
+      </w:r>
+    </w:p>
+    <w:p>
+      <w:pPr>
+        <w:spacing w:before="0" w:after="0"/>
+        <w:ind w:left="283"/>
+        <w:shd w:val="clear" w:color="auto" w:fill="F3F4F6"/>
+      </w:pPr>
+      <w:r>
+        <w:rPr>
+          <w:rFonts w:ascii="Courier New" w:hAnsi="Courier New"/>
+          <w:color w:val="1F2D3D"/>
+          <w:sz w:val="18"/>
+        </w:rPr>
+        <w:t>const _waveBaseUrl = 'https://pay.wave.com/m/M_sn_tH1ZQo00ZVko/c/sn/';</w:t>
+      </w:r>
+    </w:p>
+    <w:p>
+      <w:pPr>
+        <w:spacing w:before="0" w:after="0"/>
+        <w:ind w:left="283"/>
+        <w:shd w:val="clear" w:color="auto" w:fill="F3F4F6"/>
+      </w:pPr>
+      <w:r>
+        <w:rPr>
+          <w:rFonts w:ascii="Courier New" w:hAnsi="Courier New"/>
+          <w:color w:val="1F2D3D"/>
+          <w:sz w:val="18"/>
+        </w:rPr>
+        <w:t xml:space="preserve"> </w:t>
+      </w:r>
+    </w:p>
+    <w:p>
+      <w:pPr>
+        <w:spacing w:before="0" w:after="0"/>
+        <w:ind w:left="283"/>
+        <w:shd w:val="clear" w:color="auto" w:fill="F3F4F6"/>
+      </w:pPr>
+      <w:r>
+        <w:rPr>
+          <w:rFonts w:ascii="Courier New" w:hAnsi="Courier New"/>
+          <w:color w:val="1F2D3D"/>
+          <w:sz w:val="18"/>
+        </w:rPr>
+        <w:t>enum PremiumPlan {</w:t>
+      </w:r>
+    </w:p>
+    <w:p>
+      <w:pPr>
+        <w:spacing w:before="0" w:after="0"/>
+        <w:ind w:left="283"/>
+        <w:shd w:val="clear" w:color="auto" w:fill="F3F4F6"/>
+      </w:pPr>
+      <w:r>
+        <w:rPr>
+          <w:rFonts w:ascii="Courier New" w:hAnsi="Courier New"/>
+          <w:color w:val="1F2D3D"/>
+          <w:sz w:val="18"/>
+        </w:rPr>
+        <w:t xml:space="preserve">  entrepreneur, mentor, investisseur;</w:t>
+      </w:r>
+    </w:p>
+    <w:p>
+      <w:pPr>
+        <w:spacing w:before="0" w:after="0"/>
+        <w:ind w:left="283"/>
+        <w:shd w:val="clear" w:color="auto" w:fill="F3F4F6"/>
+      </w:pPr>
+      <w:r>
+        <w:rPr>
+          <w:rFonts w:ascii="Courier New" w:hAnsi="Courier New"/>
+          <w:color w:val="1F2D3D"/>
+          <w:sz w:val="18"/>
+        </w:rPr>
+        <w:t xml:space="preserve"> </w:t>
+      </w:r>
+    </w:p>
+    <w:p>
+      <w:pPr>
+        <w:spacing w:before="0" w:after="0"/>
+        <w:ind w:left="283"/>
+        <w:shd w:val="clear" w:color="auto" w:fill="F3F4F6"/>
+      </w:pPr>
+      <w:r>
+        <w:rPr>
+          <w:rFonts w:ascii="Courier New" w:hAnsi="Courier New"/>
+          <w:color w:val="1F2D3D"/>
+          <w:sz w:val="18"/>
+        </w:rPr>
+        <w:t xml:space="preserve">  int get amountXof =&gt; switch (this) {</w:t>
+      </w:r>
+    </w:p>
+    <w:p>
+      <w:pPr>
+        <w:spacing w:before="0" w:after="0"/>
+        <w:ind w:left="283"/>
+        <w:shd w:val="clear" w:color="auto" w:fill="F3F4F6"/>
+      </w:pPr>
+      <w:r>
+        <w:rPr>
+          <w:rFonts w:ascii="Courier New" w:hAnsi="Courier New"/>
+          <w:color w:val="1F2D3D"/>
+          <w:sz w:val="18"/>
+        </w:rPr>
+        <w:t xml:space="preserve">    PremiumPlan.entrepreneur =&gt; 7500,</w:t>
+      </w:r>
+    </w:p>
+    <w:p>
+      <w:pPr>
+        <w:spacing w:before="0" w:after="0"/>
+        <w:ind w:left="283"/>
+        <w:shd w:val="clear" w:color="auto" w:fill="F3F4F6"/>
+      </w:pPr>
+      <w:r>
+        <w:rPr>
+          <w:rFonts w:ascii="Courier New" w:hAnsi="Courier New"/>
+          <w:color w:val="1F2D3D"/>
+          <w:sz w:val="18"/>
+        </w:rPr>
+        <w:t xml:space="preserve">    PremiumPlan.mentor       =&gt; 5000,</w:t>
+      </w:r>
+    </w:p>
+    <w:p>
+      <w:pPr>
+        <w:spacing w:before="0" w:after="0"/>
+        <w:ind w:left="283"/>
+        <w:shd w:val="clear" w:color="auto" w:fill="F3F4F6"/>
+      </w:pPr>
+      <w:r>
+        <w:rPr>
+          <w:rFonts w:ascii="Courier New" w:hAnsi="Courier New"/>
+          <w:color w:val="1F2D3D"/>
+          <w:sz w:val="18"/>
+        </w:rPr>
+        <w:t xml:space="preserve">    PremiumPlan.investisseur =&gt; 15000,</w:t>
+      </w:r>
+    </w:p>
+    <w:p>
+      <w:pPr>
+        <w:spacing w:before="0" w:after="0"/>
+        <w:ind w:left="283"/>
+        <w:shd w:val="clear" w:color="auto" w:fill="F3F4F6"/>
+      </w:pPr>
+      <w:r>
+        <w:rPr>
+          <w:rFonts w:ascii="Courier New" w:hAnsi="Courier New"/>
+          <w:color w:val="1F2D3D"/>
+          <w:sz w:val="18"/>
+        </w:rPr>
+        <w:t xml:space="preserve">  };</w:t>
+      </w:r>
+    </w:p>
+    <w:p>
+      <w:pPr>
+        <w:spacing w:before="0" w:after="0"/>
+        <w:ind w:left="283"/>
+        <w:shd w:val="clear" w:color="auto" w:fill="F3F4F6"/>
+      </w:pPr>
+      <w:r>
+        <w:rPr>
+          <w:rFonts w:ascii="Courier New" w:hAnsi="Courier New"/>
+          <w:color w:val="1F2D3D"/>
+          <w:sz w:val="18"/>
+        </w:rPr>
+        <w:t xml:space="preserve"> </w:t>
+      </w:r>
+    </w:p>
+    <w:p>
+      <w:pPr>
+        <w:spacing w:before="0" w:after="0"/>
+        <w:ind w:left="283"/>
+        <w:shd w:val="clear" w:color="auto" w:fill="F3F4F6"/>
+      </w:pPr>
+      <w:r>
+        <w:rPr>
+          <w:rFonts w:ascii="Courier New" w:hAnsi="Courier New"/>
+          <w:color w:val="1F2D3D"/>
+          <w:sz w:val="18"/>
+        </w:rPr>
+        <w:t xml:space="preserve">  /// URL Wave avec montant pré-rempli</w:t>
+      </w:r>
+    </w:p>
+    <w:p>
+      <w:pPr>
+        <w:spacing w:before="0" w:after="0"/>
+        <w:ind w:left="283"/>
+        <w:shd w:val="clear" w:color="auto" w:fill="F3F4F6"/>
+      </w:pPr>
+      <w:r>
+        <w:rPr>
+          <w:rFonts w:ascii="Courier New" w:hAnsi="Courier New"/>
+          <w:color w:val="1F2D3D"/>
+          <w:sz w:val="18"/>
+        </w:rPr>
+        <w:t xml:space="preserve">  String get waveUrl =&gt;</w:t>
+      </w:r>
+    </w:p>
+    <w:p>
+      <w:pPr>
+        <w:spacing w:before="0" w:after="0"/>
+        <w:ind w:left="283"/>
+        <w:shd w:val="clear" w:color="auto" w:fill="F3F4F6"/>
+      </w:pPr>
+      <w:r>
+        <w:rPr>
+          <w:rFonts w:ascii="Courier New" w:hAnsi="Courier New"/>
+          <w:color w:val="1F2D3D"/>
+          <w:sz w:val="18"/>
+        </w:rPr>
+        <w:t xml:space="preserve">      '$_waveBaseUrl?amount=$amountXof'</w:t>
+      </w:r>
+    </w:p>
+    <w:p>
+      <w:pPr>
+        <w:spacing w:before="0" w:after="0"/>
+        <w:ind w:left="283"/>
+        <w:shd w:val="clear" w:color="auto" w:fill="F3F4F6"/>
+      </w:pPr>
+      <w:r>
+        <w:rPr>
+          <w:rFonts w:ascii="Courier New" w:hAnsi="Courier New"/>
+          <w:color w:val="1F2D3D"/>
+          <w:sz w:val="18"/>
+        </w:rPr>
+        <w:t xml:space="preserve">      '&amp;label=Abonnement+Premium+DIAPALER+AFRICA';</w:t>
+      </w:r>
+    </w:p>
+    <w:p>
+      <w:pPr>
+        <w:spacing w:before="0" w:after="0"/>
+        <w:ind w:left="283"/>
+        <w:shd w:val="clear" w:color="auto" w:fill="F3F4F6"/>
+      </w:pPr>
+      <w:r>
+        <w:rPr>
+          <w:rFonts w:ascii="Courier New" w:hAnsi="Courier New"/>
+          <w:color w:val="1F2D3D"/>
+          <w:sz w:val="18"/>
+        </w:rPr>
+        <w:t>}</w:t>
+      </w:r>
+    </w:p>
+    <w:p>
+      <w:pPr>
+        <w:spacing w:before="0" w:after="0"/>
+        <w:ind w:left="283"/>
+        <w:shd w:val="clear" w:color="auto" w:fill="F3F4F6"/>
+      </w:pPr>
+      <w:r>
+        <w:rPr>
+          <w:rFonts w:ascii="Courier New" w:hAnsi="Courier New"/>
+          <w:color w:val="1F2D3D"/>
+          <w:sz w:val="18"/>
+        </w:rPr>
+        <w:t xml:space="preserve"> </w:t>
+      </w:r>
+    </w:p>
+    <w:p>
+      <w:pPr>
+        <w:spacing w:before="0" w:after="0"/>
+        <w:ind w:left="283"/>
+        <w:shd w:val="clear" w:color="auto" w:fill="F3F4F6"/>
+      </w:pPr>
+      <w:r>
+        <w:rPr>
+          <w:rFonts w:ascii="Courier New" w:hAnsi="Courier New"/>
+          <w:color w:val="1F2D3D"/>
+          <w:sz w:val="18"/>
+        </w:rPr>
+        <w:t>class WaveService {</w:t>
+      </w:r>
+    </w:p>
+    <w:p>
+      <w:pPr>
+        <w:spacing w:before="0" w:after="0"/>
+        <w:ind w:left="283"/>
+        <w:shd w:val="clear" w:color="auto" w:fill="F3F4F6"/>
+      </w:pPr>
+      <w:r>
+        <w:rPr>
+          <w:rFonts w:ascii="Courier New" w:hAnsi="Courier New"/>
+          <w:color w:val="1F2D3D"/>
+          <w:sz w:val="18"/>
+        </w:rPr>
+        <w:t xml:space="preserve">  /// Ouvre l'app Wave avec le montant pré-rempli.</w:t>
+      </w:r>
+    </w:p>
+    <w:p>
+      <w:pPr>
+        <w:spacing w:before="0" w:after="0"/>
+        <w:ind w:left="283"/>
+        <w:shd w:val="clear" w:color="auto" w:fill="F3F4F6"/>
+      </w:pPr>
+      <w:r>
+        <w:rPr>
+          <w:rFonts w:ascii="Courier New" w:hAnsi="Courier New"/>
+          <w:color w:val="1F2D3D"/>
+          <w:sz w:val="18"/>
+        </w:rPr>
+        <w:t xml:space="preserve">  static Future&lt;void&gt; openPayment(PremiumPlan plan) async {</w:t>
+      </w:r>
+    </w:p>
+    <w:p>
+      <w:pPr>
+        <w:spacing w:before="0" w:after="0"/>
+        <w:ind w:left="283"/>
+        <w:shd w:val="clear" w:color="auto" w:fill="F3F4F6"/>
+      </w:pPr>
+      <w:r>
+        <w:rPr>
+          <w:rFonts w:ascii="Courier New" w:hAnsi="Courier New"/>
+          <w:color w:val="1F2D3D"/>
+          <w:sz w:val="18"/>
+        </w:rPr>
+        <w:t xml:space="preserve">    final uri = Uri.parse(plan.waveUrl);</w:t>
+      </w:r>
+    </w:p>
+    <w:p>
+      <w:pPr>
+        <w:spacing w:before="0" w:after="0"/>
+        <w:ind w:left="283"/>
+        <w:shd w:val="clear" w:color="auto" w:fill="F3F4F6"/>
+      </w:pPr>
+      <w:r>
+        <w:rPr>
+          <w:rFonts w:ascii="Courier New" w:hAnsi="Courier New"/>
+          <w:color w:val="1F2D3D"/>
+          <w:sz w:val="18"/>
+        </w:rPr>
+        <w:t xml:space="preserve">    if (await canLaunchUrl(uri)) {</w:t>
+      </w:r>
+    </w:p>
+    <w:p>
+      <w:pPr>
+        <w:spacing w:before="0" w:after="0"/>
+        <w:ind w:left="283"/>
+        <w:shd w:val="clear" w:color="auto" w:fill="F3F4F6"/>
+      </w:pPr>
+      <w:r>
+        <w:rPr>
+          <w:rFonts w:ascii="Courier New" w:hAnsi="Courier New"/>
+          <w:color w:val="1F2D3D"/>
+          <w:sz w:val="18"/>
+        </w:rPr>
+        <w:t xml:space="preserve">      await launchUrl(uri, mode: LaunchMode.externalApplication);</w:t>
+      </w:r>
+    </w:p>
+    <w:p>
+      <w:pPr>
+        <w:spacing w:before="0" w:after="0"/>
+        <w:ind w:left="283"/>
+        <w:shd w:val="clear" w:color="auto" w:fill="F3F4F6"/>
+      </w:pPr>
+      <w:r>
+        <w:rPr>
+          <w:rFonts w:ascii="Courier New" w:hAnsi="Courier New"/>
+          <w:color w:val="1F2D3D"/>
+          <w:sz w:val="18"/>
+        </w:rPr>
+        <w:t xml:space="preserve">    } else {</w:t>
+      </w:r>
+    </w:p>
+    <w:p>
+      <w:pPr>
+        <w:spacing w:before="0" w:after="0"/>
+        <w:ind w:left="283"/>
+        <w:shd w:val="clear" w:color="auto" w:fill="F3F4F6"/>
+      </w:pPr>
+      <w:r>
+        <w:rPr>
+          <w:rFonts w:ascii="Courier New" w:hAnsi="Courier New"/>
+          <w:color w:val="1F2D3D"/>
+          <w:sz w:val="18"/>
+        </w:rPr>
+        <w:t xml:space="preserve">      throw Exception('Impossible d\'ouvrir Wave.');</w:t>
+      </w:r>
+    </w:p>
+    <w:p>
+      <w:pPr>
+        <w:spacing w:before="0" w:after="0"/>
+        <w:ind w:left="283"/>
+        <w:shd w:val="clear" w:color="auto" w:fill="F3F4F6"/>
+      </w:pPr>
+      <w:r>
+        <w:rPr>
+          <w:rFonts w:ascii="Courier New" w:hAnsi="Courier New"/>
+          <w:color w:val="1F2D3D"/>
+          <w:sz w:val="18"/>
+        </w:rPr>
+        <w:t xml:space="preserve">    }</w:t>
+      </w:r>
+    </w:p>
+    <w:p>
+      <w:pPr>
+        <w:spacing w:before="0" w:after="0"/>
+        <w:ind w:left="283"/>
+        <w:shd w:val="clear" w:color="auto" w:fill="F3F4F6"/>
+      </w:pPr>
+      <w:r>
+        <w:rPr>
+          <w:rFonts w:ascii="Courier New" w:hAnsi="Courier New"/>
+          <w:color w:val="1F2D3D"/>
+          <w:sz w:val="18"/>
+        </w:rPr>
+        <w:t xml:space="preserve">  }</w:t>
+      </w:r>
+    </w:p>
+    <w:p>
+      <w:pPr>
+        <w:spacing w:before="0" w:after="0"/>
+        <w:ind w:left="283"/>
+        <w:shd w:val="clear" w:color="auto" w:fill="F3F4F6"/>
+      </w:pPr>
+      <w:r>
+        <w:rPr>
+          <w:rFonts w:ascii="Courier New" w:hAnsi="Courier New"/>
+          <w:color w:val="1F2D3D"/>
+          <w:sz w:val="18"/>
+        </w:rPr>
+        <w:t xml:space="preserve"> </w:t>
+      </w:r>
+    </w:p>
+    <w:p>
+      <w:pPr>
+        <w:spacing w:before="0" w:after="0"/>
+        <w:ind w:left="283"/>
+        <w:shd w:val="clear" w:color="auto" w:fill="F3F4F6"/>
+      </w:pPr>
+      <w:r>
+        <w:rPr>
+          <w:rFonts w:ascii="Courier New" w:hAnsi="Courier New"/>
+          <w:color w:val="1F2D3D"/>
+          <w:sz w:val="18"/>
+        </w:rPr>
+        <w:t xml:space="preserve">  /// Marque l'utilisateur Premium dans Firebase après confirmation.</w:t>
+      </w:r>
+    </w:p>
+    <w:p>
+      <w:pPr>
+        <w:spacing w:before="0" w:after="0"/>
+        <w:ind w:left="283"/>
+        <w:shd w:val="clear" w:color="auto" w:fill="F3F4F6"/>
+      </w:pPr>
+      <w:r>
+        <w:rPr>
+          <w:rFonts w:ascii="Courier New" w:hAnsi="Courier New"/>
+          <w:color w:val="1F2D3D"/>
+          <w:sz w:val="18"/>
+        </w:rPr>
+        <w:t xml:space="preserve">  static Future&lt;void&gt; activatePremium(PremiumPlan plan) async {</w:t>
+      </w:r>
+    </w:p>
+    <w:p>
+      <w:pPr>
+        <w:spacing w:before="0" w:after="0"/>
+        <w:ind w:left="283"/>
+        <w:shd w:val="clear" w:color="auto" w:fill="F3F4F6"/>
+      </w:pPr>
+      <w:r>
+        <w:rPr>
+          <w:rFonts w:ascii="Courier New" w:hAnsi="Courier New"/>
+          <w:color w:val="1F2D3D"/>
+          <w:sz w:val="18"/>
+        </w:rPr>
+        <w:t xml:space="preserve">    final uid = AuthService.currentUid;</w:t>
+      </w:r>
+    </w:p>
+    <w:p>
+      <w:pPr>
+        <w:spacing w:before="0" w:after="0"/>
+        <w:ind w:left="283"/>
+        <w:shd w:val="clear" w:color="auto" w:fill="F3F4F6"/>
+      </w:pPr>
+      <w:r>
+        <w:rPr>
+          <w:rFonts w:ascii="Courier New" w:hAnsi="Courier New"/>
+          <w:color w:val="1F2D3D"/>
+          <w:sz w:val="18"/>
+        </w:rPr>
+        <w:t xml:space="preserve">    if (uid == null) return;</w:t>
+      </w:r>
+    </w:p>
+    <w:p>
+      <w:pPr>
+        <w:spacing w:before="0" w:after="0"/>
+        <w:ind w:left="283"/>
+        <w:shd w:val="clear" w:color="auto" w:fill="F3F4F6"/>
+      </w:pPr>
+      <w:r>
+        <w:rPr>
+          <w:rFonts w:ascii="Courier New" w:hAnsi="Courier New"/>
+          <w:color w:val="1F2D3D"/>
+          <w:sz w:val="18"/>
+        </w:rPr>
+        <w:t xml:space="preserve">    await DatabaseService.setPremium(uid: uid, plan: plan.name);</w:t>
+      </w:r>
+    </w:p>
+    <w:p>
+      <w:pPr>
+        <w:spacing w:before="0" w:after="0"/>
+        <w:ind w:left="283"/>
+        <w:shd w:val="clear" w:color="auto" w:fill="F3F4F6"/>
+      </w:pPr>
+      <w:r>
+        <w:rPr>
+          <w:rFonts w:ascii="Courier New" w:hAnsi="Courier New"/>
+          <w:color w:val="1F2D3D"/>
+          <w:sz w:val="18"/>
+        </w:rPr>
+        <w:t xml:space="preserve">  }</w:t>
+      </w:r>
+    </w:p>
+    <w:p>
+      <w:pPr>
+        <w:spacing w:before="0" w:after="0"/>
+        <w:ind w:left="283"/>
+        <w:shd w:val="clear" w:color="auto" w:fill="F3F4F6"/>
+      </w:pPr>
+      <w:r>
+        <w:rPr>
+          <w:rFonts w:ascii="Courier New" w:hAnsi="Courier New"/>
+          <w:color w:val="1F2D3D"/>
+          <w:sz w:val="18"/>
+        </w:rPr>
+        <w:t>}</w:t>
+      </w:r>
+    </w:p>
+    <w:p>
+      <w:pPr>
+        <w:spacing w:after="80"/>
+      </w:pPr>
+    </w:p>
+    <w:p>
+      <w:r>
+        <w:rPr>
+          <w:rFonts w:ascii="Calibri" w:hAnsi="Calibri"/>
+          <w:b/>
+          <w:sz w:val="22"/>
+        </w:rPr>
+        <w:t>Nœud Firebase activé lors du paiement :</w:t>
+      </w:r>
+    </w:p>
+    <w:p>
+      <w:pPr>
+        <w:spacing w:before="0" w:after="0"/>
+        <w:ind w:left="283"/>
+        <w:shd w:val="clear" w:color="auto" w:fill="F3F4F6"/>
+      </w:pPr>
+      <w:r>
+        <w:rPr>
+          <w:rFonts w:ascii="Courier New" w:hAnsi="Courier New"/>
+          <w:color w:val="1F2D3D"/>
+          <w:sz w:val="18"/>
+        </w:rPr>
+        <w:t>// lib/services/service_base_de_donnees.dart</w:t>
+      </w:r>
+    </w:p>
+    <w:p>
+      <w:pPr>
+        <w:spacing w:before="0" w:after="0"/>
+        <w:ind w:left="283"/>
+        <w:shd w:val="clear" w:color="auto" w:fill="F3F4F6"/>
+      </w:pPr>
+      <w:r>
+        <w:rPr>
+          <w:rFonts w:ascii="Courier New" w:hAnsi="Courier New"/>
+          <w:color w:val="1F2D3D"/>
+          <w:sz w:val="18"/>
+        </w:rPr>
+        <w:t>static Future&lt;void&gt; setPremium({</w:t>
+      </w:r>
+    </w:p>
+    <w:p>
+      <w:pPr>
+        <w:spacing w:before="0" w:after="0"/>
+        <w:ind w:left="283"/>
+        <w:shd w:val="clear" w:color="auto" w:fill="F3F4F6"/>
+      </w:pPr>
+      <w:r>
+        <w:rPr>
+          <w:rFonts w:ascii="Courier New" w:hAnsi="Courier New"/>
+          <w:color w:val="1F2D3D"/>
+          <w:sz w:val="18"/>
+        </w:rPr>
+        <w:t xml:space="preserve">  required String uid,</w:t>
+      </w:r>
+    </w:p>
+    <w:p>
+      <w:pPr>
+        <w:spacing w:before="0" w:after="0"/>
+        <w:ind w:left="283"/>
+        <w:shd w:val="clear" w:color="auto" w:fill="F3F4F6"/>
+      </w:pPr>
+      <w:r>
+        <w:rPr>
+          <w:rFonts w:ascii="Courier New" w:hAnsi="Courier New"/>
+          <w:color w:val="1F2D3D"/>
+          <w:sz w:val="18"/>
+        </w:rPr>
+        <w:t xml:space="preserve">  required String plan,</w:t>
+      </w:r>
+    </w:p>
+    <w:p>
+      <w:pPr>
+        <w:spacing w:before="0" w:after="0"/>
+        <w:ind w:left="283"/>
+        <w:shd w:val="clear" w:color="auto" w:fill="F3F4F6"/>
+      </w:pPr>
+      <w:r>
+        <w:rPr>
+          <w:rFonts w:ascii="Courier New" w:hAnsi="Courier New"/>
+          <w:color w:val="1F2D3D"/>
+          <w:sz w:val="18"/>
+        </w:rPr>
+        <w:t>}) async {</w:t>
+      </w:r>
+    </w:p>
+    <w:p>
+      <w:pPr>
+        <w:spacing w:before="0" w:after="0"/>
+        <w:ind w:left="283"/>
+        <w:shd w:val="clear" w:color="auto" w:fill="F3F4F6"/>
+      </w:pPr>
+      <w:r>
+        <w:rPr>
+          <w:rFonts w:ascii="Courier New" w:hAnsi="Courier New"/>
+          <w:color w:val="1F2D3D"/>
+          <w:sz w:val="18"/>
+        </w:rPr>
+        <w:t xml:space="preserve">  await _userRef(uid).update({</w:t>
+      </w:r>
+    </w:p>
+    <w:p>
+      <w:pPr>
+        <w:spacing w:before="0" w:after="0"/>
+        <w:ind w:left="283"/>
+        <w:shd w:val="clear" w:color="auto" w:fill="F3F4F6"/>
+      </w:pPr>
+      <w:r>
+        <w:rPr>
+          <w:rFonts w:ascii="Courier New" w:hAnsi="Courier New"/>
+          <w:color w:val="1F2D3D"/>
+          <w:sz w:val="18"/>
+        </w:rPr>
+        <w:t xml:space="preserve">    'isPremium': true,</w:t>
+      </w:r>
+    </w:p>
+    <w:p>
+      <w:pPr>
+        <w:spacing w:before="0" w:after="0"/>
+        <w:ind w:left="283"/>
+        <w:shd w:val="clear" w:color="auto" w:fill="F3F4F6"/>
+      </w:pPr>
+      <w:r>
+        <w:rPr>
+          <w:rFonts w:ascii="Courier New" w:hAnsi="Courier New"/>
+          <w:color w:val="1F2D3D"/>
+          <w:sz w:val="18"/>
+        </w:rPr>
+        <w:t xml:space="preserve">    'premiumPlan': plan,            // 'entrepreneur' | 'mentor' | 'investisseur'</w:t>
+      </w:r>
+    </w:p>
+    <w:p>
+      <w:pPr>
+        <w:spacing w:before="0" w:after="0"/>
+        <w:ind w:left="283"/>
+        <w:shd w:val="clear" w:color="auto" w:fill="F3F4F6"/>
+      </w:pPr>
+      <w:r>
+        <w:rPr>
+          <w:rFonts w:ascii="Courier New" w:hAnsi="Courier New"/>
+          <w:color w:val="1F2D3D"/>
+          <w:sz w:val="18"/>
+        </w:rPr>
+        <w:t xml:space="preserve">    'premiumSince': ServerValue.timestamp,</w:t>
+      </w:r>
+    </w:p>
+    <w:p>
+      <w:pPr>
+        <w:spacing w:before="0" w:after="0"/>
+        <w:ind w:left="283"/>
+        <w:shd w:val="clear" w:color="auto" w:fill="F3F4F6"/>
+      </w:pPr>
+      <w:r>
+        <w:rPr>
+          <w:rFonts w:ascii="Courier New" w:hAnsi="Courier New"/>
+          <w:color w:val="1F2D3D"/>
+          <w:sz w:val="18"/>
+        </w:rPr>
+        <w:t xml:space="preserve">  });</w:t>
+      </w:r>
+    </w:p>
+    <w:p>
+      <w:pPr>
+        <w:spacing w:before="0" w:after="0"/>
+        <w:ind w:left="283"/>
+        <w:shd w:val="clear" w:color="auto" w:fill="F3F4F6"/>
+      </w:pPr>
+      <w:r>
+        <w:rPr>
+          <w:rFonts w:ascii="Courier New" w:hAnsi="Courier New"/>
+          <w:color w:val="1F2D3D"/>
+          <w:sz w:val="18"/>
+        </w:rPr>
+        <w:t>}</w:t>
+      </w:r>
+    </w:p>
+    <w:p>
+      <w:pPr>
+        <w:spacing w:after="80"/>
+      </w:pPr>
+    </w:p>
+    <w:p>
+      <w:pPr>
+        <w:pStyle w:val="Heading3"/>
+      </w:pPr>
+      <w:r>
+        <w:t>12.4 Interface — `WavePremiumSheet`</w:t>
+      </w:r>
+    </w:p>
+    <w:p>
+      <w:r>
+        <w:rPr>
+          <w:rFonts w:ascii="Calibri" w:hAnsi="Calibri"/>
+          <w:sz w:val="22"/>
+        </w:rPr>
+        <w:t xml:space="preserve">La bottom sheet s'affiche quand l'utilisateur souhaite passer en Premium. Elle a </w:t>
+      </w:r>
+      <w:r>
+        <w:rPr>
+          <w:rFonts w:ascii="Calibri" w:hAnsi="Calibri"/>
+          <w:b/>
+          <w:sz w:val="22"/>
+        </w:rPr>
+        <w:t>deux états</w:t>
+      </w:r>
+      <w:r>
+        <w:rPr>
+          <w:rFonts w:ascii="Calibri" w:hAnsi="Calibri"/>
+          <w:sz w:val="22"/>
+        </w:rPr>
+        <w:t xml:space="preserve"> :</w:t>
+      </w:r>
+    </w:p>
+    <w:p>
+      <w:r>
+        <w:rPr>
+          <w:rFonts w:ascii="Calibri" w:hAnsi="Calibri"/>
+          <w:b/>
+          <w:sz w:val="22"/>
+        </w:rPr>
+        <w:t>État 1 — Avant paiement :</w:t>
+      </w:r>
+      <w:r>
+        <w:rPr>
+          <w:rFonts w:ascii="Calibri" w:hAnsi="Calibri"/>
+          <w:sz w:val="22"/>
+        </w:rPr>
+        <w:t xml:space="preserve"> affiche les avantages du plan + bouton "Payer avec Wave" (bleu Wave </w:t>
+      </w:r>
+      <w:r>
+        <w:rPr>
+          <w:rFonts w:ascii="Courier New" w:hAnsi="Courier New"/>
+          <w:color w:val="DC2626"/>
+          <w:sz w:val="20"/>
+        </w:rPr>
+        <w:t>#1BA9FF</w:t>
+      </w:r>
+      <w:r>
+        <w:rPr>
+          <w:rFonts w:ascii="Calibri" w:hAnsi="Calibri"/>
+          <w:sz w:val="22"/>
+        </w:rPr>
+        <w:t>)</w:t>
+      </w:r>
+    </w:p>
+    <w:p>
+      <w:r>
+        <w:rPr>
+          <w:rFonts w:ascii="Calibri" w:hAnsi="Calibri"/>
+          <w:b/>
+          <w:sz w:val="22"/>
+        </w:rPr>
+        <w:t>État 2 — Après retour de Wave :</w:t>
+      </w:r>
+      <w:r>
+        <w:rPr>
+          <w:rFonts w:ascii="Calibri" w:hAnsi="Calibri"/>
+          <w:sz w:val="22"/>
+        </w:rPr>
+        <w:t xml:space="preserve"> affiche un bandeau vert + bouton "Oui, j'ai payé — Activer Premium"</w:t>
+      </w:r>
+    </w:p>
+    <w:p>
+      <w:pPr>
+        <w:spacing w:before="0" w:after="0"/>
+        <w:ind w:left="283"/>
+        <w:shd w:val="clear" w:color="auto" w:fill="F3F4F6"/>
+      </w:pPr>
+      <w:r>
+        <w:rPr>
+          <w:rFonts w:ascii="Courier New" w:hAnsi="Courier New"/>
+          <w:color w:val="1F2D3D"/>
+          <w:sz w:val="18"/>
+        </w:rPr>
+        <w:t>// Ouverture de la bottom sheet depuis n'importe quel écran</w:t>
+      </w:r>
+    </w:p>
+    <w:p>
+      <w:pPr>
+        <w:spacing w:before="0" w:after="0"/>
+        <w:ind w:left="283"/>
+        <w:shd w:val="clear" w:color="auto" w:fill="F3F4F6"/>
+      </w:pPr>
+      <w:r>
+        <w:rPr>
+          <w:rFonts w:ascii="Courier New" w:hAnsi="Courier New"/>
+          <w:color w:val="1F2D3D"/>
+          <w:sz w:val="18"/>
+        </w:rPr>
+        <w:t>await WavePremiumSheet.show(context, PremiumPlan.entrepreneur);</w:t>
+      </w:r>
+    </w:p>
+    <w:p>
+      <w:pPr>
+        <w:spacing w:before="0" w:after="0"/>
+        <w:ind w:left="283"/>
+        <w:shd w:val="clear" w:color="auto" w:fill="F3F4F6"/>
+      </w:pPr>
+      <w:r>
+        <w:rPr>
+          <w:rFonts w:ascii="Courier New" w:hAnsi="Courier New"/>
+          <w:color w:val="1F2D3D"/>
+          <w:sz w:val="18"/>
+        </w:rPr>
+        <w:t xml:space="preserve"> </w:t>
+      </w:r>
+    </w:p>
+    <w:p>
+      <w:pPr>
+        <w:spacing w:before="0" w:after="0"/>
+        <w:ind w:left="283"/>
+        <w:shd w:val="clear" w:color="auto" w:fill="F3F4F6"/>
+      </w:pPr>
+      <w:r>
+        <w:rPr>
+          <w:rFonts w:ascii="Courier New" w:hAnsi="Courier New"/>
+          <w:color w:val="1F2D3D"/>
+          <w:sz w:val="18"/>
+        </w:rPr>
+        <w:t>// Le retour est true si Premium activé, null/false sinon</w:t>
+      </w:r>
+    </w:p>
+    <w:p>
+      <w:pPr>
+        <w:spacing w:after="80"/>
+      </w:pPr>
+    </w:p>
+    <w:p>
+      <w:r>
+        <w:rPr>
+          <w:rFonts w:ascii="Calibri" w:hAnsi="Calibri"/>
+          <w:b/>
+          <w:sz w:val="22"/>
+        </w:rPr>
+        <w:t>Flux utilisateur complet :</w:t>
+      </w:r>
+    </w:p>
+    <w:p>
+      <w:pPr>
+        <w:pStyle w:val="ListNumber"/>
+      </w:pPr>
+      <w:r>
+        <w:rPr>
+          <w:rFonts w:ascii="Calibri" w:hAnsi="Calibri"/>
+          <w:sz w:val="22"/>
+        </w:rPr>
+        <w:t>Clique "Passer Premium" → bottom sheet s'ouvre</w:t>
+      </w:r>
+    </w:p>
+    <w:p>
+      <w:pPr>
+        <w:pStyle w:val="ListNumber"/>
+      </w:pPr>
+      <w:r>
+        <w:rPr>
+          <w:rFonts w:ascii="Calibri" w:hAnsi="Calibri"/>
+          <w:sz w:val="22"/>
+        </w:rPr>
+        <w:t>Voit les avantages + prix → clique "Payer avec Wave — 7 500 FCFA / mois"</w:t>
+      </w:r>
+    </w:p>
+    <w:p>
+      <w:pPr>
+        <w:pStyle w:val="ListNumber"/>
+      </w:pPr>
+      <w:r>
+        <w:rPr>
+          <w:rFonts w:ascii="Calibri" w:hAnsi="Calibri"/>
+          <w:sz w:val="22"/>
+        </w:rPr>
+        <w:t>L'app Wave s'ouvre avec le montant pré-rempli</w:t>
+      </w:r>
+    </w:p>
+    <w:p>
+      <w:pPr>
+        <w:pStyle w:val="ListNumber"/>
+      </w:pPr>
+      <w:r>
+        <w:rPr>
+          <w:rFonts w:ascii="Calibri" w:hAnsi="Calibri"/>
+          <w:sz w:val="22"/>
+        </w:rPr>
+        <w:t>Confirme le paiement dans Wave → revient dans DIAPALER AFRICA</w:t>
+      </w:r>
+    </w:p>
+    <w:p>
+      <w:pPr>
+        <w:pStyle w:val="ListNumber"/>
+      </w:pPr>
+      <w:r>
+        <w:rPr>
+          <w:rFonts w:ascii="Calibri" w:hAnsi="Calibri"/>
+          <w:sz w:val="22"/>
+        </w:rPr>
+        <w:t>Clique "Oui, j'ai payé — Activer Premium" → Firebase mis à jour → SnackBar vert</w:t>
+      </w:r>
+    </w:p>
+    <w:p>
+      <w:pPr>
+        <w:spacing w:before="200" w:after="0"/>
+        <w:ind w:left="0"/>
+        <w:shd w:val="clear" w:color="auto" w:fill="FEF3C7"/>
+        <w:pBdr>
+          <w:left w:val="single" w:sz="8" w:space="6" w:color="F59E0B"/>
+        </w:pBdr>
+      </w:pPr>
+      <w:r>
+        <w:rPr>
+          <w:rFonts w:ascii="Calibri" w:hAnsi="Calibri"/>
+          <w:b/>
+          <w:color w:val="924009"/>
+          <w:sz w:val="20"/>
+        </w:rPr>
+        <w:t>📸  📸 CAPTURE D'ÉCRAN — Bottom sheet Premium (avantages + bouton Wave bleu)</w:t>
+      </w:r>
+    </w:p>
+    <w:p>
+      <w:pPr>
+        <w:spacing w:before="2835" w:after="240"/>
+        <w:ind w:left="0"/>
+        <w:shd w:val="clear" w:color="auto" w:fill="F9FAFB"/>
+        <w:pBdr>
+          <w:left w:val="single" w:sz="6" w:space="6" w:color="D1D5DB"/>
+        </w:pBdr>
+      </w:pPr>
+      <w:r>
+        <w:rPr>
+          <w:rFonts w:ascii="Calibri" w:hAnsi="Calibri"/>
+          <w:i/>
+          <w:color w:val="ABB5BF"/>
+          <w:sz w:val="18"/>
+        </w:rPr>
+        <w:t>[ Insérer la capture d'écran ici ]</w:t>
+      </w:r>
+    </w:p>
+    <w:p>
+      <w:pPr>
+        <w:spacing w:before="200" w:after="0"/>
+        <w:ind w:left="0"/>
+        <w:shd w:val="clear" w:color="auto" w:fill="FEF3C7"/>
+        <w:pBdr>
+          <w:left w:val="single" w:sz="8" w:space="6" w:color="F59E0B"/>
+        </w:pBdr>
+      </w:pPr>
+      <w:r>
+        <w:rPr>
+          <w:rFonts w:ascii="Calibri" w:hAnsi="Calibri"/>
+          <w:b/>
+          <w:color w:val="924009"/>
+          <w:sz w:val="20"/>
+        </w:rPr>
+        <w:t>📸  📸 CAPTURE D'ÉCRAN — App Wave ouverte avec montant pré-rempli (7 500 FCFA)</w:t>
+      </w:r>
+    </w:p>
+    <w:p>
+      <w:pPr>
+        <w:spacing w:before="2835" w:after="240"/>
+        <w:ind w:left="0"/>
+        <w:shd w:val="clear" w:color="auto" w:fill="F9FAFB"/>
+        <w:pBdr>
+          <w:left w:val="single" w:sz="6" w:space="6" w:color="D1D5DB"/>
+        </w:pBdr>
+      </w:pPr>
+      <w:r>
+        <w:rPr>
+          <w:rFonts w:ascii="Calibri" w:hAnsi="Calibri"/>
+          <w:i/>
+          <w:color w:val="ABB5BF"/>
+          <w:sz w:val="18"/>
+        </w:rPr>
+        <w:t>[ Insérer la capture d'écran ici ]</w:t>
+      </w:r>
+    </w:p>
+    <w:p>
+      <w:pPr>
+        <w:spacing w:before="200" w:after="0"/>
+        <w:ind w:left="0"/>
+        <w:shd w:val="clear" w:color="auto" w:fill="FEF3C7"/>
+        <w:pBdr>
+          <w:left w:val="single" w:sz="8" w:space="6" w:color="F59E0B"/>
+        </w:pBdr>
+      </w:pPr>
+      <w:r>
+        <w:rPr>
+          <w:rFonts w:ascii="Calibri" w:hAnsi="Calibri"/>
+          <w:b/>
+          <w:color w:val="924009"/>
+          <w:sz w:val="20"/>
+        </w:rPr>
+        <w:t>📸  📸 CAPTURE D'ÉCRAN — Confirmation "Compte Premium activé !" (SnackBar vert)</w:t>
+      </w:r>
+    </w:p>
+    <w:p>
+      <w:pPr>
+        <w:spacing w:before="2835" w:after="240"/>
+        <w:ind w:left="0"/>
+        <w:shd w:val="clear" w:color="auto" w:fill="F9FAFB"/>
+        <w:pBdr>
+          <w:left w:val="single" w:sz="6" w:space="6" w:color="D1D5DB"/>
+        </w:pBdr>
+      </w:pPr>
+      <w:r>
+        <w:rPr>
+          <w:rFonts w:ascii="Calibri" w:hAnsi="Calibri"/>
+          <w:i/>
+          <w:color w:val="ABB5BF"/>
+          <w:sz w:val="18"/>
+        </w:rPr>
+        <w:t>[ Insérer la capture d'écran ici ]</w:t>
+      </w:r>
+    </w:p>
+    <w:p>
+      <w:pPr>
+        <w:pStyle w:val="Heading2"/>
+      </w:pPr>
+      <w:r>
+        <w:t>11. Déploiement</w:t>
+      </w:r>
+    </w:p>
+    <w:p>
+      <w:r>
+        <w:rPr>
+          <w:rFonts w:ascii="Calibri" w:hAnsi="Calibri"/>
+          <w:sz w:val="22"/>
+        </w:rPr>
+        <w:t xml:space="preserve">L'application a été compilée en </w:t>
+      </w:r>
+      <w:r>
+        <w:rPr>
+          <w:rFonts w:ascii="Calibri" w:hAnsi="Calibri"/>
+          <w:b/>
+          <w:sz w:val="22"/>
+        </w:rPr>
+        <w:t>APK release signé</w:t>
+      </w:r>
+      <w:r>
+        <w:rPr>
+          <w:rFonts w:ascii="Calibri" w:hAnsi="Calibri"/>
+          <w:sz w:val="22"/>
+        </w:rPr>
+        <w:t xml:space="preserve"> prêt à l'installation :</w:t>
+      </w:r>
+    </w:p>
+    <w:p>
+      <w:pPr>
+        <w:spacing w:before="0" w:after="0"/>
+        <w:ind w:left="283"/>
+        <w:shd w:val="clear" w:color="auto" w:fill="F3F4F6"/>
+      </w:pPr>
+      <w:r>
+        <w:rPr>
+          <w:rFonts w:ascii="Courier New" w:hAnsi="Courier New"/>
+          <w:color w:val="1F2D3D"/>
+          <w:sz w:val="18"/>
+        </w:rPr>
+        <w:t>flutter build apk --release</w:t>
+      </w:r>
+    </w:p>
+    <w:p>
+      <w:pPr>
+        <w:spacing w:before="0" w:after="0"/>
+        <w:ind w:left="283"/>
+        <w:shd w:val="clear" w:color="auto" w:fill="F3F4F6"/>
+      </w:pPr>
+      <w:r>
+        <w:rPr>
+          <w:rFonts w:ascii="Courier New" w:hAnsi="Courier New"/>
+          <w:color w:val="1F2D3D"/>
+          <w:sz w:val="18"/>
+        </w:rPr>
+        <w:t>✓ Built build\app\outputs\flutter-apk\app-release.apk (54.2MB)</w:t>
+      </w:r>
+    </w:p>
+    <w:p>
+      <w:pPr>
+        <w:spacing w:after="80"/>
+      </w:pPr>
+    </w:p>
+    <w:tbl>
+      <w:tblPr>
+        <w:tblStyle w:val="TableGrid"/>
+        <w:tblW w:type="auto" w:w="0"/>
+        <w:tblLook w:firstColumn="1" w:firstRow="1" w:lastColumn="0" w:lastRow="0" w:noHBand="0" w:noVBand="1" w:val="04A0"/>
+      </w:tblPr>
+      <w:tblGrid>
+        <w:gridCol w:w="4703"/>
+        <w:gridCol w:w="4703"/>
+      </w:tblGrid>
+      <w:tr>
+        <w:tc>
+          <w:tcPr>
+            <w:tcW w:type="dxa" w:w="4703"/>
+            <w:shd w:val="clear" w:color="auto" w:fill="1E3A8A"/>
+          </w:tcPr>
+          <w:p>
+            <w:r>
+              <w:rPr>
+                <w:rFonts w:ascii="Calibri" w:hAnsi="Calibri"/>
+                <w:b/>
+                <w:color w:val="FFFFFF"/>
+                <w:sz w:val="20"/>
+              </w:rPr>
+              <w:t>Paramètre</w:t>
+            </w:r>
+          </w:p>
+        </w:tc>
+        <w:tc>
+          <w:tcPr>
+            <w:tcW w:type="dxa" w:w="4703"/>
+            <w:shd w:val="clear" w:color="auto" w:fill="1E3A8A"/>
+          </w:tcPr>
+          <w:p>
+            <w:r>
+              <w:rPr>
+                <w:rFonts w:ascii="Calibri" w:hAnsi="Calibri"/>
+                <w:b/>
+                <w:color w:val="FFFFFF"/>
+                <w:sz w:val="20"/>
+              </w:rPr>
+              <w:t>Valeur</w:t>
+            </w:r>
+          </w:p>
+        </w:tc>
+      </w:tr>
+      <w:tr>
+        <w:tc>
+          <w:tcPr>
+            <w:tcW w:type="dxa" w:w="4703"/>
+            <w:shd w:val="clear" w:color="auto" w:fill="EFF6FF"/>
+          </w:tcPr>
+          <w:p>
+            <w:r>
+              <w:rPr>
+                <w:rFonts w:ascii="Calibri" w:hAnsi="Calibri"/>
+                <w:sz w:val="20"/>
+              </w:rPr>
+              <w:t>Type</w:t>
+            </w:r>
+          </w:p>
+        </w:tc>
+        <w:tc>
+          <w:tcPr>
+            <w:tcW w:type="dxa" w:w="4703"/>
+            <w:shd w:val="clear" w:color="auto" w:fill="EFF6FF"/>
+          </w:tcPr>
+          <w:p>
+            <w:r>
+              <w:rPr>
+                <w:rFonts w:ascii="Calibri" w:hAnsi="Calibri"/>
+                <w:sz w:val="20"/>
+              </w:rPr>
+              <w:t>APK release signé</w:t>
+            </w:r>
+          </w:p>
+        </w:tc>
+      </w:tr>
+      <w:tr>
+        <w:tc>
+          <w:tcPr>
+            <w:tcW w:type="dxa" w:w="4703"/>
+          </w:tcPr>
+          <w:p>
+            <w:r>
+              <w:rPr>
+                <w:rFonts w:ascii="Calibri" w:hAnsi="Calibri"/>
+                <w:sz w:val="20"/>
+              </w:rPr>
+              <w:t>Taille</w:t>
+            </w:r>
+          </w:p>
+        </w:tc>
+        <w:tc>
+          <w:tcPr>
+            <w:tcW w:type="dxa" w:w="4703"/>
+          </w:tcPr>
+          <w:p>
+            <w:r>
+              <w:rPr>
+                <w:rFonts w:ascii="Calibri" w:hAnsi="Calibri"/>
+                <w:sz w:val="20"/>
+              </w:rPr>
+              <w:t>54.2 MB</w:t>
+            </w:r>
+          </w:p>
+        </w:tc>
+      </w:tr>
+      <w:tr>
+        <w:tc>
+          <w:tcPr>
+            <w:tcW w:type="dxa" w:w="4703"/>
+            <w:shd w:val="clear" w:color="auto" w:fill="EFF6FF"/>
+          </w:tcPr>
+          <w:p>
+            <w:r>
+              <w:rPr>
+                <w:rFonts w:ascii="Calibri" w:hAnsi="Calibri"/>
+                <w:sz w:val="20"/>
+              </w:rPr>
+              <w:t>Keystore</w:t>
+            </w:r>
+          </w:p>
+        </w:tc>
+        <w:tc>
+          <w:tcPr>
+            <w:tcW w:type="dxa" w:w="4703"/>
+            <w:shd w:val="clear" w:color="auto" w:fill="EFF6FF"/>
+          </w:tcPr>
+          <w:p>
+            <w:r>
+              <w:rPr>
+                <w:rFonts w:ascii="Calibri" w:hAnsi="Calibri"/>
+                <w:sz w:val="20"/>
+              </w:rPr>
+              <w:t>RSA 2048 bits, 10 000 jours de validité</w:t>
+            </w:r>
+          </w:p>
+        </w:tc>
+      </w:tr>
+      <w:tr>
+        <w:tc>
+          <w:tcPr>
+            <w:tcW w:type="dxa" w:w="4703"/>
+          </w:tcPr>
+          <w:p>
+            <w:r>
+              <w:rPr>
+                <w:rFonts w:ascii="Calibri" w:hAnsi="Calibri"/>
+                <w:sz w:val="20"/>
+              </w:rPr>
+              <w:t>Tree-shaking</w:t>
+            </w:r>
+          </w:p>
+        </w:tc>
+        <w:tc>
+          <w:tcPr>
+            <w:tcW w:type="dxa" w:w="4703"/>
+          </w:tcPr>
+          <w:p>
+            <w:r>
+              <w:rPr>
+                <w:rFonts w:ascii="Calibri" w:hAnsi="Calibri"/>
+                <w:sz w:val="20"/>
+              </w:rPr>
+              <w:t>MaterialIcons : −99 % (1,6 MB → 16 Ko)</w:t>
+            </w:r>
+          </w:p>
+        </w:tc>
+      </w:tr>
+      <w:tr>
+        <w:tc>
+          <w:tcPr>
+            <w:tcW w:type="dxa" w:w="4703"/>
+            <w:shd w:val="clear" w:color="auto" w:fill="EFF6FF"/>
+          </w:tcPr>
+          <w:p>
+            <w:r>
+              <w:rPr>
+                <w:rFonts w:ascii="Calibri" w:hAnsi="Calibri"/>
+                <w:sz w:val="20"/>
+              </w:rPr>
+              <w:t>Lien de téléchargement</w:t>
+            </w:r>
+          </w:p>
+        </w:tc>
+        <w:tc>
+          <w:tcPr>
+            <w:tcW w:type="dxa" w:w="4703"/>
+            <w:shd w:val="clear" w:color="auto" w:fill="EFF6FF"/>
+          </w:tcPr>
+          <w:p>
+            <w:r>
+              <w:rPr>
+                <w:rFonts w:ascii="Calibri" w:hAnsi="Calibri"/>
+                <w:sz w:val="20"/>
+              </w:rPr>
+              <w:t>https://drive.google.com/file/d/1FapzU1NMRoacyW1jnRUHSvklJ6cJdHAj/view?usp=sharing</w:t>
+            </w:r>
+          </w:p>
+        </w:tc>
+      </w:tr>
+    </w:tbl>
+    <w:p>
+      <w:pPr>
+        <w:spacing w:after="120"/>
+      </w:pPr>
+    </w:p>
+    <w:p>
+      <w:pPr>
+        <w:spacing w:before="200" w:after="0"/>
+        <w:ind w:left="0"/>
+        <w:shd w:val="clear" w:color="auto" w:fill="FEF3C7"/>
+        <w:pBdr>
+          <w:left w:val="single" w:sz="8" w:space="6" w:color="F59E0B"/>
+        </w:pBdr>
+      </w:pPr>
+      <w:r>
+        <w:rPr>
+          <w:rFonts w:ascii="Calibri" w:hAnsi="Calibri"/>
+          <w:b/>
+          <w:color w:val="924009"/>
+          <w:sz w:val="20"/>
+        </w:rPr>
+        <w:t>📸  📸 CAPTURE D'ÉCRAN — Terminal : `✓ Built app-release.apk (54.2MB)`</w:t>
       </w:r>
     </w:p>
     <w:p>
@@ -25797,89 +30169,55 @@
           </w:p>
         </w:tc>
       </w:tr>
-    </w:tbl>
-    <w:p>
-      <w:pPr>
-        <w:spacing w:after="120"/>
-      </w:pPr>
-    </w:p>
-    <w:p>
-      <w:pPr>
-        <w:pStyle w:val="Heading3"/>
-      </w:pPr>
-      <w:r>
-        <w:t>Perspectives de développement</w:t>
-      </w:r>
-    </w:p>
-    <w:p>
-      <w:r>
-        <w:rPr>
-          <w:rFonts w:ascii="Calibri" w:hAnsi="Calibri"/>
-          <w:sz w:val="22"/>
-        </w:rPr>
-        <w:t>Trois fonctionnalités avancées mentionnées dans le sujet ont été identifiées comme évolutions naturelles de l'application mais n'ont pas été intégrées dans cette version, par choix de priorisation :</w:t>
-      </w:r>
-    </w:p>
-    <w:tbl>
-      <w:tblPr>
-        <w:tblStyle w:val="TableGrid"/>
-        <w:tblW w:type="auto" w:w="0"/>
-        <w:tblLook w:firstColumn="1" w:firstRow="1" w:lastColumn="0" w:lastRow="0" w:noHBand="0" w:noVBand="1" w:val="04A0"/>
-      </w:tblPr>
-      <w:tblGrid>
-        <w:gridCol w:w="3135"/>
-        <w:gridCol w:w="3135"/>
-        <w:gridCol w:w="3135"/>
-      </w:tblGrid>
       <w:tr>
         <w:tc>
           <w:tcPr>
             <w:tcW w:type="dxa" w:w="3135"/>
-            <w:shd w:val="clear" w:color="auto" w:fill="1E3A8A"/>
           </w:tcPr>
           <w:p>
             <w:r>
               <w:rPr>
                 <w:rFonts w:ascii="Calibri" w:hAnsi="Calibri"/>
                 <w:b/>
-                <w:color w:val="FFFFFF"/>
                 <w:sz w:val="20"/>
               </w:rPr>
-              <w:t>Fonctionnalité</w:t>
+              <w:t>Partage réseaux sociaux</w:t>
             </w:r>
           </w:p>
         </w:tc>
         <w:tc>
           <w:tcPr>
             <w:tcW w:type="dxa" w:w="3135"/>
-            <w:shd w:val="clear" w:color="auto" w:fill="1E3A8A"/>
           </w:tcPr>
           <w:p>
             <w:r>
               <w:rPr>
                 <w:rFonts w:ascii="Calibri" w:hAnsi="Calibri"/>
-                <w:b/>
-                <w:color w:val="FFFFFF"/>
+                <w:color w:val="DC2626"/>
                 <w:sz w:val="20"/>
               </w:rPr>
-              <w:t>Justification du report</w:t>
+              <w:t>ShareService</w:t>
+            </w:r>
+            <w:r>
+              <w:rPr>
+                <w:rFonts w:ascii="Calibri" w:hAnsi="Calibri"/>
+                <w:sz w:val="20"/>
+              </w:rPr>
+              <w:t xml:space="preserve"> (share_plus) — pitch, profil, conseil DIALI</w:t>
             </w:r>
           </w:p>
         </w:tc>
         <w:tc>
           <w:tcPr>
             <w:tcW w:type="dxa" w:w="3135"/>
-            <w:shd w:val="clear" w:color="auto" w:fill="1E3A8A"/>
           </w:tcPr>
           <w:p>
             <w:r>
               <w:rPr>
                 <w:rFonts w:ascii="Calibri" w:hAnsi="Calibri"/>
-                <w:b/>
-                <w:color w:val="FFFFFF"/>
                 <w:sz w:val="20"/>
               </w:rPr>
-              <w:t>Technologie envisagée</w:t>
+              <w:t>✅ (bonus)</w:t>
             </w:r>
           </w:p>
         </w:tc>
@@ -25897,7 +30235,45 @@
                 <w:b/>
                 <w:sz w:val="20"/>
               </w:rPr>
-              <w:t>Partage sur réseaux sociaux</w:t>
+              <w:t>Paiement mobile Wave</w:t>
+            </w:r>
+          </w:p>
+        </w:tc>
+        <w:tc>
+          <w:tcPr>
+            <w:tcW w:type="dxa" w:w="3135"/>
+            <w:shd w:val="clear" w:color="auto" w:fill="EFF6FF"/>
+          </w:tcPr>
+          <w:p>
+            <w:r>
+              <w:rPr>
+                <w:rFonts w:ascii="Calibri" w:hAnsi="Calibri"/>
+                <w:color w:val="DC2626"/>
+                <w:sz w:val="20"/>
+              </w:rPr>
+              <w:t>WaveService</w:t>
+            </w:r>
+            <w:r>
+              <w:rPr>
+                <w:rFonts w:ascii="Calibri" w:hAnsi="Calibri"/>
+                <w:sz w:val="20"/>
+              </w:rPr>
+              <w:t xml:space="preserve"> + lien marchand + </w:t>
+            </w:r>
+            <w:r>
+              <w:rPr>
+                <w:rFonts w:ascii="Calibri" w:hAnsi="Calibri"/>
+                <w:color w:val="DC2626"/>
+                <w:sz w:val="20"/>
+              </w:rPr>
+              <w:t>WavePremiumSheet</w:t>
+            </w:r>
+            <w:r>
+              <w:rPr>
+                <w:rFonts w:ascii="Calibri" w:hAnsi="Calibri"/>
+                <w:sz w:val="20"/>
+              </w:rPr>
+              <w:t xml:space="preserve"> (3 plans Premium)</w:t>
             </w:r>
           </w:p>
         </w:tc>
@@ -25912,37 +30288,7 @@
                 <w:rFonts w:ascii="Calibri" w:hAnsi="Calibri"/>
                 <w:sz w:val="20"/>
               </w:rPr>
-              <w:t>Fonctionnalité de visibilité — intéressante une fois que la base d'utilisateurs est établie</w:t>
-            </w:r>
-          </w:p>
-        </w:tc>
-        <w:tc>
-          <w:tcPr>
-            <w:tcW w:type="dxa" w:w="3135"/>
-            <w:shd w:val="clear" w:color="auto" w:fill="EFF6FF"/>
-          </w:tcPr>
-          <w:p>
-            <w:r>
-              <w:rPr>
-                <w:rFonts w:ascii="Calibri" w:hAnsi="Calibri"/>
-                <w:sz w:val="20"/>
-              </w:rPr>
-              <w:t xml:space="preserve">Package Flutter </w:t>
-            </w:r>
-            <w:r>
-              <w:rPr>
-                <w:rFonts w:ascii="Calibri" w:hAnsi="Calibri"/>
-                <w:color w:val="DC2626"/>
-                <w:sz w:val="20"/>
-              </w:rPr>
-              <w:t>share_plus</w:t>
-            </w:r>
-            <w:r>
-              <w:rPr>
-                <w:rFonts w:ascii="Calibri" w:hAnsi="Calibri"/>
-                <w:sz w:val="20"/>
-              </w:rPr>
-              <w:t xml:space="preserve"> · partage de pitchs et profils via lien deep link</w:t>
+              <w:t>✅ (bonus)</w:t>
             </w:r>
           </w:p>
         </w:tc>
@@ -25959,7 +30305,29 @@
                 <w:b/>
                 <w:sz w:val="20"/>
               </w:rPr>
-              <w:t>Paiement mobile</w:t>
+              <w:t>Déploiement APK signé</w:t>
+            </w:r>
+          </w:p>
+        </w:tc>
+        <w:tc>
+          <w:tcPr>
+            <w:tcW w:type="dxa" w:w="3135"/>
+          </w:tcPr>
+          <w:p>
+            <w:r>
+              <w:rPr>
+                <w:rFonts w:ascii="Calibri" w:hAnsi="Calibri"/>
+                <w:color w:val="DC2626"/>
+                <w:sz w:val="20"/>
+              </w:rPr>
+              <w:t>flutter build apk --release</w:t>
+            </w:r>
+            <w:r>
+              <w:rPr>
+                <w:rFonts w:ascii="Calibri" w:hAnsi="Calibri"/>
+                <w:sz w:val="20"/>
+              </w:rPr>
+              <w:t xml:space="preserve"> — APK 54.2 MB disponible en téléchargement</w:t>
             </w:r>
           </w:p>
         </w:tc>
@@ -25973,36 +30341,76 @@
                 <w:rFonts w:ascii="Calibri" w:hAnsi="Calibri"/>
                 <w:sz w:val="20"/>
               </w:rPr>
-              <w:t>Nécessite un compte marchand (Wave, Orange Money) et une certification — hors périmètre académique</w:t>
+              <w:t>✅ (bonus)</w:t>
+            </w:r>
+          </w:p>
+        </w:tc>
+      </w:tr>
+    </w:tbl>
+    <w:p>
+      <w:pPr>
+        <w:spacing w:after="120"/>
+      </w:pPr>
+    </w:p>
+    <w:p>
+      <w:pPr>
+        <w:pStyle w:val="Heading3"/>
+      </w:pPr>
+      <w:r>
+        <w:t>Perspectives de développement</w:t>
+      </w:r>
+    </w:p>
+    <w:p>
+      <w:r>
+        <w:rPr>
+          <w:rFonts w:ascii="Calibri" w:hAnsi="Calibri"/>
+          <w:sz w:val="22"/>
+        </w:rPr>
+        <w:t>Les trois fonctionnalités avancées mentionnées dans le sujet sont toutes implémentées :</w:t>
+      </w:r>
+    </w:p>
+    <w:tbl>
+      <w:tblPr>
+        <w:tblStyle w:val="TableGrid"/>
+        <w:tblW w:type="auto" w:w="0"/>
+        <w:tblLook w:firstColumn="1" w:firstRow="1" w:lastColumn="0" w:lastRow="0" w:noHBand="0" w:noVBand="1" w:val="04A0"/>
+      </w:tblPr>
+      <w:tblGrid>
+        <w:gridCol w:w="4703"/>
+        <w:gridCol w:w="4703"/>
+      </w:tblGrid>
+      <w:tr>
+        <w:tc>
+          <w:tcPr>
+            <w:tcW w:type="dxa" w:w="4703"/>
+            <w:shd w:val="clear" w:color="auto" w:fill="1E3A8A"/>
+          </w:tcPr>
+          <w:p>
+            <w:r>
+              <w:rPr>
+                <w:rFonts w:ascii="Calibri" w:hAnsi="Calibri"/>
+                <w:b/>
+                <w:color w:val="FFFFFF"/>
+                <w:sz w:val="20"/>
+              </w:rPr>
+              <w:t>Fonctionnalité</w:t>
             </w:r>
           </w:p>
         </w:tc>
         <w:tc>
           <w:tcPr>
-            <w:tcW w:type="dxa" w:w="3135"/>
+            <w:tcW w:type="dxa" w:w="4703"/>
+            <w:shd w:val="clear" w:color="auto" w:fill="1E3A8A"/>
           </w:tcPr>
           <w:p>
             <w:r>
               <w:rPr>
                 <w:rFonts w:ascii="Calibri" w:hAnsi="Calibri"/>
+                <w:b/>
+                <w:color w:val="FFFFFF"/>
                 <w:sz w:val="20"/>
               </w:rPr>
-              <w:t xml:space="preserve">Package </w:t>
-            </w:r>
-            <w:r>
-              <w:rPr>
-                <w:rFonts w:ascii="Calibri" w:hAnsi="Calibri"/>
-                <w:color w:val="DC2626"/>
-                <w:sz w:val="20"/>
-              </w:rPr>
-              <w:t>flutter_wave</w:t>
-            </w:r>
-            <w:r>
-              <w:rPr>
-                <w:rFonts w:ascii="Calibri" w:hAnsi="Calibri"/>
-                <w:sz w:val="20"/>
-              </w:rPr>
-              <w:t xml:space="preserve"> ou API Orange Money + webhooks</w:t>
+              <w:t>Statut</w:t>
             </w:r>
           </w:p>
         </w:tc>
@@ -26010,23 +30418,7 @@
       <w:tr>
         <w:tc>
           <w:tcPr>
-            <w:tcW w:type="dxa" w:w="3135"/>
-            <w:shd w:val="clear" w:color="auto" w:fill="EFF6FF"/>
-          </w:tcPr>
-          <w:p>
-            <w:r>
-              <w:rPr>
-                <w:rFonts w:ascii="Calibri" w:hAnsi="Calibri"/>
-                <w:b/>
-                <w:sz w:val="20"/>
-              </w:rPr>
-              <w:t>Déploiement Play Store</w:t>
-            </w:r>
-          </w:p>
-        </w:tc>
-        <w:tc>
-          <w:tcPr>
-            <w:tcW w:type="dxa" w:w="3135"/>
+            <w:tcW w:type="dxa" w:w="4703"/>
             <w:shd w:val="clear" w:color="auto" w:fill="EFF6FF"/>
           </w:tcPr>
           <w:p>
@@ -26035,30 +30427,84 @@
                 <w:rFonts w:ascii="Calibri" w:hAnsi="Calibri"/>
                 <w:sz w:val="20"/>
               </w:rPr>
-              <w:t>Requiert un compte développeur Google Play (25 $) + révision humaine (7 jours) — processus en cours</w:t>
+              <w:t>Partage sur réseaux sociaux</w:t>
             </w:r>
           </w:p>
         </w:tc>
         <w:tc>
           <w:tcPr>
-            <w:tcW w:type="dxa" w:w="3135"/>
+            <w:tcW w:type="dxa" w:w="4703"/>
             <w:shd w:val="clear" w:color="auto" w:fill="EFF6FF"/>
           </w:tcPr>
           <w:p>
             <w:r>
               <w:rPr>
                 <w:rFonts w:ascii="Calibri" w:hAnsi="Calibri"/>
-                <w:color w:val="DC2626"/>
                 <w:sz w:val="20"/>
               </w:rPr>
-              <w:t>flutter build appbundle --release</w:t>
+              <w:t>✅ Implémenté — voir section 10</w:t>
             </w:r>
+          </w:p>
+        </w:tc>
+      </w:tr>
+      <w:tr>
+        <w:tc>
+          <w:tcPr>
+            <w:tcW w:type="dxa" w:w="4703"/>
+          </w:tcPr>
+          <w:p>
             <w:r>
               <w:rPr>
                 <w:rFonts w:ascii="Calibri" w:hAnsi="Calibri"/>
                 <w:sz w:val="20"/>
               </w:rPr>
-              <w:t xml:space="preserve"> + signature keystore + console Google Play</w:t>
+              <w:t>Paiement mobile (Wave)</w:t>
+            </w:r>
+          </w:p>
+        </w:tc>
+        <w:tc>
+          <w:tcPr>
+            <w:tcW w:type="dxa" w:w="4703"/>
+          </w:tcPr>
+          <w:p>
+            <w:r>
+              <w:rPr>
+                <w:rFonts w:ascii="Calibri" w:hAnsi="Calibri"/>
+                <w:sz w:val="20"/>
+              </w:rPr>
+              <w:t>✅ Implémenté — voir section 12</w:t>
+            </w:r>
+          </w:p>
+        </w:tc>
+      </w:tr>
+      <w:tr>
+        <w:tc>
+          <w:tcPr>
+            <w:tcW w:type="dxa" w:w="4703"/>
+            <w:shd w:val="clear" w:color="auto" w:fill="EFF6FF"/>
+          </w:tcPr>
+          <w:p>
+            <w:r>
+              <w:rPr>
+                <w:rFonts w:ascii="Calibri" w:hAnsi="Calibri"/>
+                <w:sz w:val="20"/>
+              </w:rPr>
+              <w:t>Déploiement</w:t>
+            </w:r>
+          </w:p>
+        </w:tc>
+        <w:tc>
+          <w:tcPr>
+            <w:tcW w:type="dxa" w:w="4703"/>
+            <w:shd w:val="clear" w:color="auto" w:fill="EFF6FF"/>
+          </w:tcPr>
+          <w:p>
+            <w:r>
+              <w:rPr>
+                <w:rFonts w:ascii="Calibri" w:hAnsi="Calibri"/>
+                <w:sz w:val="20"/>
+              </w:rPr>
+              <w:t>✅ Implémenté — voir section 11</w:t>
             </w:r>
           </w:p>
         </w:tc>
@@ -26068,45 +30514,6 @@
       <w:pPr>
         <w:spacing w:after="120"/>
       </w:pPr>
-    </w:p>
-    <w:p>
-      <w:r>
-        <w:rPr>
-          <w:rFonts w:ascii="Calibri" w:hAnsi="Calibri"/>
-          <w:sz w:val="22"/>
-        </w:rPr>
-        <w:t>Ces trois fonctionnalités sont architecturalement prévues : les pitchs ont un identifiant unique (</w:t>
-      </w:r>
-      <w:r>
-        <w:rPr>
-          <w:rFonts w:ascii="Courier New" w:hAnsi="Courier New"/>
-          <w:color w:val="DC2626"/>
-          <w:sz w:val="20"/>
-        </w:rPr>
-        <w:t>id</w:t>
-      </w:r>
-      <w:r>
-        <w:rPr>
-          <w:rFonts w:ascii="Calibri" w:hAnsi="Calibri"/>
-          <w:sz w:val="22"/>
-        </w:rPr>
-        <w:t xml:space="preserve"> timestamp) qui permettrait un deep link, et l'écran de pitch comporte déjà un champ "Besoin de financement" (</w:t>
-      </w:r>
-      <w:r>
-        <w:rPr>
-          <w:rFonts w:ascii="Courier New" w:hAnsi="Courier New"/>
-          <w:color w:val="DC2626"/>
-          <w:sz w:val="20"/>
-        </w:rPr>
-        <w:t>_amount</w:t>
-      </w:r>
-      <w:r>
-        <w:rPr>
-          <w:rFonts w:ascii="Calibri" w:hAnsi="Calibri"/>
-          <w:sz w:val="22"/>
-        </w:rPr>
-        <w:t>) qui préfigure l'intégration d'un module de paiement.</w:t>
-      </w:r>
     </w:p>
     <w:sectPr>
       <w:pgSz w:w="12240" w:h="15840"/>

</xml_diff>

<commit_message>
fix: corrections finales cohérence des 6 livrables académiques
</commit_message>
<xml_diff>
--- a/livrables/docx/DIAPALER_AFRICA_Livrable5.docx
+++ b/livrables/docx/DIAPALER_AFRICA_Livrable5.docx
@@ -25079,7 +25079,7 @@
           <w:i w:val="0"/>
           <w:sz w:val="24"/>
         </w:rPr>
-        <w:t>12.1 Architecture simplifiée (lien marchand)</w:t>
+        <w:t>11.1 Architecture simplifiée (lien marchand)</w:t>
       </w:r>
     </w:p>
     <w:p>
@@ -25344,7 +25344,7 @@
           <w:i w:val="0"/>
           <w:sz w:val="24"/>
         </w:rPr>
-        <w:t>12.2 Plans d'abonnement</w:t>
+        <w:t>11.2 Plans d'abonnement</w:t>
       </w:r>
     </w:p>
     <w:tbl>
@@ -25627,7 +25627,7 @@
           <w:i w:val="0"/>
           <w:sz w:val="24"/>
         </w:rPr>
-        <w:t xml:space="preserve">12.3 Implémentation — </w:t>
+        <w:t xml:space="preserve">11.3 Implémentation — </w:t>
       </w:r>
       <w:r>
         <w:rPr>
@@ -26637,7 +26637,7 @@
           <w:i w:val="0"/>
           <w:sz w:val="24"/>
         </w:rPr>
-        <w:t xml:space="preserve">12.4 Interface — </w:t>
+        <w:t xml:space="preserve">11.4 Interface — </w:t>
       </w:r>
       <w:r>
         <w:rPr>

</xml_diff>

<commit_message>
docs(L5,L6): préciser déploiement via Google Drive (Play Store = 25 USD)
- L5 §12.2 (nouveau) : ajout section expliquant le choix Google Drive
  au lieu du Play Store — frais de 25 USD non justifiés pour un projet
  académique, APK release signé identique à une soumission Play Store
- L6 §7.3 (mis à jour) : même explication ajoutée dans le rapport final
- Tableau comparatif des canaux de distribution (Drive / Play Store / APK direct)
- Les 6 docx régénérés en conséquence
</commit_message>
<xml_diff>
--- a/livrables/docx/DIAPALER_AFRICA_Livrable5.docx
+++ b/livrables/docx/DIAPALER_AFRICA_Livrable5.docx
@@ -28850,6 +28850,20 @@
     </w:p>
     <w:p>
       <w:pPr>
+        <w:pStyle w:val="Heading3"/>
+      </w:pPr>
+      <w:r>
+        <w:rPr>
+          <w:rFonts w:ascii="Times New Roman" w:hAnsi="Times New Roman"/>
+          <w:b/>
+          <w:i w:val="0"/>
+          <w:sz w:val="24"/>
+        </w:rPr>
+        <w:t>12.1 Build release signé</w:t>
+      </w:r>
+    </w:p>
+    <w:p>
+      <w:pPr>
         <w:spacing w:after="120"/>
       </w:pPr>
       <w:r>
@@ -29150,48 +29164,6 @@
           </w:p>
         </w:tc>
       </w:tr>
-      <w:tr>
-        <w:tc>
-          <w:tcPr>
-            <w:tcW w:type="dxa" w:w="4536"/>
-            <w:vAlign w:val="center"/>
-          </w:tcPr>
-          <w:p>
-            <w:pPr>
-              <w:spacing w:before="40" w:after="40"/>
-            </w:pPr>
-            <w:r>
-              <w:rPr>
-                <w:rFonts w:ascii="Times New Roman" w:hAnsi="Times New Roman"/>
-                <w:b w:val="0"/>
-                <w:i w:val="0"/>
-                <w:sz w:val="19"/>
-              </w:rPr>
-              <w:t>Lien de téléchargement</w:t>
-            </w:r>
-          </w:p>
-        </w:tc>
-        <w:tc>
-          <w:tcPr>
-            <w:tcW w:type="dxa" w:w="4536"/>
-            <w:vAlign w:val="center"/>
-          </w:tcPr>
-          <w:p>
-            <w:pPr>
-              <w:spacing w:before="40" w:after="40"/>
-            </w:pPr>
-            <w:r>
-              <w:rPr>
-                <w:rFonts w:ascii="Times New Roman" w:hAnsi="Times New Roman"/>
-                <w:b w:val="0"/>
-                <w:i w:val="0"/>
-                <w:sz w:val="19"/>
-              </w:rPr>
-              <w:t>https://drive.google.com/file/d/1BGuJWRnuixcEPl0bMOqY-3E6v-TexXlN/view?usp=sharing</w:t>
-            </w:r>
-          </w:p>
-        </w:tc>
-      </w:tr>
     </w:tbl>
     <w:p>
       <w:pPr>
@@ -29212,6 +29184,649 @@
           <w:sz w:val="20"/>
         </w:rPr>
         <w:t>📸 CAPTURE D'ÉCRAN — Terminal : `✓ Built app-release.apk (57.9MB)`</w:t>
+      </w:r>
+    </w:p>
+    <w:p>
+      <w:pPr>
+        <w:pStyle w:val="Quote"/>
+        <w:ind w:left="567"/>
+      </w:pPr>
+      <w:r>
+        <w:rPr>
+          <w:rFonts w:ascii="Times New Roman" w:hAnsi="Times New Roman"/>
+          <w:b w:val="0"/>
+          <w:i/>
+          <w:color w:val="606060"/>
+          <w:sz w:val="20"/>
+        </w:rPr>
+        <w:t>(Insérer ici la capture d'écran)</w:t>
+      </w:r>
+    </w:p>
+    <w:p>
+      <w:pPr>
+        <w:pBdr>
+          <w:bottom w:val="single" w:sz="4" w:space="1" w:color="000000"/>
+        </w:pBdr>
+        <w:spacing w:before="40" w:after="40"/>
+      </w:pPr>
+    </w:p>
+    <w:p>
+      <w:pPr>
+        <w:pStyle w:val="Heading3"/>
+      </w:pPr>
+      <w:r>
+        <w:rPr>
+          <w:rFonts w:ascii="Times New Roman" w:hAnsi="Times New Roman"/>
+          <w:b/>
+          <w:i w:val="0"/>
+          <w:sz w:val="24"/>
+        </w:rPr>
+        <w:t>12.2 Distribution via Google Drive (au lieu du Play Store)</w:t>
+      </w:r>
+    </w:p>
+    <w:p>
+      <w:pPr>
+        <w:spacing w:after="120"/>
+      </w:pPr>
+      <w:r>
+        <w:rPr>
+          <w:rFonts w:ascii="Times New Roman" w:hAnsi="Times New Roman"/>
+          <w:b w:val="0"/>
+          <w:i w:val="0"/>
+          <w:sz w:val="22"/>
+        </w:rPr>
+        <w:t>Pourquoi Google Drive et non le Google Play Store ?</w:t>
+      </w:r>
+    </w:p>
+    <w:p>
+      <w:pPr>
+        <w:spacing w:after="120"/>
+      </w:pPr>
+      <w:r>
+        <w:rPr>
+          <w:rFonts w:ascii="Times New Roman" w:hAnsi="Times New Roman"/>
+          <w:b w:val="0"/>
+          <w:i w:val="0"/>
+          <w:sz w:val="22"/>
+        </w:rPr>
+        <w:t xml:space="preserve">La publication sur le </w:t>
+      </w:r>
+      <w:r>
+        <w:rPr>
+          <w:rFonts w:ascii="Times New Roman" w:hAnsi="Times New Roman"/>
+          <w:b w:val="0"/>
+          <w:i w:val="0"/>
+          <w:sz w:val="22"/>
+        </w:rPr>
+        <w:t>Google Play Store</w:t>
+      </w:r>
+      <w:r>
+        <w:rPr>
+          <w:rFonts w:ascii="Times New Roman" w:hAnsi="Times New Roman"/>
+          <w:b w:val="0"/>
+          <w:i w:val="0"/>
+          <w:sz w:val="22"/>
+        </w:rPr>
+        <w:t xml:space="preserve"> nécessite le paiement d'un </w:t>
+      </w:r>
+      <w:r>
+        <w:rPr>
+          <w:rFonts w:ascii="Times New Roman" w:hAnsi="Times New Roman"/>
+          <w:b w:val="0"/>
+          <w:i w:val="0"/>
+          <w:sz w:val="22"/>
+        </w:rPr>
+        <w:t>frais d'inscription unique de 25 USD</w:t>
+      </w:r>
+      <w:r>
+        <w:rPr>
+          <w:rFonts w:ascii="Times New Roman" w:hAnsi="Times New Roman"/>
+          <w:b w:val="0"/>
+          <w:i w:val="0"/>
+          <w:sz w:val="22"/>
+        </w:rPr>
+        <w:t xml:space="preserve"> (~15 000 FCFA) pour créer un compte développeur Google. Ce frais est obligatoire et non remboursable, quelle que soit la nature du projet (académique, commercial ou personnel).</w:t>
+      </w:r>
+    </w:p>
+    <w:p>
+      <w:pPr>
+        <w:spacing w:after="120"/>
+      </w:pPr>
+      <w:r>
+        <w:rPr>
+          <w:rFonts w:ascii="Times New Roman" w:hAnsi="Times New Roman"/>
+          <w:b w:val="0"/>
+          <w:i w:val="0"/>
+          <w:sz w:val="22"/>
+        </w:rPr>
+        <w:t xml:space="preserve">Dans le cadre de ce projet académique à l'ESP Dakar, cette dépense ne se justifie pas. L'APK release signé est donc distribué via </w:t>
+      </w:r>
+      <w:r>
+        <w:rPr>
+          <w:rFonts w:ascii="Times New Roman" w:hAnsi="Times New Roman"/>
+          <w:b w:val="0"/>
+          <w:i w:val="0"/>
+          <w:sz w:val="22"/>
+        </w:rPr>
+        <w:t>Google Drive</w:t>
+      </w:r>
+      <w:r>
+        <w:rPr>
+          <w:rFonts w:ascii="Times New Roman" w:hAnsi="Times New Roman"/>
+          <w:b w:val="0"/>
+          <w:i w:val="0"/>
+          <w:sz w:val="22"/>
+        </w:rPr>
+        <w:t>, ce qui :</w:t>
+      </w:r>
+    </w:p>
+    <w:p>
+      <w:pPr>
+        <w:pStyle w:val="ListBullet"/>
+      </w:pPr>
+      <w:r>
+        <w:rPr>
+          <w:rFonts w:ascii="Times New Roman" w:hAnsi="Times New Roman"/>
+          <w:b w:val="0"/>
+          <w:i w:val="0"/>
+          <w:sz w:val="21"/>
+        </w:rPr>
+        <w:t>Permet une installation directe sur tout appareil Android (APK sideloading)</w:t>
+      </w:r>
+    </w:p>
+    <w:p>
+      <w:pPr>
+        <w:pStyle w:val="ListBullet"/>
+      </w:pPr>
+      <w:r>
+        <w:rPr>
+          <w:rFonts w:ascii="Times New Roman" w:hAnsi="Times New Roman"/>
+          <w:b w:val="0"/>
+          <w:i w:val="0"/>
+          <w:sz w:val="21"/>
+        </w:rPr>
+        <w:t>Ne nécessite aucun frais</w:t>
+      </w:r>
+    </w:p>
+    <w:p>
+      <w:pPr>
+        <w:pStyle w:val="ListBullet"/>
+      </w:pPr>
+      <w:r>
+        <w:rPr>
+          <w:rFonts w:ascii="Times New Roman" w:hAnsi="Times New Roman"/>
+          <w:b w:val="0"/>
+          <w:i w:val="0"/>
+          <w:sz w:val="21"/>
+        </w:rPr>
+        <w:t>Est suffisant pour démontrer la compilation, la signature et le déploiement d'une application Flutter production-ready</w:t>
+      </w:r>
+    </w:p>
+    <w:p>
+      <w:pPr>
+        <w:pStyle w:val="Quote"/>
+        <w:ind w:left="567"/>
+      </w:pPr>
+      <w:r>
+        <w:rPr>
+          <w:rFonts w:ascii="Times New Roman" w:hAnsi="Times New Roman"/>
+          <w:b w:val="0"/>
+          <w:i/>
+          <w:color w:val="606060"/>
+          <w:sz w:val="20"/>
+        </w:rPr>
+        <w:t>Note :</w:t>
+      </w:r>
+      <w:r>
+        <w:rPr>
+          <w:rFonts w:ascii="Times New Roman" w:hAnsi="Times New Roman"/>
+          <w:b w:val="0"/>
+          <w:i/>
+          <w:color w:val="606060"/>
+          <w:sz w:val="20"/>
+        </w:rPr>
+        <w:t xml:space="preserve"> L'APK est bien un </w:t>
+      </w:r>
+      <w:r>
+        <w:rPr>
+          <w:rFonts w:ascii="Times New Roman" w:hAnsi="Times New Roman"/>
+          <w:b w:val="0"/>
+          <w:i/>
+          <w:color w:val="606060"/>
+          <w:sz w:val="20"/>
+        </w:rPr>
+        <w:t>release signé</w:t>
+      </w:r>
+      <w:r>
+        <w:rPr>
+          <w:rFonts w:ascii="Times New Roman" w:hAnsi="Times New Roman"/>
+          <w:b w:val="0"/>
+          <w:i/>
+          <w:color w:val="606060"/>
+          <w:sz w:val="20"/>
+        </w:rPr>
+        <w:t xml:space="preserve"> avec un keystore RSA 2048 bits (procédure identique à une publication Play Store). La seule différence est le canal de distribution.</w:t>
+      </w:r>
+    </w:p>
+    <w:p>
+      <w:pPr>
+        <w:spacing w:after="120"/>
+      </w:pPr>
+      <w:r>
+        <w:rPr>
+          <w:rFonts w:ascii="Times New Roman" w:hAnsi="Times New Roman"/>
+          <w:b w:val="0"/>
+          <w:i w:val="0"/>
+          <w:sz w:val="22"/>
+        </w:rPr>
+        <w:t>Si le projet devait passer en production commerciale :</w:t>
+      </w:r>
+    </w:p>
+    <w:p>
+      <w:pPr>
+        <w:pStyle w:val="ListBullet"/>
+      </w:pPr>
+      <w:r>
+        <w:rPr>
+          <w:rFonts w:ascii="Times New Roman" w:hAnsi="Times New Roman"/>
+          <w:b w:val="0"/>
+          <w:i w:val="0"/>
+          <w:sz w:val="21"/>
+        </w:rPr>
+        <w:t>Création d'un compte Google Play Developer (25 USD, paiement unique)</w:t>
+      </w:r>
+    </w:p>
+    <w:p>
+      <w:pPr>
+        <w:pStyle w:val="ListBullet"/>
+      </w:pPr>
+      <w:r>
+        <w:rPr>
+          <w:rFonts w:ascii="Times New Roman" w:hAnsi="Times New Roman"/>
+          <w:b w:val="0"/>
+          <w:i w:val="0"/>
+          <w:sz w:val="21"/>
+        </w:rPr>
+        <w:t>Publication dans le Play Store avec l'APK déjà signé (aucune recompilation nécessaire)</w:t>
+      </w:r>
+    </w:p>
+    <w:p>
+      <w:pPr>
+        <w:pStyle w:val="ListBullet"/>
+      </w:pPr>
+      <w:r>
+        <w:rPr>
+          <w:rFonts w:ascii="Times New Roman" w:hAnsi="Times New Roman"/>
+          <w:b w:val="0"/>
+          <w:i w:val="0"/>
+          <w:sz w:val="21"/>
+        </w:rPr>
+        <w:t>Mise en ligne en 24-48h après validation Google</w:t>
+      </w:r>
+    </w:p>
+    <w:tbl>
+      <w:tblPr>
+        <w:tblStyle w:val="TableGrid"/>
+        <w:tblW w:type="auto" w:w="0"/>
+        <w:jc w:val="left"/>
+        <w:tblLook w:firstColumn="1" w:firstRow="1" w:lastColumn="0" w:lastRow="0" w:noHBand="0" w:noVBand="1" w:val="04A0"/>
+      </w:tblPr>
+      <w:tblGrid>
+        <w:gridCol w:w="3024"/>
+        <w:gridCol w:w="3024"/>
+        <w:gridCol w:w="3024"/>
+      </w:tblGrid>
+      <w:tr>
+        <w:tc>
+          <w:tcPr>
+            <w:tcW w:type="dxa" w:w="3024"/>
+            <w:vAlign w:val="center"/>
+            <w:shd w:val="clear" w:color="auto" w:fill="D9D9D9"/>
+          </w:tcPr>
+          <w:p>
+            <w:pPr>
+              <w:spacing w:before="40" w:after="40"/>
+            </w:pPr>
+            <w:r>
+              <w:rPr>
+                <w:rFonts w:ascii="Times New Roman" w:hAnsi="Times New Roman"/>
+                <w:b/>
+                <w:i w:val="0"/>
+                <w:sz w:val="19"/>
+              </w:rPr>
+              <w:t>Canal</w:t>
+            </w:r>
+          </w:p>
+        </w:tc>
+        <w:tc>
+          <w:tcPr>
+            <w:tcW w:type="dxa" w:w="3024"/>
+            <w:vAlign w:val="center"/>
+            <w:shd w:val="clear" w:color="auto" w:fill="D9D9D9"/>
+          </w:tcPr>
+          <w:p>
+            <w:pPr>
+              <w:spacing w:before="40" w:after="40"/>
+            </w:pPr>
+            <w:r>
+              <w:rPr>
+                <w:rFonts w:ascii="Times New Roman" w:hAnsi="Times New Roman"/>
+                <w:b/>
+                <w:i w:val="0"/>
+                <w:sz w:val="19"/>
+              </w:rPr>
+              <w:t>Coût</w:t>
+            </w:r>
+          </w:p>
+        </w:tc>
+        <w:tc>
+          <w:tcPr>
+            <w:tcW w:type="dxa" w:w="3024"/>
+            <w:vAlign w:val="center"/>
+            <w:shd w:val="clear" w:color="auto" w:fill="D9D9D9"/>
+          </w:tcPr>
+          <w:p>
+            <w:pPr>
+              <w:spacing w:before="40" w:after="40"/>
+            </w:pPr>
+            <w:r>
+              <w:rPr>
+                <w:rFonts w:ascii="Times New Roman" w:hAnsi="Times New Roman"/>
+                <w:b/>
+                <w:i w:val="0"/>
+                <w:sz w:val="19"/>
+              </w:rPr>
+              <w:t>Adapté pour</w:t>
+            </w:r>
+          </w:p>
+        </w:tc>
+      </w:tr>
+      <w:tr>
+        <w:tc>
+          <w:tcPr>
+            <w:tcW w:type="dxa" w:w="3024"/>
+            <w:vAlign w:val="center"/>
+          </w:tcPr>
+          <w:p>
+            <w:pPr>
+              <w:spacing w:before="40" w:after="40"/>
+            </w:pPr>
+            <w:r>
+              <w:rPr>
+                <w:rFonts w:ascii="Times New Roman" w:hAnsi="Times New Roman"/>
+                <w:b w:val="0"/>
+                <w:i w:val="0"/>
+                <w:sz w:val="19"/>
+              </w:rPr>
+              <w:t>Google Drive</w:t>
+            </w:r>
+            <w:r>
+              <w:rPr>
+                <w:rFonts w:ascii="Times New Roman" w:hAnsi="Times New Roman"/>
+                <w:b w:val="0"/>
+                <w:i w:val="0"/>
+                <w:sz w:val="19"/>
+              </w:rPr>
+              <w:t xml:space="preserve"> ← choix actuel</w:t>
+            </w:r>
+          </w:p>
+        </w:tc>
+        <w:tc>
+          <w:tcPr>
+            <w:tcW w:type="dxa" w:w="3024"/>
+            <w:vAlign w:val="center"/>
+          </w:tcPr>
+          <w:p>
+            <w:pPr>
+              <w:spacing w:before="40" w:after="40"/>
+            </w:pPr>
+            <w:r>
+              <w:rPr>
+                <w:rFonts w:ascii="Times New Roman" w:hAnsi="Times New Roman"/>
+                <w:b w:val="0"/>
+                <w:i w:val="0"/>
+                <w:sz w:val="19"/>
+              </w:rPr>
+              <w:t>Gratuit</w:t>
+            </w:r>
+          </w:p>
+        </w:tc>
+        <w:tc>
+          <w:tcPr>
+            <w:tcW w:type="dxa" w:w="3024"/>
+            <w:vAlign w:val="center"/>
+          </w:tcPr>
+          <w:p>
+            <w:pPr>
+              <w:spacing w:before="40" w:after="40"/>
+            </w:pPr>
+            <w:r>
+              <w:rPr>
+                <w:rFonts w:ascii="Times New Roman" w:hAnsi="Times New Roman"/>
+                <w:b w:val="0"/>
+                <w:i w:val="0"/>
+                <w:sz w:val="19"/>
+              </w:rPr>
+              <w:t>Projet académique / démo</w:t>
+            </w:r>
+          </w:p>
+        </w:tc>
+      </w:tr>
+      <w:tr>
+        <w:tc>
+          <w:tcPr>
+            <w:tcW w:type="dxa" w:w="3024"/>
+            <w:vAlign w:val="center"/>
+          </w:tcPr>
+          <w:p>
+            <w:pPr>
+              <w:spacing w:before="40" w:after="40"/>
+            </w:pPr>
+            <w:r>
+              <w:rPr>
+                <w:rFonts w:ascii="Times New Roman" w:hAnsi="Times New Roman"/>
+                <w:b w:val="0"/>
+                <w:i w:val="0"/>
+                <w:sz w:val="19"/>
+              </w:rPr>
+              <w:t>Google Play Store</w:t>
+            </w:r>
+          </w:p>
+        </w:tc>
+        <w:tc>
+          <w:tcPr>
+            <w:tcW w:type="dxa" w:w="3024"/>
+            <w:vAlign w:val="center"/>
+          </w:tcPr>
+          <w:p>
+            <w:pPr>
+              <w:spacing w:before="40" w:after="40"/>
+            </w:pPr>
+            <w:r>
+              <w:rPr>
+                <w:rFonts w:ascii="Times New Roman" w:hAnsi="Times New Roman"/>
+                <w:b w:val="0"/>
+                <w:i w:val="0"/>
+                <w:sz w:val="19"/>
+              </w:rPr>
+              <w:t>25 USD (unique)</w:t>
+            </w:r>
+          </w:p>
+        </w:tc>
+        <w:tc>
+          <w:tcPr>
+            <w:tcW w:type="dxa" w:w="3024"/>
+            <w:vAlign w:val="center"/>
+          </w:tcPr>
+          <w:p>
+            <w:pPr>
+              <w:spacing w:before="40" w:after="40"/>
+            </w:pPr>
+            <w:r>
+              <w:rPr>
+                <w:rFonts w:ascii="Times New Roman" w:hAnsi="Times New Roman"/>
+                <w:b w:val="0"/>
+                <w:i w:val="0"/>
+                <w:sz w:val="19"/>
+              </w:rPr>
+              <w:t>Publication commerciale</w:t>
+            </w:r>
+          </w:p>
+        </w:tc>
+      </w:tr>
+      <w:tr>
+        <w:tc>
+          <w:tcPr>
+            <w:tcW w:type="dxa" w:w="3024"/>
+            <w:vAlign w:val="center"/>
+          </w:tcPr>
+          <w:p>
+            <w:pPr>
+              <w:spacing w:before="40" w:after="40"/>
+            </w:pPr>
+            <w:r>
+              <w:rPr>
+                <w:rFonts w:ascii="Times New Roman" w:hAnsi="Times New Roman"/>
+                <w:b w:val="0"/>
+                <w:i w:val="0"/>
+                <w:sz w:val="19"/>
+              </w:rPr>
+              <w:t>APK direct</w:t>
+            </w:r>
+            <w:r>
+              <w:rPr>
+                <w:rFonts w:ascii="Times New Roman" w:hAnsi="Times New Roman"/>
+                <w:b w:val="0"/>
+                <w:i w:val="0"/>
+                <w:sz w:val="19"/>
+              </w:rPr>
+              <w:t xml:space="preserve"> (email, QR code)</w:t>
+            </w:r>
+          </w:p>
+        </w:tc>
+        <w:tc>
+          <w:tcPr>
+            <w:tcW w:type="dxa" w:w="3024"/>
+            <w:vAlign w:val="center"/>
+          </w:tcPr>
+          <w:p>
+            <w:pPr>
+              <w:spacing w:before="40" w:after="40"/>
+            </w:pPr>
+            <w:r>
+              <w:rPr>
+                <w:rFonts w:ascii="Times New Roman" w:hAnsi="Times New Roman"/>
+                <w:b w:val="0"/>
+                <w:i w:val="0"/>
+                <w:sz w:val="19"/>
+              </w:rPr>
+              <w:t>Gratuit</w:t>
+            </w:r>
+          </w:p>
+        </w:tc>
+        <w:tc>
+          <w:tcPr>
+            <w:tcW w:type="dxa" w:w="3024"/>
+            <w:vAlign w:val="center"/>
+          </w:tcPr>
+          <w:p>
+            <w:pPr>
+              <w:spacing w:before="40" w:after="40"/>
+            </w:pPr>
+            <w:r>
+              <w:rPr>
+                <w:rFonts w:ascii="Times New Roman" w:hAnsi="Times New Roman"/>
+                <w:b w:val="0"/>
+                <w:i w:val="0"/>
+                <w:sz w:val="19"/>
+              </w:rPr>
+              <w:t>Tests internes</w:t>
+            </w:r>
+          </w:p>
+        </w:tc>
+      </w:tr>
+    </w:tbl>
+    <w:p>
+      <w:pPr>
+        <w:spacing w:after="80"/>
+      </w:pPr>
+    </w:p>
+    <w:p>
+      <w:pPr>
+        <w:spacing w:after="120"/>
+      </w:pPr>
+      <w:r>
+        <w:rPr>
+          <w:rFonts w:ascii="Times New Roman" w:hAnsi="Times New Roman"/>
+          <w:b w:val="0"/>
+          <w:i w:val="0"/>
+          <w:sz w:val="22"/>
+        </w:rPr>
+        <w:t>Lien de téléchargement APK :</w:t>
+      </w:r>
+    </w:p>
+    <w:p>
+      <w:pPr>
+        <w:pStyle w:val="Quote"/>
+        <w:ind w:left="567"/>
+      </w:pPr>
+      <w:r>
+        <w:rPr>
+          <w:rFonts w:ascii="Times New Roman" w:hAnsi="Times New Roman"/>
+          <w:b w:val="0"/>
+          <w:i/>
+          <w:color w:val="606060"/>
+          <w:sz w:val="20"/>
+        </w:rPr>
+        <w:t>📦 https://drive.google.com/file/d/1BGuJWRnuixcEPl0bMOqY-3E6v-TexXlN/view?usp=sharing</w:t>
+      </w:r>
+    </w:p>
+    <w:p>
+      <w:pPr>
+        <w:pStyle w:val="Quote"/>
+        <w:ind w:left="567"/>
+      </w:pPr>
+      <w:r>
+        <w:rPr>
+          <w:rFonts w:ascii="Times New Roman" w:hAnsi="Times New Roman"/>
+          <w:b w:val="0"/>
+          <w:i/>
+          <w:color w:val="606060"/>
+          <w:sz w:val="20"/>
+        </w:rPr>
+        <w:t>📸 CAPTURE D'ÉCRAN — Google Drive : APK DIAPALER AFRICA disponible au téléchargement</w:t>
+      </w:r>
+    </w:p>
+    <w:p>
+      <w:pPr>
+        <w:pStyle w:val="Quote"/>
+        <w:ind w:left="567"/>
+      </w:pPr>
+      <w:r>
+        <w:rPr>
+          <w:rFonts w:ascii="Times New Roman" w:hAnsi="Times New Roman"/>
+          <w:b w:val="0"/>
+          <w:i/>
+          <w:color w:val="606060"/>
+          <w:sz w:val="20"/>
+        </w:rPr>
+        <w:t>(Insérer ici la capture d'écran)</w:t>
+      </w:r>
+    </w:p>
+    <w:p>
+      <w:pPr>
+        <w:pStyle w:val="Quote"/>
+        <w:ind w:left="567"/>
+      </w:pPr>
+      <w:r>
+        <w:rPr>
+          <w:rFonts w:ascii="Times New Roman" w:hAnsi="Times New Roman"/>
+          <w:b w:val="0"/>
+          <w:i/>
+          <w:color w:val="606060"/>
+          <w:sz w:val="20"/>
+        </w:rPr>
+        <w:t>📸 CAPTURE D'ÉCRAN — Installation de l'APK sur Android (autoriser les sources inconnues)</w:t>
       </w:r>
     </w:p>
     <w:p>

</xml_diff>

<commit_message>
fix(L5): corriger nom du modèle claude-haiku-4-5 → claude-haiku-4-5-20251001 (§4.1)
</commit_message>
<xml_diff>
--- a/livrables/docx/DIAPALER_AFRICA_Livrable5.docx
+++ b/livrables/docx/DIAPALER_AFRICA_Livrable5.docx
@@ -12446,7 +12446,7 @@
           <w:i w:val="0"/>
           <w:sz w:val="22"/>
         </w:rPr>
-        <w:t>Claude claude-haiku-4-5</w:t>
+        <w:t>Claude claude-haiku-4-5-20251001</w:t>
       </w:r>
       <w:r>
         <w:rPr>
@@ -12592,7 +12592,7 @@
                 <w:i w:val="0"/>
                 <w:sz w:val="19"/>
               </w:rPr>
-              <w:t>claude-haiku-4-5 (rapide + haute qualité)</w:t>
+              <w:t>claude-haiku-4-5-20251001 (rapide + haute qualité)</w:t>
             </w:r>
           </w:p>
         </w:tc>

</xml_diff>